<commit_message>
addition to the script.json
</commit_message>
<xml_diff>
--- a/docs/Script.docx
+++ b/docs/Script.docx
@@ -1,6 +1,6 @@
 
 <file path=word/document.xml><?xml version="1.0" encoding="utf-8"?>
-<w:document xmlns:wpc="http://schemas.microsoft.com/office/word/2010/wordprocessingCanvas" xmlns:cx="http://schemas.microsoft.com/office/drawing/2014/chartex" xmlns:cx1="http://schemas.microsoft.com/office/drawing/2015/9/8/chartex" xmlns:cx2="http://schemas.microsoft.com/office/drawing/2015/10/21/chartex" xmlns:cx3="http://schemas.microsoft.com/office/drawing/2016/5/9/chartex" xmlns:cx4="http://schemas.microsoft.com/office/drawing/2016/5/10/chartex" xmlns:cx5="http://schemas.microsoft.com/office/drawing/2016/5/11/chartex" xmlns:cx6="http://schemas.microsoft.com/office/drawing/2016/5/12/chartex" xmlns:cx7="http://schemas.microsoft.com/office/drawing/2016/5/13/chartex" xmlns:cx8="http://schemas.microsoft.com/office/drawing/2016/5/14/chartex" xmlns:mc="http://schemas.openxmlformats.org/markup-compatibility/2006" xmlns:aink="http://schemas.microsoft.com/office/drawing/2016/ink" xmlns:am3d="http://schemas.microsoft.com/office/drawing/2017/model3d" xmlns:o="urn:schemas-microsoft-com:office:office" xmlns:oel="http://schemas.microsoft.com/office/2019/extlst" xmlns:r="http://schemas.openxmlformats.org/officeDocument/2006/relationships" xmlns:m="http://schemas.openxmlformats.org/officeDocument/2006/math" xmlns:v="urn:schemas-microsoft-com:vml" xmlns:wp14="http://schemas.microsoft.com/office/word/2010/wordprocessingDrawing" xmlns:wp="http://schemas.openxmlformats.org/drawingml/2006/wordprocessingDrawing" xmlns:w10="urn:schemas-microsoft-com:office:word" xmlns:w="http://schemas.openxmlformats.org/wordprocessingml/2006/main" xmlns:w14="http://schemas.microsoft.com/office/word/2010/wordml" xmlns:w15="http://schemas.microsoft.com/office/word/2012/wordml" xmlns:w16cei="http://schemas.microsoft.com/office/word/2026/wordml/cei" xmlns:w16cex="http://schemas.microsoft.com/office/word/2018/wordml/cex" xmlns:w16cid="http://schemas.microsoft.com/office/word/2016/wordml/cid" xmlns:w16="http://schemas.microsoft.com/office/word/2018/wordml" xmlns:w16du="http://schemas.microsoft.com/office/word/2023/wordml/word16du" xmlns:w16sdtdh="http://schemas.microsoft.com/office/word/2020/wordml/sdtdatahash" xmlns:w16sdtfl="http://schemas.microsoft.com/office/word/2024/wordml/sdtformatlock" xmlns:w16se="http://schemas.microsoft.com/office/word/2015/wordml/symex" xmlns:wpg="http://schemas.microsoft.com/office/word/2010/wordprocessingGroup" xmlns:wpi="http://schemas.microsoft.com/office/word/2010/wordprocessingInk" xmlns:wne="http://schemas.microsoft.com/office/word/2006/wordml" xmlns:wps="http://schemas.microsoft.com/office/word/2010/wordprocessingShape" mc:Ignorable="w14 w15 w16se w16cid w16 w16cex w16sdtdh w16sdtfl w16du wp14">
+<w:document xmlns:wpc="http://schemas.microsoft.com/office/word/2010/wordprocessingCanvas" xmlns:cx="http://schemas.microsoft.com/office/drawing/2014/chartex" xmlns:cx1="http://schemas.microsoft.com/office/drawing/2015/9/8/chartex" xmlns:cx2="http://schemas.microsoft.com/office/drawing/2015/10/21/chartex" xmlns:cx3="http://schemas.microsoft.com/office/drawing/2016/5/9/chartex" xmlns:cx4="http://schemas.microsoft.com/office/drawing/2016/5/10/chartex" xmlns:cx5="http://schemas.microsoft.com/office/drawing/2016/5/11/chartex" xmlns:cx6="http://schemas.microsoft.com/office/drawing/2016/5/12/chartex" xmlns:cx7="http://schemas.microsoft.com/office/drawing/2016/5/13/chartex" xmlns:cx8="http://schemas.microsoft.com/office/drawing/2016/5/14/chartex" xmlns:mc="http://schemas.openxmlformats.org/markup-compatibility/2006" xmlns:aink="http://schemas.microsoft.com/office/drawing/2016/ink" xmlns:am3d="http://schemas.microsoft.com/office/drawing/2017/model3d" xmlns:o="urn:schemas-microsoft-com:office:office" xmlns:oel="http://schemas.microsoft.com/office/2019/extlst" xmlns:r="http://schemas.openxmlformats.org/officeDocument/2006/relationships" xmlns:m="http://schemas.openxmlformats.org/officeDocument/2006/math" xmlns:v="urn:schemas-microsoft-com:vml" xmlns:wp14="http://schemas.microsoft.com/office/word/2010/wordprocessingDrawing" xmlns:wp="http://schemas.openxmlformats.org/drawingml/2006/wordprocessingDrawing" xmlns:w10="urn:schemas-microsoft-com:office:word" xmlns:w="http://schemas.openxmlformats.org/wordprocessingml/2006/main" xmlns:w14="http://schemas.microsoft.com/office/word/2010/wordml" xmlns:w15="http://schemas.microsoft.com/office/word/2012/wordml" xmlns:w16cex="http://schemas.microsoft.com/office/word/2018/wordml/cex" xmlns:w16cid="http://schemas.microsoft.com/office/word/2016/wordml/cid" xmlns:w16="http://schemas.microsoft.com/office/word/2018/wordml" xmlns:w16du="http://schemas.microsoft.com/office/word/2023/wordml/word16du" xmlns:w16sdtdh="http://schemas.microsoft.com/office/word/2020/wordml/sdtdatahash" xmlns:w16sdtfl="http://schemas.microsoft.com/office/word/2024/wordml/sdtformatlock" xmlns:w16se="http://schemas.microsoft.com/office/word/2015/wordml/symex" xmlns:wpg="http://schemas.microsoft.com/office/word/2010/wordprocessingGroup" xmlns:wpi="http://schemas.microsoft.com/office/word/2010/wordprocessingInk" xmlns:wne="http://schemas.microsoft.com/office/word/2006/wordml" xmlns:wps="http://schemas.microsoft.com/office/word/2010/wordprocessingShape" mc:Ignorable="w14 w15 w16se w16cid w16 w16cex w16sdtdh w16sdtfl w16du wp14">
   <w:body>
     <w:p>
       <w:pPr>
@@ -19,8 +19,28 @@
           <w:szCs w:val="40"/>
           <w:lang w:val="en-AU"/>
         </w:rPr>
+        <w:t xml:space="preserve">B </w:t>
+      </w:r>
+      <w:proofErr w:type="spellStart"/>
+      <w:r>
+        <w:rPr>
+          <w:color w:val="501549" w:themeColor="accent5" w:themeShade="80"/>
+          <w:sz w:val="40"/>
+          <w:szCs w:val="40"/>
+          <w:lang w:val="en-AU"/>
+        </w:rPr>
+        <w:t>v</w:t>
+      </w:r>
+      <w:r>
+        <w:rPr>
+          <w:color w:val="501549" w:themeColor="accent5" w:themeShade="80"/>
+          <w:sz w:val="40"/>
+          <w:szCs w:val="40"/>
+          <w:lang w:val="en-AU"/>
+        </w:rPr>
         <w:t>Script</w:t>
       </w:r>
+      <w:proofErr w:type="spellEnd"/>
     </w:p>
     <w:sdt>
       <w:sdtPr>
@@ -1468,7 +1488,15 @@
         </w:numPr>
       </w:pPr>
       <w:r>
-        <w:t>Intro still lowk blows</w:t>
+        <w:t xml:space="preserve">Intro still </w:t>
+      </w:r>
+      <w:proofErr w:type="spellStart"/>
+      <w:r>
+        <w:t>lowk</w:t>
+      </w:r>
+      <w:proofErr w:type="spellEnd"/>
+      <w:r>
+        <w:t xml:space="preserve"> blows</w:t>
       </w:r>
     </w:p>
     <w:p>
@@ -1663,10 +1691,12 @@
         <w:ind w:left="720"/>
       </w:pPr>
       <w:bookmarkStart w:id="5" w:name="_Toc231307569"/>
+      <w:proofErr w:type="spellStart"/>
       <w:r>
         <w:t>Main_hero</w:t>
       </w:r>
       <w:bookmarkEnd w:id="5"/>
+      <w:proofErr w:type="spellEnd"/>
     </w:p>
     <w:p>
       <w:pPr>
@@ -1695,7 +1725,15 @@
         <w:t xml:space="preserve"> of a story, a</w:t>
       </w:r>
       <w:r>
-        <w:t xml:space="preserve"> guy who doesn’t have a real life and spends all his time on The Forum</w:t>
+        <w:t xml:space="preserve"> guy who doesn’t have </w:t>
+      </w:r>
+      <w:proofErr w:type="gramStart"/>
+      <w:r>
+        <w:t>a real</w:t>
+      </w:r>
+      <w:proofErr w:type="gramEnd"/>
+      <w:r>
+        <w:t xml:space="preserve"> life and spends all his time on The Forum</w:t>
       </w:r>
     </w:p>
     <w:p>
@@ -1745,11 +1783,21 @@
       <w:r>
         <w:t xml:space="preserve">subforum where he is a </w:t>
       </w:r>
+      <w:proofErr w:type="gramStart"/>
       <w:r>
         <w:t>laughing stock</w:t>
       </w:r>
-      <w:r>
-        <w:t>. But he still counts them all as friends cuz he doesn’t have anyone else</w:t>
+      <w:proofErr w:type="gramEnd"/>
+      <w:r>
+        <w:t xml:space="preserve">. But he still counts them all as friends </w:t>
+      </w:r>
+      <w:proofErr w:type="spellStart"/>
+      <w:r>
+        <w:t>cuz</w:t>
+      </w:r>
+      <w:proofErr w:type="spellEnd"/>
+      <w:r>
+        <w:t xml:space="preserve"> he doesn’t have anyone else</w:t>
       </w:r>
     </w:p>
     <w:p>
@@ -1800,11 +1848,18 @@
         <w:t xml:space="preserve">Delusions of his achievements and skills, thinks his ability </w:t>
       </w:r>
       <w:r>
-        <w:t xml:space="preserve">in the </w:t>
-      </w:r>
+        <w:t xml:space="preserve">in </w:t>
+      </w:r>
+      <w:proofErr w:type="gramStart"/>
+      <w:r>
+        <w:t xml:space="preserve">the </w:t>
+      </w:r>
+      <w:proofErr w:type="spellStart"/>
       <w:r>
         <w:t>cyberdivers</w:t>
       </w:r>
+      <w:proofErr w:type="spellEnd"/>
+      <w:proofErr w:type="gramEnd"/>
       <w:r>
         <w:t xml:space="preserve"> </w:t>
       </w:r>
@@ -1865,9 +1920,11 @@
       <w:r>
         <w:t xml:space="preserve">00hours in </w:t>
       </w:r>
+      <w:proofErr w:type="spellStart"/>
       <w:r>
         <w:t>cyberdivers</w:t>
       </w:r>
+      <w:proofErr w:type="spellEnd"/>
       <w:r>
         <w:t>, but still is bad at the game</w:t>
       </w:r>
@@ -1956,8 +2013,13 @@
           <w:numId w:val="1"/>
         </w:numPr>
       </w:pPr>
-      <w:r>
-        <w:t>Knows internet culture</w:t>
+      <w:proofErr w:type="gramStart"/>
+      <w:r>
+        <w:t>Knows</w:t>
+      </w:r>
+      <w:proofErr w:type="gramEnd"/>
+      <w:r>
+        <w:t xml:space="preserve"> internet culture</w:t>
       </w:r>
       <w:r>
         <w:t xml:space="preserve"> </w:t>
@@ -1971,8 +2033,13 @@
           <w:numId w:val="1"/>
         </w:numPr>
       </w:pPr>
-      <w:r>
-        <w:t>Spends a lot of time online</w:t>
+      <w:proofErr w:type="gramStart"/>
+      <w:r>
+        <w:t>Spends</w:t>
+      </w:r>
+      <w:proofErr w:type="gramEnd"/>
+      <w:r>
+        <w:t xml:space="preserve"> a lot of time online</w:t>
       </w:r>
     </w:p>
     <w:p>
@@ -1984,7 +2051,23 @@
         </w:numPr>
       </w:pPr>
       <w:r>
-        <w:t>He should be absurdly delusional of every his action, like a comedic relief character is a main hero</w:t>
+        <w:t xml:space="preserve">He should be absurdly delusional </w:t>
+      </w:r>
+      <w:proofErr w:type="gramStart"/>
+      <w:r>
+        <w:t>of</w:t>
+      </w:r>
+      <w:proofErr w:type="gramEnd"/>
+      <w:r>
+        <w:t xml:space="preserve"> </w:t>
+      </w:r>
+      <w:proofErr w:type="gramStart"/>
+      <w:r>
+        <w:t>every his</w:t>
+      </w:r>
+      <w:proofErr w:type="gramEnd"/>
+      <w:r>
+        <w:t xml:space="preserve"> action, like a comedic relief character is a main hero</w:t>
       </w:r>
     </w:p>
     <w:p>
@@ -1996,7 +2079,15 @@
         </w:numPr>
       </w:pPr>
       <w:r>
-        <w:t>He trapped in the cyberdivers community, because he hates being bullied, but at the same time, he is afraid to lose his only “friends”.</w:t>
+        <w:t xml:space="preserve">He trapped in the </w:t>
+      </w:r>
+      <w:proofErr w:type="spellStart"/>
+      <w:r>
+        <w:t>cyberdivers</w:t>
+      </w:r>
+      <w:proofErr w:type="spellEnd"/>
+      <w:r>
+        <w:t xml:space="preserve"> community, because he hates being bullied, but at the same time, he is afraid to lose his only “friends”.</w:t>
       </w:r>
       <w:r>
         <w:t xml:space="preserve"> He believes that being able to endure that is strong</w:t>
@@ -2059,7 +2150,15 @@
         </w:numPr>
       </w:pPr>
       <w:r>
-        <w:t>Gene Cousinou (Barry)</w:t>
+        <w:t xml:space="preserve">Gene </w:t>
+      </w:r>
+      <w:proofErr w:type="spellStart"/>
+      <w:r>
+        <w:t>Cousinou</w:t>
+      </w:r>
+      <w:proofErr w:type="spellEnd"/>
+      <w:r>
+        <w:t xml:space="preserve"> (Barry)</w:t>
       </w:r>
     </w:p>
     <w:p>
@@ -2097,13 +2196,45 @@
         </w:numPr>
       </w:pPr>
       <w:r>
-        <w:t xml:space="preserve">First main_hero develops an exact copy of the The Forum login page, post page and server side. During phishing attack, main_hero will ask an admin of the </w:t>
+        <w:t xml:space="preserve">First </w:t>
+      </w:r>
+      <w:proofErr w:type="spellStart"/>
+      <w:r>
+        <w:t>main_hero</w:t>
+      </w:r>
+      <w:proofErr w:type="spellEnd"/>
+      <w:r>
+        <w:t xml:space="preserve"> develops an exact copy of the </w:t>
+      </w:r>
+      <w:proofErr w:type="spellStart"/>
+      <w:r>
+        <w:t>The</w:t>
+      </w:r>
+      <w:proofErr w:type="spellEnd"/>
+      <w:r>
+        <w:t xml:space="preserve"> Forum login page, post page and server side. During phishing attack, </w:t>
+      </w:r>
+      <w:proofErr w:type="spellStart"/>
+      <w:r>
+        <w:t>main_hero</w:t>
+      </w:r>
+      <w:proofErr w:type="spellEnd"/>
+      <w:r>
+        <w:t xml:space="preserve"> will ask an admin of the </w:t>
       </w:r>
       <w:r>
         <w:t>cycle</w:t>
       </w:r>
       <w:r>
-        <w:t xml:space="preserve"> to check out the post, saying it’s should be taken down for inappropriate content. </w:t>
+        <w:t xml:space="preserve"> to check out the post, saying </w:t>
+      </w:r>
+      <w:proofErr w:type="gramStart"/>
+      <w:r>
+        <w:t>it’s should be</w:t>
+      </w:r>
+      <w:proofErr w:type="gramEnd"/>
+      <w:r>
+        <w:t xml:space="preserve"> taken down for inappropriate content. </w:t>
       </w:r>
     </w:p>
     <w:p>
@@ -2115,7 +2246,39 @@
         </w:numPr>
       </w:pPr>
       <w:r>
-        <w:t>Admin will see the fake post, will try to delete it, but delete action will redirect him to the fake login page. Admin will login, and proceed to remove non-existent post on the fake page. His creds will be send to the server</w:t>
+        <w:t xml:space="preserve">Admin will see the fake post, will try to delete it, but </w:t>
+      </w:r>
+      <w:proofErr w:type="gramStart"/>
+      <w:r>
+        <w:t>delete</w:t>
+      </w:r>
+      <w:proofErr w:type="gramEnd"/>
+      <w:r>
+        <w:t xml:space="preserve"> action will redirect him to the fake login page. Admin will </w:t>
+      </w:r>
+      <w:proofErr w:type="gramStart"/>
+      <w:r>
+        <w:t>login, and</w:t>
+      </w:r>
+      <w:proofErr w:type="gramEnd"/>
+      <w:r>
+        <w:t xml:space="preserve"> proceed to remove non-existent </w:t>
+      </w:r>
+      <w:proofErr w:type="gramStart"/>
+      <w:r>
+        <w:t>post</w:t>
+      </w:r>
+      <w:proofErr w:type="gramEnd"/>
+      <w:r>
+        <w:t xml:space="preserve"> on the fake page. His creds will be </w:t>
+      </w:r>
+      <w:proofErr w:type="gramStart"/>
+      <w:r>
+        <w:t>send</w:t>
+      </w:r>
+      <w:proofErr w:type="gramEnd"/>
+      <w:r>
+        <w:t xml:space="preserve"> to the server</w:t>
       </w:r>
       <w:r>
         <w:t>.</w:t>
@@ -2130,7 +2293,15 @@
         </w:numPr>
       </w:pPr>
       <w:r>
-        <w:t>After main_hero obtains the creds</w:t>
+        <w:t xml:space="preserve">After </w:t>
+      </w:r>
+      <w:proofErr w:type="spellStart"/>
+      <w:r>
+        <w:t>main_hero</w:t>
+      </w:r>
+      <w:proofErr w:type="spellEnd"/>
+      <w:r>
+        <w:t xml:space="preserve"> obtains the creds</w:t>
       </w:r>
       <w:r>
         <w:t>, he waits till the night and</w:t>
@@ -2145,19 +2316,45 @@
         <w:t>login</w:t>
       </w:r>
       <w:r>
-        <w:t xml:space="preserve"> into ur account. Main_hero</w:t>
-      </w:r>
+        <w:t xml:space="preserve"> into </w:t>
+      </w:r>
+      <w:proofErr w:type="spellStart"/>
+      <w:r>
+        <w:t>ur</w:t>
+      </w:r>
+      <w:proofErr w:type="spellEnd"/>
+      <w:r>
+        <w:t xml:space="preserve"> account. </w:t>
+      </w:r>
+      <w:proofErr w:type="spellStart"/>
+      <w:r>
+        <w:t>Main_hero</w:t>
+      </w:r>
+      <w:proofErr w:type="spellEnd"/>
       <w:r>
         <w:t xml:space="preserve"> first</w:t>
       </w:r>
       <w:r>
-        <w:t xml:space="preserve"> has to </w:t>
+        <w:t xml:space="preserve"> </w:t>
+      </w:r>
+      <w:proofErr w:type="gramStart"/>
+      <w:r>
+        <w:t>has to</w:t>
+      </w:r>
+      <w:proofErr w:type="gramEnd"/>
+      <w:r>
+        <w:t xml:space="preserve"> </w:t>
       </w:r>
       <w:r>
         <w:t xml:space="preserve">demote all the mods on this subforum. Then he will transfer the ownership of this subforum to the burner account. After that, he’ll let </w:t>
       </w:r>
-      <w:r>
-        <w:t>cyberdivers know</w:t>
+      <w:proofErr w:type="spellStart"/>
+      <w:r>
+        <w:t>cyberdivers</w:t>
+      </w:r>
+      <w:proofErr w:type="spellEnd"/>
+      <w:r>
+        <w:t xml:space="preserve"> know</w:t>
       </w:r>
       <w:r>
         <w:t xml:space="preserve"> that he owns the sub now and they can flood it with whatever they want</w:t>
@@ -2171,9 +2368,11 @@
           <w:numId w:val="1"/>
         </w:numPr>
       </w:pPr>
+      <w:proofErr w:type="spellStart"/>
       <w:r>
         <w:t>Cyberdivers</w:t>
       </w:r>
+      <w:proofErr w:type="spellEnd"/>
       <w:r>
         <w:t xml:space="preserve"> </w:t>
       </w:r>
@@ -2346,9 +2545,11 @@
         <w:ind w:left="720"/>
       </w:pPr>
       <w:bookmarkStart w:id="8" w:name="_Toc231307571"/>
+      <w:proofErr w:type="spellStart"/>
       <w:r>
         <w:t>Cyberdivers</w:t>
       </w:r>
+      <w:proofErr w:type="spellEnd"/>
       <w:r>
         <w:t xml:space="preserve"> </w:t>
       </w:r>
@@ -2422,9 +2623,11 @@
         </w:rPr>
         <w:t xml:space="preserve"> for the game </w:t>
       </w:r>
+      <w:proofErr w:type="spellStart"/>
       <w:r>
         <w:t>Cyberdivers</w:t>
       </w:r>
+      <w:proofErr w:type="spellEnd"/>
       <w:r>
         <w:t xml:space="preserve"> made by Spearhead</w:t>
       </w:r>
@@ -2489,7 +2692,21 @@
         <w:rPr>
           <w:lang w:val="en-AU"/>
         </w:rPr>
-        <w:t>hackers. AI faction consists of big, powerful, but dumb and small in numbers enemies. Bugs are small, big in numbers and popping up everywhere. Hackers are represented as sneaky squids, where tentacles could go through the walls, medium sized enemies and smartest of them all.</w:t>
+        <w:t xml:space="preserve">hackers. AI faction consists of big, powerful, but dumb and small in </w:t>
+      </w:r>
+      <w:proofErr w:type="gramStart"/>
+      <w:r>
+        <w:rPr>
+          <w:lang w:val="en-AU"/>
+        </w:rPr>
+        <w:t>numbers</w:t>
+      </w:r>
+      <w:proofErr w:type="gramEnd"/>
+      <w:r>
+        <w:rPr>
+          <w:lang w:val="en-AU"/>
+        </w:rPr>
+        <w:t xml:space="preserve"> enemies. Bugs are small, big in numbers and popping up everywhere. Hackers are represented as sneaky squids, where tentacles could go through the walls, medium sized enemies and smartest of them all.</w:t>
       </w:r>
       <w:r>
         <w:rPr>
@@ -2549,7 +2766,21 @@
         <w:rPr>
           <w:lang w:val="en-AU"/>
         </w:rPr>
-        <w:t xml:space="preserve"> Posts are some memes and whines about balance of the guns and maps or </w:t>
+        <w:t xml:space="preserve"> Posts are some memes and whines about balance of the guns and </w:t>
+      </w:r>
+      <w:proofErr w:type="gramStart"/>
+      <w:r>
+        <w:rPr>
+          <w:lang w:val="en-AU"/>
+        </w:rPr>
+        <w:t>maps</w:t>
+      </w:r>
+      <w:proofErr w:type="gramEnd"/>
+      <w:r>
+        <w:rPr>
+          <w:lang w:val="en-AU"/>
+        </w:rPr>
+        <w:t xml:space="preserve"> or </w:t>
       </w:r>
       <w:r>
         <w:rPr>
@@ -2621,7 +2852,15 @@
         </w:numPr>
       </w:pPr>
       <w:r>
-        <w:t>People have love and hate relationship with the game, many play just because sunk cost fallacy.</w:t>
+        <w:t xml:space="preserve">People have love and hate </w:t>
+      </w:r>
+      <w:proofErr w:type="gramStart"/>
+      <w:r>
+        <w:t>relationship</w:t>
+      </w:r>
+      <w:proofErr w:type="gramEnd"/>
+      <w:r>
+        <w:t xml:space="preserve"> with the game, many play just because sunk cost fallacy.</w:t>
       </w:r>
     </w:p>
     <w:p>
@@ -2649,7 +2888,15 @@
       </w:pPr>
       <w:r>
         <w:lastRenderedPageBreak/>
-        <w:t>The only community main_hero has</w:t>
+        <w:t xml:space="preserve">The only community </w:t>
+      </w:r>
+      <w:proofErr w:type="spellStart"/>
+      <w:r>
+        <w:t>main_hero</w:t>
+      </w:r>
+      <w:proofErr w:type="spellEnd"/>
+      <w:r>
+        <w:t xml:space="preserve"> has</w:t>
       </w:r>
     </w:p>
     <w:p>
@@ -2660,8 +2907,29 @@
           <w:numId w:val="1"/>
         </w:numPr>
       </w:pPr>
-      <w:r>
-        <w:t>Main_hero played together with some people and they saw how bad he is, so now he is a laughing stock in the chat</w:t>
+      <w:proofErr w:type="spellStart"/>
+      <w:r>
+        <w:t>Main_hero</w:t>
+      </w:r>
+      <w:proofErr w:type="spellEnd"/>
+      <w:r>
+        <w:t xml:space="preserve"> played together with some </w:t>
+      </w:r>
+      <w:proofErr w:type="gramStart"/>
+      <w:r>
+        <w:t>people</w:t>
+      </w:r>
+      <w:proofErr w:type="gramEnd"/>
+      <w:r>
+        <w:t xml:space="preserve"> and they saw how bad he is, so now he is a </w:t>
+      </w:r>
+      <w:proofErr w:type="gramStart"/>
+      <w:r>
+        <w:t>laughing stock</w:t>
+      </w:r>
+      <w:proofErr w:type="gramEnd"/>
+      <w:r>
+        <w:t xml:space="preserve"> in the chat</w:t>
       </w:r>
     </w:p>
     <w:p>
@@ -2672,8 +2940,21 @@
           <w:numId w:val="1"/>
         </w:numPr>
       </w:pPr>
-      <w:r>
-        <w:t>Main_hero is quite active in the chat and always tries to prove how good he is</w:t>
+      <w:proofErr w:type="spellStart"/>
+      <w:r>
+        <w:t>Main_hero</w:t>
+      </w:r>
+      <w:proofErr w:type="spellEnd"/>
+      <w:r>
+        <w:t xml:space="preserve"> is quite active </w:t>
+      </w:r>
+      <w:proofErr w:type="gramStart"/>
+      <w:r>
+        <w:t>in the chat</w:t>
+      </w:r>
+      <w:proofErr w:type="gramEnd"/>
+      <w:r>
+        <w:t xml:space="preserve"> and always tries to prove how good he is</w:t>
       </w:r>
     </w:p>
     <w:p>
@@ -2693,9 +2974,11 @@
       <w:r>
         <w:t xml:space="preserve"> subforum, because it was released by the same publisher and instead of updates for </w:t>
       </w:r>
+      <w:proofErr w:type="spellStart"/>
       <w:r>
         <w:t>cyberdivers</w:t>
       </w:r>
+      <w:proofErr w:type="spellEnd"/>
       <w:r>
         <w:t xml:space="preserve"> they got </w:t>
       </w:r>
@@ -2724,11 +3007,21 @@
         </w:numPr>
       </w:pPr>
       <w:r>
-        <w:t xml:space="preserve">They bully main_hero for playing bad in </w:t>
-      </w:r>
+        <w:t xml:space="preserve">They bully </w:t>
+      </w:r>
+      <w:proofErr w:type="spellStart"/>
+      <w:r>
+        <w:t>main_hero</w:t>
+      </w:r>
+      <w:proofErr w:type="spellEnd"/>
+      <w:r>
+        <w:t xml:space="preserve"> for playing bad in </w:t>
+      </w:r>
+      <w:proofErr w:type="spellStart"/>
       <w:r>
         <w:t>cyberdivers</w:t>
       </w:r>
+      <w:proofErr w:type="spellEnd"/>
       <w:r>
         <w:t xml:space="preserve"> yet bragging how good he is</w:t>
       </w:r>
@@ -2742,7 +3035,15 @@
         </w:numPr>
       </w:pPr>
       <w:r>
-        <w:t>After main_hero comes to them</w:t>
+        <w:t xml:space="preserve">After </w:t>
+      </w:r>
+      <w:proofErr w:type="spellStart"/>
+      <w:r>
+        <w:t>main_hero</w:t>
+      </w:r>
+      <w:proofErr w:type="spellEnd"/>
+      <w:r>
+        <w:t xml:space="preserve"> comes to them</w:t>
       </w:r>
       <w:r>
         <w:t xml:space="preserve"> </w:t>
@@ -2751,10 +3052,26 @@
         <w:t xml:space="preserve">with keys of wh3 sub, </w:t>
       </w:r>
       <w:r>
-        <w:t>whole at first praises main_hero, but some people downplay it, saying it’s nothing special</w:t>
-      </w:r>
-      <w:r>
-        <w:t>, trying to bring main_hero down to his level, reassert themselves at his expense.</w:t>
+        <w:t xml:space="preserve">whole at first praises </w:t>
+      </w:r>
+      <w:proofErr w:type="spellStart"/>
+      <w:r>
+        <w:t>main_hero</w:t>
+      </w:r>
+      <w:proofErr w:type="spellEnd"/>
+      <w:r>
+        <w:t>, but some people downplay it, saying it’s nothing special</w:t>
+      </w:r>
+      <w:r>
+        <w:t xml:space="preserve">, trying to bring </w:t>
+      </w:r>
+      <w:proofErr w:type="spellStart"/>
+      <w:r>
+        <w:t>main_hero</w:t>
+      </w:r>
+      <w:proofErr w:type="spellEnd"/>
+      <w:r>
+        <w:t xml:space="preserve"> down to his level, reassert themselves at his expense.</w:t>
       </w:r>
     </w:p>
     <w:p>
@@ -2818,9 +3135,11 @@
         </w:rPr>
         <w:t xml:space="preserve"> </w:t>
       </w:r>
+      <w:proofErr w:type="spellStart"/>
       <w:r>
         <w:t>pinchIt</w:t>
       </w:r>
+      <w:proofErr w:type="spellEnd"/>
     </w:p>
     <w:p>
       <w:pPr>
@@ -2844,9 +3163,11 @@
         </w:rPr>
         <w:t xml:space="preserve"> </w:t>
       </w:r>
+      <w:proofErr w:type="spellStart"/>
       <w:r>
         <w:t>MironYanch</w:t>
       </w:r>
+      <w:proofErr w:type="spellEnd"/>
     </w:p>
     <w:p>
       <w:pPr>
@@ -2859,9 +3180,11 @@
       <w:r>
         <w:t xml:space="preserve">User 3: </w:t>
       </w:r>
+      <w:proofErr w:type="spellStart"/>
       <w:r>
         <w:t>caffeine_up_the_ass</w:t>
       </w:r>
+      <w:proofErr w:type="spellEnd"/>
     </w:p>
     <w:p>
       <w:pPr>
@@ -2874,9 +3197,11 @@
       <w:r>
         <w:t xml:space="preserve">User 4: </w:t>
       </w:r>
+      <w:proofErr w:type="spellStart"/>
       <w:r>
         <w:t>musky_diver</w:t>
       </w:r>
+      <w:proofErr w:type="spellEnd"/>
     </w:p>
     <w:p>
       <w:pPr>
@@ -2889,9 +3214,11 @@
       <w:r>
         <w:t xml:space="preserve">User 5: </w:t>
       </w:r>
+      <w:proofErr w:type="spellStart"/>
       <w:r>
         <w:t>do_not_the_dog</w:t>
       </w:r>
+      <w:proofErr w:type="spellEnd"/>
     </w:p>
     <w:p>
       <w:pPr>
@@ -2904,9 +3231,11 @@
       <w:r>
         <w:t xml:space="preserve">User 6: </w:t>
       </w:r>
+      <w:proofErr w:type="spellStart"/>
       <w:r>
         <w:t>ink_and_iron</w:t>
       </w:r>
+      <w:proofErr w:type="spellEnd"/>
     </w:p>
     <w:p>
       <w:pPr>
@@ -2946,8 +3275,13 @@
         <w:t>User 8:</w:t>
       </w:r>
       <w:r>
-        <w:t xml:space="preserve"> SmoothOperator</w:t>
-      </w:r>
+        <w:t xml:space="preserve"> </w:t>
+      </w:r>
+      <w:proofErr w:type="spellStart"/>
+      <w:r>
+        <w:t>SmoothOperator</w:t>
+      </w:r>
+      <w:proofErr w:type="spellEnd"/>
     </w:p>
     <w:p>
       <w:pPr>
@@ -2971,9 +3305,11 @@
         </w:rPr>
         <w:t xml:space="preserve"> </w:t>
       </w:r>
+      <w:proofErr w:type="spellStart"/>
       <w:r>
         <w:t>DarkSolace</w:t>
       </w:r>
+      <w:proofErr w:type="spellEnd"/>
     </w:p>
     <w:p>
       <w:pPr>
@@ -2997,9 +3333,11 @@
         </w:rPr>
         <w:t xml:space="preserve"> </w:t>
       </w:r>
+      <w:proofErr w:type="spellStart"/>
       <w:r>
         <w:t>clanker_oil_stain</w:t>
       </w:r>
+      <w:proofErr w:type="spellEnd"/>
     </w:p>
     <w:p>
       <w:pPr>
@@ -3101,9 +3439,11 @@
         </w:rPr>
         <w:t xml:space="preserve"> </w:t>
       </w:r>
+      <w:proofErr w:type="spellStart"/>
       <w:r>
         <w:t>buggedFeature</w:t>
       </w:r>
+      <w:proofErr w:type="spellEnd"/>
     </w:p>
     <w:p>
       <w:pPr>
@@ -3116,9 +3456,11 @@
       <w:r>
         <w:t xml:space="preserve">User 15: </w:t>
       </w:r>
+      <w:proofErr w:type="spellStart"/>
       <w:r>
         <w:t>brundmartindle</w:t>
       </w:r>
+      <w:proofErr w:type="spellEnd"/>
     </w:p>
     <w:p>
       <w:pPr>
@@ -3161,9 +3503,11 @@
       <w:r>
         <w:t xml:space="preserve"> imaginary friend of </w:t>
       </w:r>
+      <w:proofErr w:type="spellStart"/>
       <w:r>
         <w:t>main_hero</w:t>
       </w:r>
+      <w:proofErr w:type="spellEnd"/>
       <w:r>
         <w:t>, with whom he talks in internal monologues that he writes in the notepad (fake one). Breaks 4</w:t>
       </w:r>
@@ -3347,19 +3691,51 @@
         <w:t>.</w:t>
       </w:r>
       <w:r>
-        <w:t xml:space="preserve"> Story is set in the same universe as Cyberdivers and roughly is about a hacker, who used to breach different</w:t>
+        <w:t xml:space="preserve"> Story is set in the same universe as </w:t>
+      </w:r>
+      <w:proofErr w:type="spellStart"/>
+      <w:r>
+        <w:t>Cyberdivers</w:t>
+      </w:r>
+      <w:proofErr w:type="spellEnd"/>
+      <w:r>
+        <w:t xml:space="preserve"> and roughly is about a hacker, who used to breach different</w:t>
       </w:r>
       <w:r>
         <w:t xml:space="preserve"> companies</w:t>
       </w:r>
       <w:r>
-        <w:t xml:space="preserve"> for profit, cuz he thought he was smarter than everyone and angry, but he met an ai girlfriend which changed him for the be</w:t>
+        <w:t xml:space="preserve"> for profit, </w:t>
+      </w:r>
+      <w:proofErr w:type="spellStart"/>
+      <w:r>
+        <w:t>cuz</w:t>
+      </w:r>
+      <w:proofErr w:type="spellEnd"/>
+      <w:r>
+        <w:t xml:space="preserve"> he thought he was smarter than everyone and angry, but he met an ai girlfriend which changed him for the be</w:t>
       </w:r>
       <w:r>
         <w:t>tter</w:t>
       </w:r>
       <w:r>
-        <w:t>, but in the end they separated, cuz ai girlfriend is not real (holy peak).</w:t>
+        <w:t xml:space="preserve">, but in the </w:t>
+      </w:r>
+      <w:proofErr w:type="gramStart"/>
+      <w:r>
+        <w:t>end</w:t>
+      </w:r>
+      <w:proofErr w:type="gramEnd"/>
+      <w:r>
+        <w:t xml:space="preserve"> they separated, </w:t>
+      </w:r>
+      <w:proofErr w:type="spellStart"/>
+      <w:r>
+        <w:t>cuz</w:t>
+      </w:r>
+      <w:proofErr w:type="spellEnd"/>
+      <w:r>
+        <w:t xml:space="preserve"> ai girlfriend is not real (holy peak).</w:t>
       </w:r>
       <w:r>
         <w:t xml:space="preserve"> Because </w:t>
@@ -3392,7 +3768,15 @@
         </w:numPr>
       </w:pPr>
       <w:r>
-        <w:t>Posts are memes about game, some tips about completing the game and story discussions.</w:t>
+        <w:t xml:space="preserve">Posts are memes about </w:t>
+      </w:r>
+      <w:proofErr w:type="gramStart"/>
+      <w:r>
+        <w:t>game</w:t>
+      </w:r>
+      <w:proofErr w:type="gramEnd"/>
+      <w:r>
+        <w:t>, some tips about completing the game and story discussions.</w:t>
       </w:r>
     </w:p>
     <w:p>
@@ -3440,7 +3824,15 @@
         </w:numPr>
       </w:pPr>
       <w:r>
-        <w:t>Game is inspired by halo and god of war 2018</w:t>
+        <w:t xml:space="preserve">Game is inspired by halo and </w:t>
+      </w:r>
+      <w:proofErr w:type="gramStart"/>
+      <w:r>
+        <w:t>god</w:t>
+      </w:r>
+      <w:proofErr w:type="gramEnd"/>
+      <w:r>
+        <w:t xml:space="preserve"> of war 2018</w:t>
       </w:r>
     </w:p>
     <w:p>
@@ -3547,8 +3939,13 @@
         </w:numPr>
       </w:pPr>
       <w:r>
-        <w:t>Not tech savy</w:t>
-      </w:r>
+        <w:t xml:space="preserve">Not tech </w:t>
+      </w:r>
+      <w:proofErr w:type="spellStart"/>
+      <w:r>
+        <w:t>savy</w:t>
+      </w:r>
+      <w:proofErr w:type="spellEnd"/>
     </w:p>
     <w:p>
       <w:pPr>
@@ -3635,23 +4032,56 @@
       <w:bookmarkEnd w:id="13"/>
     </w:p>
     <w:p>
-      <w:r>
-        <w:t xml:space="preserve">Main_hero </w:t>
+      <w:proofErr w:type="spellStart"/>
+      <w:r>
+        <w:t>Main_hero</w:t>
+      </w:r>
+      <w:proofErr w:type="spellEnd"/>
+      <w:r>
+        <w:t xml:space="preserve"> </w:t>
       </w:r>
       <w:r>
         <w:t xml:space="preserve">starts talking about himself. He first states that he wants to write a book and decided he needs to write all his thoughts, so he could use them later. He is doing that because he is not interested in making some shit, he wants to create a masterpiece out of this memoir. He then proceeds to talk about his skills in </w:t>
       </w:r>
+      <w:proofErr w:type="spellStart"/>
       <w:r>
         <w:t>cyberdivers</w:t>
       </w:r>
-      <w:r>
-        <w:t xml:space="preserve">, how he is good in it and how many hours he’s got. He shows his stats on the profile, but it has long streak of </w:t>
-      </w:r>
-      <w:r>
-        <w:t>failed extrractions and bad stats</w:t>
-      </w:r>
-      <w:r>
-        <w:t xml:space="preserve"> and main_hero justifies himself by saying that matchmaking is fucked, </w:t>
+      <w:proofErr w:type="spellEnd"/>
+      <w:r>
+        <w:t xml:space="preserve">, how he is good </w:t>
+      </w:r>
+      <w:proofErr w:type="gramStart"/>
+      <w:r>
+        <w:t>in</w:t>
+      </w:r>
+      <w:proofErr w:type="gramEnd"/>
+      <w:r>
+        <w:t xml:space="preserve"> it and how many hours he’s got. He shows his stats on the profile, but it has long streak of </w:t>
+      </w:r>
+      <w:r>
+        <w:t xml:space="preserve">failed </w:t>
+      </w:r>
+      <w:proofErr w:type="spellStart"/>
+      <w:proofErr w:type="gramStart"/>
+      <w:r>
+        <w:t>extrractions</w:t>
+      </w:r>
+      <w:proofErr w:type="spellEnd"/>
+      <w:proofErr w:type="gramEnd"/>
+      <w:r>
+        <w:t xml:space="preserve"> and bad stats</w:t>
+      </w:r>
+      <w:r>
+        <w:t xml:space="preserve"> and </w:t>
+      </w:r>
+      <w:proofErr w:type="spellStart"/>
+      <w:r>
+        <w:t>main_hero</w:t>
+      </w:r>
+      <w:proofErr w:type="spellEnd"/>
+      <w:r>
+        <w:t xml:space="preserve"> justifies himself by saying that matchmaking is fucked, </w:t>
       </w:r>
       <w:r>
         <w:t>balance is cooked and everything is bugged</w:t>
@@ -3659,9 +4089,11 @@
       <w:r>
         <w:t xml:space="preserve">. He then says that he is well respected in the </w:t>
       </w:r>
+      <w:proofErr w:type="spellStart"/>
       <w:r>
         <w:t>cyberdivers</w:t>
       </w:r>
+      <w:proofErr w:type="spellEnd"/>
       <w:r>
         <w:t xml:space="preserve"> community and goes to subforum</w:t>
       </w:r>
@@ -3675,13 +4107,50 @@
         <w:t xml:space="preserve"> and even played with them and showed himself pretty good</w:t>
       </w:r>
       <w:r>
-        <w:t>.  He says smth like “yo” and instantly gets flamed</w:t>
-      </w:r>
-      <w:r>
-        <w:t xml:space="preserve"> and mocked for his recent game with the community and his overall perfomance</w:t>
-      </w:r>
-      <w:r>
-        <w:t>. Main_hero says that’s how they show affection to one another and it’s pretty normal.</w:t>
+        <w:t xml:space="preserve">.  He says </w:t>
+      </w:r>
+      <w:proofErr w:type="spellStart"/>
+      <w:r>
+        <w:t>smth</w:t>
+      </w:r>
+      <w:proofErr w:type="spellEnd"/>
+      <w:r>
+        <w:t xml:space="preserve"> like “</w:t>
+      </w:r>
+      <w:proofErr w:type="spellStart"/>
+      <w:r>
+        <w:t>yo</w:t>
+      </w:r>
+      <w:proofErr w:type="spellEnd"/>
+      <w:r>
+        <w:t>” and instantly gets flamed</w:t>
+      </w:r>
+      <w:r>
+        <w:t xml:space="preserve"> and mocked for his recent game with the community and his overall </w:t>
+      </w:r>
+      <w:proofErr w:type="spellStart"/>
+      <w:r>
+        <w:t>perfomance</w:t>
+      </w:r>
+      <w:proofErr w:type="spellEnd"/>
+      <w:r>
+        <w:t xml:space="preserve">. </w:t>
+      </w:r>
+      <w:proofErr w:type="spellStart"/>
+      <w:r>
+        <w:t>Main_hero</w:t>
+      </w:r>
+      <w:proofErr w:type="spellEnd"/>
+      <w:r>
+        <w:t xml:space="preserve"> says that’s how they show affection to one another and it’s </w:t>
+      </w:r>
+      <w:proofErr w:type="gramStart"/>
+      <w:r>
+        <w:t>pretty normal</w:t>
+      </w:r>
+      <w:proofErr w:type="gramEnd"/>
+      <w:r>
+        <w:t>.</w:t>
       </w:r>
     </w:p>
     <w:p>
@@ -3702,7 +4171,31 @@
         <w:t>zero</w:t>
       </w:r>
       <w:r>
-        <w:t xml:space="preserve"> just got their dlc delayed. Everyone celebrate that, including main_hero. He explains that because it’s because </w:t>
+        <w:t xml:space="preserve"> just got their </w:t>
+      </w:r>
+      <w:proofErr w:type="spellStart"/>
+      <w:r>
+        <w:t>dlc</w:t>
+      </w:r>
+      <w:proofErr w:type="spellEnd"/>
+      <w:r>
+        <w:t xml:space="preserve"> delayed. Everyone </w:t>
+      </w:r>
+      <w:proofErr w:type="gramStart"/>
+      <w:r>
+        <w:t>celebrate</w:t>
+      </w:r>
+      <w:proofErr w:type="gramEnd"/>
+      <w:r>
+        <w:t xml:space="preserve"> that, including </w:t>
+      </w:r>
+      <w:proofErr w:type="spellStart"/>
+      <w:r>
+        <w:t>main_hero</w:t>
+      </w:r>
+      <w:proofErr w:type="spellEnd"/>
+      <w:r>
+        <w:t xml:space="preserve">. He explains that because it’s because </w:t>
       </w:r>
       <w:r>
         <w:t>Spearhead Studios</w:t>
@@ -3710,9 +4203,11 @@
       <w:r>
         <w:t xml:space="preserve">, developer of </w:t>
       </w:r>
+      <w:proofErr w:type="spellStart"/>
       <w:r>
         <w:t>cyberdivers</w:t>
       </w:r>
+      <w:proofErr w:type="spellEnd"/>
       <w:r>
         <w:t xml:space="preserve"> and </w:t>
       </w:r>
@@ -3722,8 +4217,13 @@
       <w:r>
         <w:t xml:space="preserve">, instead of working on new content for </w:t>
       </w:r>
-      <w:r>
-        <w:t xml:space="preserve">cyberdivers </w:t>
+      <w:proofErr w:type="spellStart"/>
+      <w:r>
+        <w:t>cyberdivers</w:t>
+      </w:r>
+      <w:proofErr w:type="spellEnd"/>
+      <w:r>
+        <w:t xml:space="preserve"> </w:t>
       </w:r>
       <w:r>
         <w:t xml:space="preserve">decided to do a </w:t>
@@ -3732,8 +4232,13 @@
         <w:lastRenderedPageBreak/>
         <w:t xml:space="preserve">new single player, so now, </w:t>
       </w:r>
-      <w:r>
-        <w:t xml:space="preserve">cyberdivers </w:t>
+      <w:proofErr w:type="spellStart"/>
+      <w:r>
+        <w:t>cyberdivers</w:t>
+      </w:r>
+      <w:proofErr w:type="spellEnd"/>
+      <w:r>
+        <w:t xml:space="preserve"> </w:t>
       </w:r>
       <w:r>
         <w:t xml:space="preserve">sub </w:t>
@@ -3744,8 +4249,21 @@
       <w:r>
         <w:t xml:space="preserve">. </w:t>
       </w:r>
-      <w:r>
-        <w:t xml:space="preserve">Main_hero wonders, how did they take news of delayed dlc in </w:t>
+      <w:proofErr w:type="spellStart"/>
+      <w:r>
+        <w:t>Main_hero</w:t>
+      </w:r>
+      <w:proofErr w:type="spellEnd"/>
+      <w:r>
+        <w:t xml:space="preserve"> wonders, how did they take news of delayed </w:t>
+      </w:r>
+      <w:proofErr w:type="spellStart"/>
+      <w:r>
+        <w:t>dlc</w:t>
+      </w:r>
+      <w:proofErr w:type="spellEnd"/>
+      <w:r>
+        <w:t xml:space="preserve"> in </w:t>
       </w:r>
       <w:r>
         <w:t>zero</w:t>
@@ -3757,11 +4275,77 @@
         <w:t>zero</w:t>
       </w:r>
       <w:r>
-        <w:t xml:space="preserve"> fans are chill about it, saying that devs should take all the time they need to finish the dlc. In addition to that, main_hero sees all the helpful posts for newcomers, peaceful discussions and funny memes. That sets him off, main_hero becomes angry, and tries to come up with a reason why it’s all wrong and shouldn’t be like this. He says something like noobs should be mocked for their stupidity so they start think for themselves, discussions shouldn’t be that peaceful, because if everyone agree with everyone no truth can be found and etc. He then says that even tho </w:t>
-      </w:r>
+        <w:t xml:space="preserve"> fans are chill about it, saying that </w:t>
+      </w:r>
+      <w:proofErr w:type="spellStart"/>
+      <w:r>
+        <w:t>devs</w:t>
+      </w:r>
+      <w:proofErr w:type="spellEnd"/>
+      <w:r>
+        <w:t xml:space="preserve"> should take all the time they need to finish the </w:t>
+      </w:r>
+      <w:proofErr w:type="spellStart"/>
+      <w:r>
+        <w:t>dlc</w:t>
+      </w:r>
+      <w:proofErr w:type="spellEnd"/>
+      <w:r>
+        <w:t xml:space="preserve">. In addition to that, </w:t>
+      </w:r>
+      <w:proofErr w:type="spellStart"/>
+      <w:r>
+        <w:t>main_hero</w:t>
+      </w:r>
+      <w:proofErr w:type="spellEnd"/>
+      <w:r>
+        <w:t xml:space="preserve"> sees all the helpful posts for newcomers, peaceful discussions and funny memes. That sets him off, </w:t>
+      </w:r>
+      <w:proofErr w:type="spellStart"/>
+      <w:r>
+        <w:t>main_hero</w:t>
+      </w:r>
+      <w:proofErr w:type="spellEnd"/>
+      <w:r>
+        <w:t xml:space="preserve"> becomes angry, and tries to come up with a reason why it’s all wrong and shouldn’t be like this. He says something like noobs should be mocked for their stupidity so they start </w:t>
+      </w:r>
+      <w:proofErr w:type="gramStart"/>
+      <w:r>
+        <w:t>think</w:t>
+      </w:r>
+      <w:proofErr w:type="gramEnd"/>
+      <w:r>
+        <w:t xml:space="preserve"> for themselves, discussions shouldn’t be that peaceful, because if everyone </w:t>
+      </w:r>
+      <w:proofErr w:type="gramStart"/>
+      <w:r>
+        <w:t>agree</w:t>
+      </w:r>
+      <w:proofErr w:type="gramEnd"/>
+      <w:r>
+        <w:t xml:space="preserve"> with everyone no truth can be found </w:t>
+      </w:r>
+      <w:proofErr w:type="gramStart"/>
+      <w:r>
+        <w:t>and etc.</w:t>
+      </w:r>
+      <w:proofErr w:type="gramEnd"/>
+      <w:r>
+        <w:t xml:space="preserve"> He then says that even </w:t>
+      </w:r>
+      <w:proofErr w:type="spellStart"/>
+      <w:r>
+        <w:t>tho</w:t>
+      </w:r>
+      <w:proofErr w:type="spellEnd"/>
+      <w:r>
+        <w:t xml:space="preserve"> </w:t>
+      </w:r>
+      <w:proofErr w:type="spellStart"/>
       <w:r>
         <w:t>cyberdivers</w:t>
       </w:r>
+      <w:proofErr w:type="spellEnd"/>
       <w:r>
         <w:t xml:space="preserve"> community can be rude sometimes they are honest and do not pretend.</w:t>
       </w:r>
@@ -3769,13 +4353,34 @@
         <w:t xml:space="preserve"> It’s so much better than this </w:t>
       </w:r>
       <w:r>
-        <w:t xml:space="preserve">phoniness. He then remembers his days when his mom forced him to go do some programming courses, cuz he was spending too much time in </w:t>
-      </w:r>
-      <w:r>
-        <w:t xml:space="preserve">cyberdivers </w:t>
-      </w:r>
-      <w:r>
-        <w:t xml:space="preserve">(she didn’t how good he was in it, maybe if she supported him, he would be </w:t>
+        <w:t xml:space="preserve">phoniness. He then remembers his days when his mom forced him to go do some programming courses, </w:t>
+      </w:r>
+      <w:proofErr w:type="spellStart"/>
+      <w:r>
+        <w:t>cuz</w:t>
+      </w:r>
+      <w:proofErr w:type="spellEnd"/>
+      <w:r>
+        <w:t xml:space="preserve"> he was spending too much time in </w:t>
+      </w:r>
+      <w:proofErr w:type="spellStart"/>
+      <w:r>
+        <w:t>cyberdivers</w:t>
+      </w:r>
+      <w:proofErr w:type="spellEnd"/>
+      <w:r>
+        <w:t xml:space="preserve"> </w:t>
+      </w:r>
+      <w:r>
+        <w:t xml:space="preserve">(she didn’t how good he was </w:t>
+      </w:r>
+      <w:proofErr w:type="gramStart"/>
+      <w:r>
+        <w:t>in</w:t>
+      </w:r>
+      <w:proofErr w:type="gramEnd"/>
+      <w:r>
+        <w:t xml:space="preserve"> it, maybe if she supported him, he would be </w:t>
       </w:r>
       <w:r>
         <w:t>a successful twitch streamer</w:t>
@@ -3786,14 +4391,27 @@
       <w:r>
         <w:t xml:space="preserve"> and decides to do a phishing website and steal the creds of the admin of this subreddit, sillygoose228. He comes back to the </w:t>
       </w:r>
-      <w:r>
-        <w:t xml:space="preserve">cyberdivers </w:t>
+      <w:proofErr w:type="spellStart"/>
+      <w:r>
+        <w:t>cyberdivers</w:t>
+      </w:r>
+      <w:proofErr w:type="spellEnd"/>
+      <w:r>
+        <w:t xml:space="preserve"> </w:t>
       </w:r>
       <w:r>
         <w:t>chat and</w:t>
       </w:r>
       <w:r>
-        <w:t xml:space="preserve"> tells them about his intentions. Naturally, he gets mocked even harder, but now main_hero wants to prove them all wrong.</w:t>
+        <w:t xml:space="preserve"> tells them about his intentions. Naturally, he gets mocked even harder, but now </w:t>
+      </w:r>
+      <w:proofErr w:type="spellStart"/>
+      <w:r>
+        <w:t>main_hero</w:t>
+      </w:r>
+      <w:proofErr w:type="spellEnd"/>
+      <w:r>
+        <w:t xml:space="preserve"> wants to prove them all wrong.</w:t>
       </w:r>
     </w:p>
     <w:p>
@@ -3819,10 +4437,39 @@
         </w:r>
       </w:hyperlink>
       <w:r>
-        <w:t>. First he tries to come up with simpler plans tho</w:t>
-      </w:r>
-      <w:r>
-        <w:t xml:space="preserve">. Then main_hero opens up vim in the terminal as every cool coder uses vim. After getting stuck in and eventually getting out, he </w:t>
+        <w:t xml:space="preserve">. </w:t>
+      </w:r>
+      <w:proofErr w:type="gramStart"/>
+      <w:r>
+        <w:t>First</w:t>
+      </w:r>
+      <w:proofErr w:type="gramEnd"/>
+      <w:r>
+        <w:t xml:space="preserve"> he tries to come up with simpler plans </w:t>
+      </w:r>
+      <w:proofErr w:type="spellStart"/>
+      <w:r>
+        <w:t>tho</w:t>
+      </w:r>
+      <w:proofErr w:type="spellEnd"/>
+      <w:r>
+        <w:t xml:space="preserve">. Then </w:t>
+      </w:r>
+      <w:proofErr w:type="spellStart"/>
+      <w:r>
+        <w:t>main_hero</w:t>
+      </w:r>
+      <w:proofErr w:type="spellEnd"/>
+      <w:r>
+        <w:t xml:space="preserve"> </w:t>
+      </w:r>
+      <w:proofErr w:type="gramStart"/>
+      <w:r>
+        <w:t>opens up</w:t>
+      </w:r>
+      <w:proofErr w:type="gramEnd"/>
+      <w:r>
+        <w:t xml:space="preserve"> vim in the terminal as every cool coder uses vim. After getting stuck in and eventually getting out, he </w:t>
       </w:r>
       <w:r>
         <w:t xml:space="preserve">then realizes he remembers fuck all about coding. He then decides to </w:t>
@@ -3831,16 +4478,64 @@
         <w:t xml:space="preserve">ask ai for help, promising it’s only for consulting. Then we see him copy and pasting huge chunks of code. </w:t>
       </w:r>
       <w:r>
-        <w:t xml:space="preserve">After he is done, he sends the message to sillygoose228. He replies that he will look into it. Main_hero waits for a few minutes with terminal open, coping that everything is fine and it takes longer than it should probably because admin types slowly or forgot where </w:t>
+        <w:t xml:space="preserve">After he is done, he sends the message to sillygoose228. He replies that he will </w:t>
+      </w:r>
+      <w:proofErr w:type="gramStart"/>
+      <w:r>
+        <w:t>look into</w:t>
+      </w:r>
+      <w:proofErr w:type="gramEnd"/>
+      <w:r>
+        <w:t xml:space="preserve"> it. </w:t>
+      </w:r>
+      <w:proofErr w:type="spellStart"/>
+      <w:r>
+        <w:t>Main_hero</w:t>
+      </w:r>
+      <w:proofErr w:type="spellEnd"/>
+      <w:r>
+        <w:t xml:space="preserve"> waits for a few minutes with terminal open, coping that everything is fine and it takes longer than it should probably because admin types slowly or forgot where </w:t>
       </w:r>
       <w:r>
         <w:t>the delete button is</w:t>
       </w:r>
       <w:r>
-        <w:t>. But then creds are popping up in the terminal. Main_hero is briefly happy, but then admin says that, even tho he deleted a post, he can’t ban a man who made it, because he is not in his sub. Main_hero realizes that he forgot to change the author</w:t>
-      </w:r>
-      <w:r>
-        <w:t xml:space="preserve"> of the post, freaks out and tells admin that it must be The Forum being laggy mess again, cuz for him it shows that user was deleted. Sillygoose228 replies suspicious</w:t>
+        <w:t xml:space="preserve">. But then creds are popping up in the terminal. </w:t>
+      </w:r>
+      <w:proofErr w:type="spellStart"/>
+      <w:r>
+        <w:t>Main_hero</w:t>
+      </w:r>
+      <w:proofErr w:type="spellEnd"/>
+      <w:r>
+        <w:t xml:space="preserve"> is briefly happy, but then admin says that, even </w:t>
+      </w:r>
+      <w:proofErr w:type="spellStart"/>
+      <w:r>
+        <w:t>tho</w:t>
+      </w:r>
+      <w:proofErr w:type="spellEnd"/>
+      <w:r>
+        <w:t xml:space="preserve"> he deleted a post, he can’t ban a man who made it, because he is not in his sub. </w:t>
+      </w:r>
+      <w:proofErr w:type="spellStart"/>
+      <w:r>
+        <w:t>Main_hero</w:t>
+      </w:r>
+      <w:proofErr w:type="spellEnd"/>
+      <w:r>
+        <w:t xml:space="preserve"> realizes that he forgot to change the author</w:t>
+      </w:r>
+      <w:r>
+        <w:t xml:space="preserve"> of the post, freaks out and tells admin that it must be The Forum being laggy mess again, </w:t>
+      </w:r>
+      <w:proofErr w:type="spellStart"/>
+      <w:r>
+        <w:t>cuz</w:t>
+      </w:r>
+      <w:proofErr w:type="spellEnd"/>
+      <w:r>
+        <w:t xml:space="preserve"> for him it shows that user was deleted. Sillygoose228 replies suspicious</w:t>
       </w:r>
       <w:r>
         <w:t>ly</w:t>
@@ -3849,14 +4544,40 @@
         <w:t xml:space="preserve"> </w:t>
       </w:r>
       <w:r>
-        <w:t>that website was even more laggy then usual when he was deleting that post (main_hero blames ai for that)</w:t>
-      </w:r>
-      <w:r>
-        <w:t xml:space="preserve">, and after long typing dumps a story when he tried to reply to someone and his reply was sent multiple times, cuz the forum was bugging out. Main_hero realizes he is off the hook and proceeds to login as sillygoose228 and demotes all the mods and transfer ownership of the sub to his account. He goes back and tells </w:t>
-      </w:r>
+        <w:t>that website was even more laggy then usual when he was deleting that post (</w:t>
+      </w:r>
+      <w:proofErr w:type="spellStart"/>
+      <w:r>
+        <w:t>main_hero</w:t>
+      </w:r>
+      <w:proofErr w:type="spellEnd"/>
+      <w:r>
+        <w:t xml:space="preserve"> blames ai for that)</w:t>
+      </w:r>
+      <w:r>
+        <w:t xml:space="preserve">, and after long typing dumps a story when he tried to reply to someone and his reply was sent multiple times, </w:t>
+      </w:r>
+      <w:proofErr w:type="spellStart"/>
+      <w:r>
+        <w:t>cuz</w:t>
+      </w:r>
+      <w:proofErr w:type="spellEnd"/>
+      <w:r>
+        <w:t xml:space="preserve"> the forum was bugging out. </w:t>
+      </w:r>
+      <w:proofErr w:type="spellStart"/>
+      <w:r>
+        <w:t>Main_hero</w:t>
+      </w:r>
+      <w:proofErr w:type="spellEnd"/>
+      <w:r>
+        <w:t xml:space="preserve"> realizes he is off the hook and proceeds to login as sillygoose228 and demotes all the mods and transfer ownership of the sub to his account. He goes back and tells </w:t>
+      </w:r>
+      <w:proofErr w:type="spellStart"/>
       <w:r>
         <w:t>cyberdivers</w:t>
       </w:r>
+      <w:proofErr w:type="spellEnd"/>
       <w:r>
         <w:t xml:space="preserve"> chat that he hacked the </w:t>
       </w:r>
@@ -3864,7 +4585,15 @@
         <w:t>zero</w:t>
       </w:r>
       <w:r>
-        <w:t xml:space="preserve"> sub and now he is the owner and they should do whatever they want with it.</w:t>
+        <w:t xml:space="preserve"> sub and now he is the </w:t>
+      </w:r>
+      <w:proofErr w:type="gramStart"/>
+      <w:r>
+        <w:t>owner</w:t>
+      </w:r>
+      <w:proofErr w:type="gramEnd"/>
+      <w:r>
+        <w:t xml:space="preserve"> and they should do whatever they want with it.</w:t>
       </w:r>
     </w:p>
     <w:p>
@@ -3880,37 +4609,140 @@
     </w:p>
     <w:p>
       <w:r>
-        <w:t>Chat is surprised. It calls main_hero a legend</w:t>
-      </w:r>
-      <w:r>
-        <w:t>, praises him for actually pulling this off</w:t>
-      </w:r>
-      <w:r>
-        <w:t xml:space="preserve">. Main_hero suggests they go and post dickpics, spam whatever they want. He goes to </w:t>
+        <w:t xml:space="preserve">Chat is </w:t>
+      </w:r>
+      <w:proofErr w:type="gramStart"/>
+      <w:r>
+        <w:t>surprised</w:t>
+      </w:r>
+      <w:proofErr w:type="gramEnd"/>
+      <w:r>
+        <w:t xml:space="preserve">. It calls </w:t>
+      </w:r>
+      <w:proofErr w:type="spellStart"/>
+      <w:r>
+        <w:t>main_hero</w:t>
+      </w:r>
+      <w:proofErr w:type="spellEnd"/>
+      <w:r>
+        <w:t xml:space="preserve"> a legend</w:t>
+      </w:r>
+      <w:r>
+        <w:t xml:space="preserve">, praises him for </w:t>
+      </w:r>
+      <w:proofErr w:type="gramStart"/>
+      <w:r>
+        <w:t>actually pulling</w:t>
+      </w:r>
+      <w:proofErr w:type="gramEnd"/>
+      <w:r>
+        <w:t xml:space="preserve"> this off</w:t>
+      </w:r>
+      <w:r>
+        <w:t xml:space="preserve">. </w:t>
+      </w:r>
+      <w:proofErr w:type="spellStart"/>
+      <w:r>
+        <w:t>Main_hero</w:t>
+      </w:r>
+      <w:proofErr w:type="spellEnd"/>
+      <w:r>
+        <w:t xml:space="preserve"> suggests they go and post </w:t>
+      </w:r>
+      <w:proofErr w:type="spellStart"/>
+      <w:r>
+        <w:t>dickpics</w:t>
+      </w:r>
+      <w:proofErr w:type="spellEnd"/>
+      <w:r>
+        <w:t xml:space="preserve">, spam whatever they want. He goes to </w:t>
       </w:r>
       <w:r>
         <w:t>zero</w:t>
       </w:r>
       <w:r>
-        <w:t xml:space="preserve"> sub and sees people starting to spam all kinds of posts in the sub. Main_hero finally feels appreciated and proud of his work. He goes back to </w:t>
-      </w:r>
+        <w:t xml:space="preserve"> sub and sees people starting to spam all kinds of posts in the sub. </w:t>
+      </w:r>
+      <w:proofErr w:type="spellStart"/>
+      <w:r>
+        <w:t>Main_hero</w:t>
+      </w:r>
+      <w:proofErr w:type="spellEnd"/>
+      <w:r>
+        <w:t xml:space="preserve"> finally feels appreciated and proud of his work. He goes back to </w:t>
+      </w:r>
+      <w:proofErr w:type="spellStart"/>
       <w:r>
         <w:t>cyberdivers</w:t>
       </w:r>
+      <w:proofErr w:type="spellEnd"/>
       <w:r>
         <w:t xml:space="preserve"> chat to read more about his accomplishment, but then he sees messages of some people, </w:t>
       </w:r>
       <w:r>
-        <w:t xml:space="preserve">who start to downplay what he did. They are calling him out on vibecoding some slop and calling it his accomplishment. Some people are asking to move on already. Some people are saying that main_hero will always remain a clown in this chat, no matter what he does. </w:t>
-      </w:r>
-      <w:r>
-        <w:t>Main_hero is provoked by this, says that he singlehandedly hacked a subforum and they all didn’t do anything. Then argument evolves into insult throwing.</w:t>
+        <w:t xml:space="preserve">who start to downplay what he did. They </w:t>
+      </w:r>
+      <w:proofErr w:type="gramStart"/>
+      <w:r>
+        <w:t>are calling</w:t>
+      </w:r>
+      <w:proofErr w:type="gramEnd"/>
+      <w:r>
+        <w:t xml:space="preserve"> him out on </w:t>
+      </w:r>
+      <w:proofErr w:type="spellStart"/>
+      <w:r>
+        <w:t>vibecoding</w:t>
+      </w:r>
+      <w:proofErr w:type="spellEnd"/>
+      <w:r>
+        <w:t xml:space="preserve"> some slop and </w:t>
+      </w:r>
+      <w:proofErr w:type="gramStart"/>
+      <w:r>
+        <w:t>calling</w:t>
+      </w:r>
+      <w:proofErr w:type="gramEnd"/>
+      <w:r>
+        <w:t xml:space="preserve"> it his accomplishment. Some people are asking to move on already. Some people are saying that </w:t>
+      </w:r>
+      <w:proofErr w:type="spellStart"/>
+      <w:r>
+        <w:t>main_hero</w:t>
+      </w:r>
+      <w:proofErr w:type="spellEnd"/>
+      <w:r>
+        <w:t xml:space="preserve"> will always remain a clown in this chat, no matter what he does. </w:t>
+      </w:r>
+      <w:proofErr w:type="spellStart"/>
+      <w:r>
+        <w:t>Main_hero</w:t>
+      </w:r>
+      <w:proofErr w:type="spellEnd"/>
+      <w:r>
+        <w:t xml:space="preserve"> is provoked by this, says that he singlehandedly hacked a subforum and </w:t>
+      </w:r>
+      <w:proofErr w:type="gramStart"/>
+      <w:r>
+        <w:t>they all</w:t>
+      </w:r>
+      <w:proofErr w:type="gramEnd"/>
+      <w:r>
+        <w:t xml:space="preserve"> didn’t do anything. Then argument evolves into insult throwing.</w:t>
       </w:r>
       <w:r>
         <w:t xml:space="preserve"> </w:t>
       </w:r>
       <w:r>
-        <w:t xml:space="preserve">In the middle of this argument, main_hero </w:t>
+        <w:t xml:space="preserve">In the middle of this argument, </w:t>
+      </w:r>
+      <w:proofErr w:type="spellStart"/>
+      <w:r>
+        <w:t>main_hero</w:t>
+      </w:r>
+      <w:proofErr w:type="spellEnd"/>
+      <w:r>
+        <w:t xml:space="preserve"> </w:t>
       </w:r>
       <w:r>
         <w:t>is getting</w:t>
@@ -3918,9 +4750,11 @@
       <w:r>
         <w:t xml:space="preserve"> struck with realization. He says he wastes his life on some stupid shit like trying hard in </w:t>
       </w:r>
+      <w:proofErr w:type="spellStart"/>
       <w:r>
         <w:t>cyberdivers</w:t>
       </w:r>
+      <w:proofErr w:type="spellEnd"/>
       <w:r>
         <w:t xml:space="preserve"> for 1000 hours or hacking subforums and all for what, for fucking </w:t>
       </w:r>
@@ -3937,11 +4771,24 @@
         <w:t xml:space="preserve"> from idiots just like him. </w:t>
       </w:r>
       <w:r>
-        <w:t xml:space="preserve">And he can’t leave this idiots, because they are the only friends he has. </w:t>
-      </w:r>
-      <w:r>
-        <w:t>He is trying to convince himself and everyone around him that he is skillful, smart and overall</w:t>
-      </w:r>
+        <w:t xml:space="preserve">And he can’t leave </w:t>
+      </w:r>
+      <w:proofErr w:type="gramStart"/>
+      <w:r>
+        <w:t>this idiots</w:t>
+      </w:r>
+      <w:proofErr w:type="gramEnd"/>
+      <w:r>
+        <w:t xml:space="preserve">, because they are the only friends he has. </w:t>
+      </w:r>
+      <w:r>
+        <w:t xml:space="preserve">He is trying to convince himself and everyone around him that he is skillful, smart and </w:t>
+      </w:r>
+      <w:proofErr w:type="gramStart"/>
+      <w:r>
+        <w:t>overall</w:t>
+      </w:r>
+      <w:proofErr w:type="gramEnd"/>
       <w:r>
         <w:t xml:space="preserve"> the</w:t>
       </w:r>
@@ -3952,10 +4799,26 @@
         <w:t>not be alone</w:t>
       </w:r>
       <w:r>
-        <w:t xml:space="preserve">. He asks us if this life is fucking bullshit. He snaps out of it when someone pinged him and asked, does he know that The Forum could ban him for that. Main_hero replies, </w:t>
-      </w:r>
-      <w:r>
-        <w:t>yeah of course, but before he could sent that, he gets banned. Story ends with “oh wow”.</w:t>
+        <w:t xml:space="preserve">. He asks us if this life is fucking bullshit. He snaps out of it when someone pinged him and asked, does he know that The Forum could ban him for that. </w:t>
+      </w:r>
+      <w:proofErr w:type="spellStart"/>
+      <w:r>
+        <w:t>Main_hero</w:t>
+      </w:r>
+      <w:proofErr w:type="spellEnd"/>
+      <w:r>
+        <w:t xml:space="preserve"> replies, </w:t>
+      </w:r>
+      <w:r>
+        <w:t xml:space="preserve">yeah of course, but before he could </w:t>
+      </w:r>
+      <w:proofErr w:type="gramStart"/>
+      <w:r>
+        <w:t>sent</w:t>
+      </w:r>
+      <w:proofErr w:type="gramEnd"/>
+      <w:r>
+        <w:t xml:space="preserve"> that, he gets banned. Story ends with “oh wow”.</w:t>
       </w:r>
     </w:p>
     <w:p>
@@ -3988,7 +4851,15 @@
     </w:p>
     <w:p>
       <w:r>
-        <w:t xml:space="preserve">Hi. I am main_hero. </w:t>
+        <w:t xml:space="preserve">Hi. I am </w:t>
+      </w:r>
+      <w:proofErr w:type="spellStart"/>
+      <w:r>
+        <w:t>main_hero</w:t>
+      </w:r>
+      <w:proofErr w:type="spellEnd"/>
+      <w:r>
+        <w:t xml:space="preserve">. </w:t>
       </w:r>
       <w:r>
         <w:t xml:space="preserve">I’m starting this file </w:t>
@@ -4034,7 +4905,15 @@
         <w:t>So,</w:t>
       </w:r>
       <w:r>
-        <w:t xml:space="preserve"> uhhh where do I start?</w:t>
+        <w:t xml:space="preserve"> </w:t>
+      </w:r>
+      <w:proofErr w:type="spellStart"/>
+      <w:r>
+        <w:t>uhhh</w:t>
+      </w:r>
+      <w:proofErr w:type="spellEnd"/>
+      <w:r>
+        <w:t xml:space="preserve"> where do I start?</w:t>
       </w:r>
       <w:r>
         <w:t xml:space="preserve"> I </w:t>
@@ -4066,9 +4945,11 @@
       <w:r>
         <w:t xml:space="preserve">in </w:t>
       </w:r>
+      <w:proofErr w:type="spellStart"/>
       <w:r>
         <w:t>Cyberdivers</w:t>
       </w:r>
+      <w:proofErr w:type="spellEnd"/>
       <w:r>
         <w:t>.</w:t>
       </w:r>
@@ -4079,10 +4960,23 @@
         <w:t xml:space="preserve"> in it</w:t>
       </w:r>
       <w:r>
-        <w:t xml:space="preserve"> and, boy, lemme tell you, I am very good </w:t>
-      </w:r>
-      <w:r>
-        <w:t>in this</w:t>
+        <w:t xml:space="preserve"> and, boy, </w:t>
+      </w:r>
+      <w:proofErr w:type="spellStart"/>
+      <w:r>
+        <w:t>lemme</w:t>
+      </w:r>
+      <w:proofErr w:type="spellEnd"/>
+      <w:r>
+        <w:t xml:space="preserve"> tell you, I am very good </w:t>
+      </w:r>
+      <w:proofErr w:type="gramStart"/>
+      <w:r>
+        <w:t>in</w:t>
+      </w:r>
+      <w:proofErr w:type="gramEnd"/>
+      <w:r>
+        <w:t xml:space="preserve"> this</w:t>
       </w:r>
       <w:r>
         <w:t xml:space="preserve"> game, I can show you.</w:t>
@@ -4101,9 +4995,11 @@
       <w:r>
         <w:t xml:space="preserve">where he got a </w:t>
       </w:r>
+      <w:proofErr w:type="spellStart"/>
       <w:r>
         <w:t>cyberdivers</w:t>
       </w:r>
+      <w:proofErr w:type="spellEnd"/>
       <w:r>
         <w:t xml:space="preserve"> link. As user hovers over the link, he sees a streak of </w:t>
       </w:r>
@@ -4177,7 +5073,15 @@
         <w:t xml:space="preserve"> I play a lot better than this</w:t>
       </w:r>
       <w:r>
-        <w:t>, it’s just a bad luck is what it is</w:t>
+        <w:t xml:space="preserve">, it’s just </w:t>
+      </w:r>
+      <w:proofErr w:type="gramStart"/>
+      <w:r>
+        <w:t>a bad</w:t>
+      </w:r>
+      <w:proofErr w:type="gramEnd"/>
+      <w:r>
+        <w:t xml:space="preserve"> luck is what it is</w:t>
       </w:r>
       <w:r>
         <w:t>, trust.</w:t>
@@ -4187,9 +5091,11 @@
       <w:r>
         <w:t xml:space="preserve">Anyway, I’m well respected in </w:t>
       </w:r>
+      <w:proofErr w:type="spellStart"/>
       <w:r>
         <w:t>cyberdivers</w:t>
       </w:r>
+      <w:proofErr w:type="spellEnd"/>
       <w:r>
         <w:t xml:space="preserve"> community, people know my name.</w:t>
       </w:r>
@@ -4199,15 +5105,44 @@
     </w:p>
     <w:p>
       <w:r>
-        <w:t>(User is prompted to search for the sc2 subforum)</w:t>
-      </w:r>
-    </w:p>
-    <w:p>
-      <w:r>
-        <w:t xml:space="preserve">I kinda forgot to explain, what kind of game this is. </w:t>
-      </w:r>
-      <w:r>
-        <w:t xml:space="preserve">So </w:t>
+        <w:t>(</w:t>
+      </w:r>
+      <w:proofErr w:type="gramStart"/>
+      <w:r>
+        <w:t>User is</w:t>
+      </w:r>
+      <w:proofErr w:type="gramEnd"/>
+      <w:r>
+        <w:t xml:space="preserve"> prompted to search for the sc2 subforum)</w:t>
+      </w:r>
+    </w:p>
+    <w:p>
+      <w:r>
+        <w:t xml:space="preserve">I </w:t>
+      </w:r>
+      <w:proofErr w:type="spellStart"/>
+      <w:r>
+        <w:t>kinda</w:t>
+      </w:r>
+      <w:proofErr w:type="spellEnd"/>
+      <w:r>
+        <w:t xml:space="preserve"> forgot to </w:t>
+      </w:r>
+      <w:proofErr w:type="gramStart"/>
+      <w:r>
+        <w:t>explain,</w:t>
+      </w:r>
+      <w:proofErr w:type="gramEnd"/>
+      <w:r>
+        <w:t xml:space="preserve"> what kind of game this is. </w:t>
+      </w:r>
+      <w:proofErr w:type="gramStart"/>
+      <w:r>
+        <w:t>So</w:t>
+      </w:r>
+      <w:proofErr w:type="gramEnd"/>
+      <w:r>
+        <w:t xml:space="preserve"> </w:t>
       </w:r>
       <w:r>
         <w:t xml:space="preserve">it’s </w:t>
@@ -4228,26 +5163,63 @@
         <w:t xml:space="preserve"> </w:t>
       </w:r>
       <w:r>
-        <w:t>from different threats, so companies hire cyberdivers as freelancers to deal with them</w:t>
-      </w:r>
-      <w:r>
-        <w:t>, but it’s represented as them actually fighting one of three factions: AI bots, Bugs or Hackers. Naturally</w:t>
+        <w:t xml:space="preserve">from different threats, so companies hire </w:t>
+      </w:r>
+      <w:proofErr w:type="spellStart"/>
+      <w:r>
+        <w:t>cyberdivers</w:t>
+      </w:r>
+      <w:proofErr w:type="spellEnd"/>
+      <w:r>
+        <w:t xml:space="preserve"> as freelancers to deal with them</w:t>
+      </w:r>
+      <w:r>
+        <w:t xml:space="preserve">, but it’s represented as them </w:t>
+      </w:r>
+      <w:proofErr w:type="gramStart"/>
+      <w:r>
+        <w:t>actually fighting</w:t>
+      </w:r>
+      <w:proofErr w:type="gramEnd"/>
+      <w:r>
+        <w:t xml:space="preserve"> one of three factions: AI bots, Bugs or Hackers. Naturally</w:t>
       </w:r>
       <w:r>
         <w:t>,</w:t>
       </w:r>
       <w:r>
-        <w:t xml:space="preserve"> we have nicknames for all three, clankers, bugs and squids. We call hackers squids, cuz in game they look like s</w:t>
+        <w:t xml:space="preserve"> we have nicknames for all three, clankers, bugs and squids. We call hackers squids, </w:t>
+      </w:r>
+      <w:proofErr w:type="spellStart"/>
+      <w:r>
+        <w:t>cuz</w:t>
+      </w:r>
+      <w:proofErr w:type="spellEnd"/>
+      <w:r>
+        <w:t xml:space="preserve"> in </w:t>
+      </w:r>
+      <w:proofErr w:type="gramStart"/>
+      <w:r>
+        <w:t>game</w:t>
+      </w:r>
+      <w:proofErr w:type="gramEnd"/>
+      <w:r>
+        <w:t xml:space="preserve"> they look like s</w:t>
       </w:r>
       <w:r>
         <w:t>quids, and their tentacles can penetrate everything. And when I say everything, I mean everything.</w:t>
       </w:r>
       <w:r>
-        <w:t xml:space="preserve"> Like walls. I mean</w:t>
+        <w:t xml:space="preserve"> Like walls. I </w:t>
+      </w:r>
+      <w:proofErr w:type="gramStart"/>
+      <w:r>
+        <w:t>mean</w:t>
       </w:r>
       <w:r>
         <w:t>t</w:t>
       </w:r>
+      <w:proofErr w:type="gramEnd"/>
       <w:r>
         <w:t xml:space="preserve"> walls.</w:t>
       </w:r>
@@ -4278,7 +5250,15 @@
         <w:t>fight</w:t>
       </w:r>
       <w:r>
-        <w:t xml:space="preserve">. But oh well, what can u do with shit teammates, right? Hold on, lemme </w:t>
+        <w:t xml:space="preserve">. But oh well, what can u do with shit teammates, right? Hold on, </w:t>
+      </w:r>
+      <w:proofErr w:type="spellStart"/>
+      <w:r>
+        <w:t>lemme</w:t>
+      </w:r>
+      <w:proofErr w:type="spellEnd"/>
+      <w:r>
+        <w:t xml:space="preserve"> </w:t>
       </w:r>
       <w:r>
         <w:t>hit them up</w:t>
@@ -4335,13 +5315,26 @@
         <w:t>clankers</w:t>
       </w:r>
       <w:r>
-        <w:t xml:space="preserve"> spawn rate is insane, how tf r u supposed to fight them on d10</w:t>
-      </w:r>
-    </w:p>
-    <w:p>
-      <w:r>
-        <w:t>User 2: skill issue bruh</w:t>
-      </w:r>
+        <w:t xml:space="preserve"> spawn rate is insane, how </w:t>
+      </w:r>
+      <w:proofErr w:type="spellStart"/>
+      <w:r>
+        <w:t>tf</w:t>
+      </w:r>
+      <w:proofErr w:type="spellEnd"/>
+      <w:r>
+        <w:t xml:space="preserve"> r u supposed to fight them on d10</w:t>
+      </w:r>
+    </w:p>
+    <w:p>
+      <w:r>
+        <w:t xml:space="preserve">User 2: skill issue </w:t>
+      </w:r>
+      <w:proofErr w:type="spellStart"/>
+      <w:r>
+        <w:t>bruh</w:t>
+      </w:r>
+      <w:proofErr w:type="spellEnd"/>
     </w:p>
     <w:p>
       <w:r>
@@ -4353,7 +5346,15 @@
         <w:t xml:space="preserve">User 3: </w:t>
       </w:r>
       <w:r>
-        <w:t>just bring ak 4.7.0 with reactive boost, it’s not that hard</w:t>
+        <w:t xml:space="preserve">just bring </w:t>
+      </w:r>
+      <w:proofErr w:type="spellStart"/>
+      <w:r>
+        <w:t>ak</w:t>
+      </w:r>
+      <w:proofErr w:type="spellEnd"/>
+      <w:r>
+        <w:t xml:space="preserve"> 4.7.0 with reactive boost, it’s not that hard</w:t>
       </w:r>
     </w:p>
     <w:p>
@@ -4363,7 +5364,23 @@
     </w:p>
     <w:p>
       <w:r>
-        <w:t>User 1: I need level 75 to unlock ak 4.7.0, im like 42</w:t>
+        <w:t xml:space="preserve">User 1: I need level 75 to unlock </w:t>
+      </w:r>
+      <w:proofErr w:type="spellStart"/>
+      <w:r>
+        <w:t>ak</w:t>
+      </w:r>
+      <w:proofErr w:type="spellEnd"/>
+      <w:r>
+        <w:t xml:space="preserve"> 4.7.0, </w:t>
+      </w:r>
+      <w:proofErr w:type="spellStart"/>
+      <w:r>
+        <w:t>im</w:t>
+      </w:r>
+      <w:proofErr w:type="spellEnd"/>
+      <w:r>
+        <w:t xml:space="preserve"> like 42</w:t>
       </w:r>
     </w:p>
     <w:p>
@@ -4387,17 +5404,46 @@
     <w:p>
       <w:r>
         <w:lastRenderedPageBreak/>
-        <w:t>User 4: go train on d1 bruh, left mouse button to shoot btw</w:t>
-      </w:r>
-    </w:p>
-    <w:p>
-      <w:r>
-        <w:t>User 1: go touch some grass bruh, ur father won’t come back home if u put another 100 hours in the game</w:t>
-      </w:r>
-    </w:p>
-    <w:p>
-      <w:r>
-        <w:t xml:space="preserve">Main_hero: </w:t>
+        <w:t xml:space="preserve">User 4: go train on d1 </w:t>
+      </w:r>
+      <w:proofErr w:type="spellStart"/>
+      <w:r>
+        <w:t>bruh</w:t>
+      </w:r>
+      <w:proofErr w:type="spellEnd"/>
+      <w:r>
+        <w:t>, left mouse button to shoot btw</w:t>
+      </w:r>
+    </w:p>
+    <w:p>
+      <w:r>
+        <w:t xml:space="preserve">User 1: go touch some grass </w:t>
+      </w:r>
+      <w:proofErr w:type="spellStart"/>
+      <w:r>
+        <w:t>bruh</w:t>
+      </w:r>
+      <w:proofErr w:type="spellEnd"/>
+      <w:r>
+        <w:t xml:space="preserve">, </w:t>
+      </w:r>
+      <w:proofErr w:type="spellStart"/>
+      <w:r>
+        <w:t>ur</w:t>
+      </w:r>
+      <w:proofErr w:type="spellEnd"/>
+      <w:r>
+        <w:t xml:space="preserve"> father won’t come back home if u put another 100 hours in the game</w:t>
+      </w:r>
+    </w:p>
+    <w:p>
+      <w:proofErr w:type="spellStart"/>
+      <w:r>
+        <w:t>Main_hero</w:t>
+      </w:r>
+      <w:proofErr w:type="spellEnd"/>
+      <w:r>
+        <w:t xml:space="preserve">: </w:t>
       </w:r>
       <w:r>
         <w:t>what’s up</w:t>
@@ -4416,7 +5462,15 @@
         <w:t>sprint</w:t>
       </w:r>
       <w:r>
-        <w:t xml:space="preserve"> cuz of u</w:t>
+        <w:t xml:space="preserve"> </w:t>
+      </w:r>
+      <w:proofErr w:type="spellStart"/>
+      <w:r>
+        <w:t>cuz</w:t>
+      </w:r>
+      <w:proofErr w:type="spellEnd"/>
+      <w:r>
+        <w:t xml:space="preserve"> of u</w:t>
       </w:r>
     </w:p>
     <w:p>
@@ -4431,8 +5485,13 @@
     </w:p>
     <w:p>
       <w:r>
-        <w:t>User 4: go fuck urself</w:t>
-      </w:r>
+        <w:t xml:space="preserve">User 4: go fuck </w:t>
+      </w:r>
+      <w:proofErr w:type="spellStart"/>
+      <w:r>
+        <w:t>urself</w:t>
+      </w:r>
+      <w:proofErr w:type="spellEnd"/>
       <w:r>
         <w:t xml:space="preserve">, </w:t>
       </w:r>
@@ -4451,8 +5510,13 @@
         <w:t xml:space="preserve">mf is acting like nothing happened, </w:t>
       </w:r>
       <w:r>
-        <w:t>go fuck urself</w:t>
-      </w:r>
+        <w:t xml:space="preserve">go fuck </w:t>
+      </w:r>
+      <w:proofErr w:type="spellStart"/>
+      <w:r>
+        <w:t>urself</w:t>
+      </w:r>
+      <w:proofErr w:type="spellEnd"/>
     </w:p>
     <w:p>
       <w:r>
@@ -4487,12 +5551,25 @@
         <w:t xml:space="preserve">User 8: this noob ass was bragging about his skill so much and couldn’t even </w:t>
       </w:r>
       <w:r>
-        <w:t>clear a squid repository, bruuuh</w:t>
-      </w:r>
-    </w:p>
-    <w:p>
-      <w:r>
-        <w:t>User 9: secondhand embarrassment from watching u play was insane, I’d actually kms if I were you</w:t>
+        <w:t xml:space="preserve">clear a squid repository, </w:t>
+      </w:r>
+      <w:proofErr w:type="spellStart"/>
+      <w:r>
+        <w:t>bruuuh</w:t>
+      </w:r>
+      <w:proofErr w:type="spellEnd"/>
+    </w:p>
+    <w:p>
+      <w:r>
+        <w:t xml:space="preserve">User 9: secondhand embarrassment from watching u play was insane, I’d </w:t>
+      </w:r>
+      <w:proofErr w:type="gramStart"/>
+      <w:r>
+        <w:t>actually kms</w:t>
+      </w:r>
+      <w:proofErr w:type="gramEnd"/>
+      <w:r>
+        <w:t xml:space="preserve"> if I were you</w:t>
       </w:r>
     </w:p>
     <w:p>
@@ -4511,11 +5588,16 @@
         <w:t xml:space="preserve"> me and calling me bad at the game or something</w:t>
       </w:r>
       <w:r>
-        <w:t xml:space="preserve">, but it’s actually </w:t>
+        <w:t xml:space="preserve">, but it’s </w:t>
+      </w:r>
+      <w:proofErr w:type="gramStart"/>
+      <w:r>
+        <w:t xml:space="preserve">actually </w:t>
       </w:r>
       <w:r>
         <w:t>fine</w:t>
       </w:r>
+      <w:proofErr w:type="gramEnd"/>
       <w:r>
         <w:t>, you just don’t get it</w:t>
       </w:r>
@@ -4537,7 +5619,15 @@
     </w:p>
     <w:p>
       <w:r>
-        <w:t>User 9: ain’t no one f</w:t>
+        <w:t xml:space="preserve">User 9: </w:t>
+      </w:r>
+      <w:proofErr w:type="spellStart"/>
+      <w:r>
+        <w:t>ain’t</w:t>
+      </w:r>
+      <w:proofErr w:type="spellEnd"/>
+      <w:r>
+        <w:t xml:space="preserve"> no one f</w:t>
       </w:r>
       <w:r>
         <w:t xml:space="preserve">ucking </w:t>
@@ -4580,13 +5670,29 @@
     </w:p>
     <w:p>
       <w:r>
-        <w:t xml:space="preserve">User 10: yo, y’all seen the news about delayed </w:t>
+        <w:t xml:space="preserve">User 10: </w:t>
+      </w:r>
+      <w:proofErr w:type="spellStart"/>
+      <w:r>
+        <w:t>yo</w:t>
+      </w:r>
+      <w:proofErr w:type="spellEnd"/>
+      <w:r>
+        <w:t xml:space="preserve">, y’all seen the news about delayed </w:t>
       </w:r>
       <w:r>
         <w:t>zero</w:t>
       </w:r>
       <w:r>
-        <w:t xml:space="preserve"> dlc?</w:t>
+        <w:t xml:space="preserve"> </w:t>
+      </w:r>
+      <w:proofErr w:type="spellStart"/>
+      <w:r>
+        <w:t>dlc</w:t>
+      </w:r>
+      <w:proofErr w:type="spellEnd"/>
+      <w:r>
+        <w:t>?</w:t>
       </w:r>
     </w:p>
     <w:p>
@@ -4609,8 +5715,13 @@
     <w:p>
       <w:r>
         <w:lastRenderedPageBreak/>
-        <w:t>User 3: Zero the game? More like zero dlc</w:t>
-      </w:r>
+        <w:t xml:space="preserve">User 3: Zero the game? More like zero </w:t>
+      </w:r>
+      <w:proofErr w:type="spellStart"/>
+      <w:r>
+        <w:t>dlc</w:t>
+      </w:r>
+      <w:proofErr w:type="spellEnd"/>
     </w:p>
     <w:p>
       <w:r>
@@ -4630,15 +5741,33 @@
         <w:t>spearhead</w:t>
       </w:r>
       <w:r>
-        <w:t xml:space="preserve"> heard us and making smth new for </w:t>
-      </w:r>
+        <w:t xml:space="preserve"> heard us and making </w:t>
+      </w:r>
+      <w:proofErr w:type="spellStart"/>
+      <w:r>
+        <w:t>smth</w:t>
+      </w:r>
+      <w:proofErr w:type="spellEnd"/>
+      <w:r>
+        <w:t xml:space="preserve"> new for </w:t>
+      </w:r>
+      <w:proofErr w:type="spellStart"/>
       <w:r>
         <w:t>cyberdivers</w:t>
       </w:r>
-    </w:p>
-    <w:p>
-      <w:r>
-        <w:t>User 7: this absolutely does not mean that bruh, they just can’t do shit</w:t>
+      <w:proofErr w:type="spellEnd"/>
+    </w:p>
+    <w:p>
+      <w:r>
+        <w:t xml:space="preserve">User 7: this absolutely does not mean that </w:t>
+      </w:r>
+      <w:proofErr w:type="spellStart"/>
+      <w:r>
+        <w:t>bruh</w:t>
+      </w:r>
+      <w:proofErr w:type="spellEnd"/>
+      <w:r>
+        <w:t>, they just can’t do shit</w:t>
       </w:r>
     </w:p>
     <w:p>
@@ -4655,8 +5784,13 @@
         <w:t xml:space="preserve">fans </w:t>
       </w:r>
       <w:r>
-        <w:t>are in shambles rn</w:t>
-      </w:r>
+        <w:t xml:space="preserve">are in shambles </w:t>
+      </w:r>
+      <w:proofErr w:type="spellStart"/>
+      <w:r>
+        <w:t>rn</w:t>
+      </w:r>
+      <w:proofErr w:type="spellEnd"/>
     </w:p>
     <w:p>
       <w:r>
@@ -4668,16 +5802,26 @@
       <w:r>
         <w:t xml:space="preserve"> </w:t>
       </w:r>
-      <w:r>
-        <w:t>ak 4.7.0 buff</w:t>
+      <w:proofErr w:type="spellStart"/>
+      <w:r>
+        <w:t>ak</w:t>
+      </w:r>
+      <w:proofErr w:type="spellEnd"/>
+      <w:r>
+        <w:t xml:space="preserve"> 4.7.0 buff</w:t>
       </w:r>
     </w:p>
     <w:p>
       <w:r>
         <w:t xml:space="preserve">User 11: </w:t>
       </w:r>
-      <w:r>
-        <w:t>ak 4.7.0 is already op</w:t>
+      <w:proofErr w:type="spellStart"/>
+      <w:r>
+        <w:t>ak</w:t>
+      </w:r>
+      <w:proofErr w:type="spellEnd"/>
+      <w:r>
+        <w:t xml:space="preserve"> 4.7.0 is already op</w:t>
       </w:r>
       <w:r>
         <w:t xml:space="preserve">, u </w:t>
@@ -4689,7 +5833,15 @@
         <w:t xml:space="preserve">, I can easily </w:t>
       </w:r>
       <w:r>
-        <w:t>clear bugs source solo with it, maybe with vibe strike stratagem.</w:t>
+        <w:t xml:space="preserve">clear </w:t>
+      </w:r>
+      <w:proofErr w:type="gramStart"/>
+      <w:r>
+        <w:t>bugs source</w:t>
+      </w:r>
+      <w:proofErr w:type="gramEnd"/>
+      <w:r>
+        <w:t xml:space="preserve"> solo with it, maybe with vibe strike stratagem.</w:t>
       </w:r>
     </w:p>
     <w:p>
@@ -4697,7 +5849,23 @@
         <w:t xml:space="preserve">User 9: </w:t>
       </w:r>
       <w:r>
-        <w:t>vibe strike set’s ur teammates on fire, it’s the worst stratagem in the game</w:t>
+        <w:t xml:space="preserve">vibe strike </w:t>
+      </w:r>
+      <w:proofErr w:type="gramStart"/>
+      <w:r>
+        <w:t>set’s</w:t>
+      </w:r>
+      <w:proofErr w:type="gramEnd"/>
+      <w:r>
+        <w:t xml:space="preserve"> </w:t>
+      </w:r>
+      <w:proofErr w:type="spellStart"/>
+      <w:r>
+        <w:t>ur</w:t>
+      </w:r>
+      <w:proofErr w:type="spellEnd"/>
+      <w:r>
+        <w:t xml:space="preserve"> teammates on fire, it’s the worst stratagem in the game</w:t>
       </w:r>
       <w:r>
         <w:t xml:space="preserve">, </w:t>
@@ -4729,8 +5897,13 @@
         <w:t>. Instead of making content and patches</w:t>
       </w:r>
       <w:r>
-        <w:t xml:space="preserve"> for Cyberdivers</w:t>
-      </w:r>
+        <w:t xml:space="preserve"> for </w:t>
+      </w:r>
+      <w:proofErr w:type="spellStart"/>
+      <w:r>
+        <w:t>Cyberdivers</w:t>
+      </w:r>
+      <w:proofErr w:type="spellEnd"/>
       <w:r>
         <w:t>, they decided to make some random ass</w:t>
       </w:r>
@@ -4747,17 +5920,24 @@
         <w:t xml:space="preserve"> and the game wasn’t even that good.</w:t>
       </w:r>
       <w:r>
-        <w:t xml:space="preserve"> And now they are working on the dlc</w:t>
-      </w:r>
+        <w:t xml:space="preserve"> And now they are working on the </w:t>
+      </w:r>
+      <w:proofErr w:type="spellStart"/>
+      <w:r>
+        <w:t>dlc</w:t>
+      </w:r>
+      <w:proofErr w:type="spellEnd"/>
       <w:r>
         <w:t xml:space="preserve"> for it</w:t>
       </w:r>
       <w:r>
         <w:t xml:space="preserve">, while </w:t>
       </w:r>
+      <w:proofErr w:type="spellStart"/>
       <w:r>
         <w:t>cyberdivers</w:t>
       </w:r>
+      <w:proofErr w:type="spellEnd"/>
       <w:r>
         <w:t xml:space="preserve"> </w:t>
       </w:r>
@@ -4787,7 +5967,15 @@
         <w:t xml:space="preserve"> </w:t>
       </w:r>
       <w:r>
-        <w:t>if u can’t use ak 4.7.0 properly</w:t>
+        <w:t xml:space="preserve">if u can’t use </w:t>
+      </w:r>
+      <w:proofErr w:type="spellStart"/>
+      <w:r>
+        <w:t>ak</w:t>
+      </w:r>
+      <w:proofErr w:type="spellEnd"/>
+      <w:r>
+        <w:t xml:space="preserve"> 4.7.0 properly</w:t>
       </w:r>
       <w:r>
         <w:rPr>
@@ -4801,7 +5989,15 @@
     </w:p>
     <w:p>
       <w:r>
-        <w:t>You know what, I wanna check how do they do in their sub. I bet you they are moaning and bitching over there</w:t>
+        <w:t xml:space="preserve">You know what, I </w:t>
+      </w:r>
+      <w:proofErr w:type="spellStart"/>
+      <w:r>
+        <w:t>wanna</w:t>
+      </w:r>
+      <w:proofErr w:type="spellEnd"/>
+      <w:r>
+        <w:t xml:space="preserve"> check how do they do in their sub. I bet you they are moaning and bitching over there</w:t>
       </w:r>
       <w:r>
         <w:t>, because of the delay</w:t>
@@ -4821,20 +6017,52 @@
     </w:p>
     <w:p>
       <w:r>
-        <w:t xml:space="preserve">(User is prompted to search for </w:t>
-      </w:r>
-      <w:r>
-        <w:t>wl3 sub and find the post with the news)</w:t>
-      </w:r>
-    </w:p>
-    <w:p>
-      <w:r>
-        <w:t>(User is going to comments)</w:t>
-      </w:r>
-    </w:p>
-    <w:p>
-      <w:r>
-        <w:t>Bruh what? “Let devs take as much time as they want”, bro wtf, they are so…so…so</w:t>
+        <w:t>(</w:t>
+      </w:r>
+      <w:proofErr w:type="gramStart"/>
+      <w:r>
+        <w:t>User is</w:t>
+      </w:r>
+      <w:proofErr w:type="gramEnd"/>
+      <w:r>
+        <w:t xml:space="preserve"> prompted to search for </w:t>
+      </w:r>
+      <w:r>
+        <w:t xml:space="preserve">wl3 </w:t>
+      </w:r>
+      <w:proofErr w:type="gramStart"/>
+      <w:r>
+        <w:t>sub</w:t>
+      </w:r>
+      <w:proofErr w:type="gramEnd"/>
+      <w:r>
+        <w:t xml:space="preserve"> and find the post with the news)</w:t>
+      </w:r>
+    </w:p>
+    <w:p>
+      <w:r>
+        <w:t xml:space="preserve">(User is going to </w:t>
+      </w:r>
+      <w:proofErr w:type="gramStart"/>
+      <w:r>
+        <w:t>comments</w:t>
+      </w:r>
+      <w:proofErr w:type="gramEnd"/>
+      <w:r>
+        <w:t>)</w:t>
+      </w:r>
+    </w:p>
+    <w:p>
+      <w:r>
+        <w:t xml:space="preserve">Bruh what? “Let </w:t>
+      </w:r>
+      <w:proofErr w:type="spellStart"/>
+      <w:r>
+        <w:t>devs</w:t>
+      </w:r>
+      <w:proofErr w:type="spellEnd"/>
+      <w:r>
+        <w:t xml:space="preserve"> take as much time as they want”, bro wtf, they are so…so…so</w:t>
       </w:r>
       <w:r>
         <w:t xml:space="preserve"> fucking</w:t>
@@ -4853,12 +6081,28 @@
     </w:p>
     <w:p>
       <w:r>
-        <w:t xml:space="preserve">Look at these posts bruh. </w:t>
-      </w:r>
-    </w:p>
-    <w:p>
-      <w:r>
-        <w:t xml:space="preserve">So spineless, like “our dlc got delayed? </w:t>
+        <w:t xml:space="preserve">Look at these posts </w:t>
+      </w:r>
+      <w:proofErr w:type="spellStart"/>
+      <w:r>
+        <w:t>bruh</w:t>
+      </w:r>
+      <w:proofErr w:type="spellEnd"/>
+      <w:r>
+        <w:t xml:space="preserve">. </w:t>
+      </w:r>
+    </w:p>
+    <w:p>
+      <w:r>
+        <w:t xml:space="preserve">So spineless, like “our </w:t>
+      </w:r>
+      <w:proofErr w:type="spellStart"/>
+      <w:r>
+        <w:t>dlc</w:t>
+      </w:r>
+      <w:proofErr w:type="spellEnd"/>
+      <w:r>
+        <w:t xml:space="preserve"> got delayed? </w:t>
       </w:r>
       <w:r>
         <w:t xml:space="preserve">It’s ok, </w:t>
@@ -4867,7 +6111,23 @@
         <w:t>let them take their time</w:t>
       </w:r>
       <w:r>
-        <w:t>” tf is this. You absolutely should demand new content from the devs, they are working for you</w:t>
+        <w:t xml:space="preserve">” </w:t>
+      </w:r>
+      <w:proofErr w:type="spellStart"/>
+      <w:r>
+        <w:t>tf</w:t>
+      </w:r>
+      <w:proofErr w:type="spellEnd"/>
+      <w:r>
+        <w:t xml:space="preserve"> is this. You absolutely should demand new content from the </w:t>
+      </w:r>
+      <w:proofErr w:type="spellStart"/>
+      <w:r>
+        <w:t>devs</w:t>
+      </w:r>
+      <w:proofErr w:type="spellEnd"/>
+      <w:r>
+        <w:t>, they are working for you</w:t>
       </w:r>
       <w:r>
         <w:t>,</w:t>
@@ -4906,7 +6166,15 @@
     <w:p>
       <w:r>
         <w:lastRenderedPageBreak/>
-        <w:t>(User is prompted to go to the post with noob question)</w:t>
+        <w:t xml:space="preserve">(User is prompted to go to the post with noob </w:t>
+      </w:r>
+      <w:proofErr w:type="gramStart"/>
+      <w:r>
+        <w:t>question</w:t>
+      </w:r>
+      <w:proofErr w:type="gramEnd"/>
+      <w:r>
+        <w:t>)</w:t>
       </w:r>
     </w:p>
     <w:p>
@@ -4919,10 +6187,26 @@
         <w:t xml:space="preserve">And these </w:t>
       </w:r>
       <w:r>
-        <w:t xml:space="preserve">stupid ass questions like this one “uhhhhh how do u get in that room” like don’t u see the </w:t>
-      </w:r>
-      <w:r>
-        <w:t xml:space="preserve">vent in there? Have you tried looking or do you just run to this subforum for help at any minor inconvenience? This is why noobs should be mocked for their stupidity, they’ll learn how to think </w:t>
+        <w:t>stupid ass questions like this one “</w:t>
+      </w:r>
+      <w:proofErr w:type="spellStart"/>
+      <w:r>
+        <w:t>uhhhhh</w:t>
+      </w:r>
+      <w:proofErr w:type="spellEnd"/>
+      <w:r>
+        <w:t xml:space="preserve"> how do u get in that room” like don’t u see the </w:t>
+      </w:r>
+      <w:r>
+        <w:t xml:space="preserve">vent in there? Have you tried looking or do you just run to this subforum for help at any minor inconvenience? This is why noobs should be mocked for their </w:t>
+      </w:r>
+      <w:proofErr w:type="gramStart"/>
+      <w:r>
+        <w:t>stupidity,</w:t>
+      </w:r>
+      <w:proofErr w:type="gramEnd"/>
+      <w:r>
+        <w:t xml:space="preserve"> they’ll learn how to think </w:t>
       </w:r>
       <w:r>
         <w:t>by themselves</w:t>
@@ -4959,7 +6243,15 @@
     </w:p>
     <w:p>
       <w:r>
-        <w:t xml:space="preserve">Oh boy, look how nice everyone here is bruh. Look how everyone being respectful to each other, like isn’t it fucking pathetic? There is either right opinion </w:t>
+        <w:t xml:space="preserve">Oh boy, look how nice everyone here is </w:t>
+      </w:r>
+      <w:proofErr w:type="spellStart"/>
+      <w:r>
+        <w:t>bruh</w:t>
+      </w:r>
+      <w:proofErr w:type="spellEnd"/>
+      <w:r>
+        <w:t xml:space="preserve">. Look how everyone being respectful to each other, like isn’t it fucking pathetic? There is either right opinion </w:t>
       </w:r>
       <w:r>
         <w:t xml:space="preserve">or wrong opinion, nothing in between. If y’all being so polite and </w:t>
@@ -4974,7 +6266,23 @@
         <w:t>arguing</w:t>
       </w:r>
       <w:r>
-        <w:t xml:space="preserve">, how tf are you gonna </w:t>
+        <w:t xml:space="preserve">, how </w:t>
+      </w:r>
+      <w:proofErr w:type="spellStart"/>
+      <w:r>
+        <w:t>tf</w:t>
+      </w:r>
+      <w:proofErr w:type="spellEnd"/>
+      <w:r>
+        <w:t xml:space="preserve"> are you </w:t>
+      </w:r>
+      <w:proofErr w:type="spellStart"/>
+      <w:r>
+        <w:t>gonna</w:t>
+      </w:r>
+      <w:proofErr w:type="spellEnd"/>
+      <w:r>
+        <w:t xml:space="preserve"> </w:t>
       </w:r>
       <w:r>
         <w:t>figure out what’s wrong and what’s right</w:t>
@@ -5009,24 +6317,33 @@
       <w:r>
         <w:t xml:space="preserve"> being so nice </w:t>
       </w:r>
+      <w:proofErr w:type="gramStart"/>
       <w:r>
         <w:t>like</w:t>
       </w:r>
+      <w:proofErr w:type="gramEnd"/>
       <w:r>
         <w:t xml:space="preserve"> we</w:t>
       </w:r>
       <w:r>
-        <w:t xml:space="preserve"> are gonna</w:t>
-      </w:r>
+        <w:t xml:space="preserve"> are </w:t>
+      </w:r>
+      <w:proofErr w:type="spellStart"/>
+      <w:r>
+        <w:t>gonna</w:t>
+      </w:r>
+      <w:proofErr w:type="spellEnd"/>
       <w:r>
         <w:t xml:space="preserve"> believe it</w:t>
       </w:r>
       <w:r>
         <w:t xml:space="preserve">. Maybe </w:t>
       </w:r>
+      <w:proofErr w:type="spellStart"/>
       <w:r>
         <w:t>cyberdivers</w:t>
       </w:r>
+      <w:proofErr w:type="spellEnd"/>
       <w:r>
         <w:t xml:space="preserve"> are rude, maybe we are toxic</w:t>
       </w:r>
@@ -5043,8 +6360,13 @@
         <w:t xml:space="preserve"> asshole, moron, retard, fuckwit, dumbass, braindead, stupid, dickhead</w:t>
       </w:r>
       <w:r>
-        <w:t>, room temperature iq</w:t>
-      </w:r>
+        <w:t xml:space="preserve">, room temperature </w:t>
+      </w:r>
+      <w:proofErr w:type="spellStart"/>
+      <w:r>
+        <w:t>iq</w:t>
+      </w:r>
+      <w:proofErr w:type="spellEnd"/>
       <w:r>
         <w:t xml:space="preserve"> imbecile,</w:t>
       </w:r>
@@ -5052,7 +6374,15 @@
         <w:t xml:space="preserve"> </w:t>
       </w:r>
       <w:r>
-        <w:t xml:space="preserve">motherfucker, fatherfucker, </w:t>
+        <w:t xml:space="preserve">motherfucker, </w:t>
+      </w:r>
+      <w:proofErr w:type="spellStart"/>
+      <w:r>
+        <w:t>fatherfucker</w:t>
+      </w:r>
+      <w:proofErr w:type="spellEnd"/>
+      <w:r>
+        <w:t xml:space="preserve">, </w:t>
       </w:r>
       <w:r>
         <w:t xml:space="preserve">product of the </w:t>
@@ -5074,13 +6404,23 @@
     </w:p>
     <w:p>
       <w:r>
-        <w:t>fuckface, shitfuck</w:t>
-      </w:r>
+        <w:t xml:space="preserve">fuckface, </w:t>
+      </w:r>
+      <w:proofErr w:type="spellStart"/>
+      <w:r>
+        <w:t>shitfuck</w:t>
+      </w:r>
+      <w:proofErr w:type="spellEnd"/>
       <w:r>
         <w:t xml:space="preserve">, </w:t>
       </w:r>
-      <w:r>
-        <w:t>fuckfuck but</w:t>
+      <w:proofErr w:type="spellStart"/>
+      <w:r>
+        <w:t>fuckfuck</w:t>
+      </w:r>
+      <w:proofErr w:type="spellEnd"/>
+      <w:r>
+        <w:t xml:space="preserve"> but</w:t>
       </w:r>
       <w:r>
         <w:t xml:space="preserve"> at least we are honest</w:t>
@@ -5107,7 +6447,15 @@
     </w:p>
     <w:p>
       <w:r>
-        <w:t>(Ui elements start to fall down)</w:t>
+        <w:t xml:space="preserve">(Ui elements start to </w:t>
+      </w:r>
+      <w:proofErr w:type="gramStart"/>
+      <w:r>
+        <w:t>fall down</w:t>
+      </w:r>
+      <w:proofErr w:type="gramEnd"/>
+      <w:r>
+        <w:t>)</w:t>
       </w:r>
     </w:p>
     <w:p>
@@ -5130,7 +6478,23 @@
         <w:t xml:space="preserve"> </w:t>
       </w:r>
       <w:r>
-        <w:t>and I learned smth about webdev and some cybersecurity stuff</w:t>
+        <w:t xml:space="preserve">and I learned </w:t>
+      </w:r>
+      <w:proofErr w:type="spellStart"/>
+      <w:r>
+        <w:t>smth</w:t>
+      </w:r>
+      <w:proofErr w:type="spellEnd"/>
+      <w:r>
+        <w:t xml:space="preserve"> about </w:t>
+      </w:r>
+      <w:proofErr w:type="spellStart"/>
+      <w:r>
+        <w:t>webdev</w:t>
+      </w:r>
+      <w:proofErr w:type="spellEnd"/>
+      <w:r>
+        <w:t xml:space="preserve"> and some cybersecurity stuff</w:t>
       </w:r>
       <w:r>
         <w:t>, like phishing</w:t>
@@ -5145,7 +6509,15 @@
         <w:t>thought</w:t>
       </w:r>
       <w:r>
-        <w:t xml:space="preserve"> I was kinda weird. Well, whatever, who gives a shit right? </w:t>
+        <w:t xml:space="preserve"> I was </w:t>
+      </w:r>
+      <w:proofErr w:type="spellStart"/>
+      <w:r>
+        <w:t>kinda</w:t>
+      </w:r>
+      <w:proofErr w:type="spellEnd"/>
+      <w:r>
+        <w:t xml:space="preserve"> weird. Well, whatever, who gives a shit right? </w:t>
       </w:r>
     </w:p>
     <w:p>
@@ -5213,9 +6585,11 @@
       <w:r>
         <w:t xml:space="preserve">in </w:t>
       </w:r>
+      <w:proofErr w:type="spellStart"/>
       <w:r>
         <w:t>cyberdivers</w:t>
       </w:r>
+      <w:proofErr w:type="spellEnd"/>
       <w:r>
         <w:t xml:space="preserve"> chat</w:t>
       </w:r>
@@ -5250,8 +6624,21 @@
       </w:r>
     </w:p>
     <w:p>
-      <w:r>
-        <w:t xml:space="preserve">Main_hero: I’m gonna hack </w:t>
+      <w:proofErr w:type="spellStart"/>
+      <w:r>
+        <w:t>Main_hero</w:t>
+      </w:r>
+      <w:proofErr w:type="spellEnd"/>
+      <w:r>
+        <w:t xml:space="preserve">: I’m </w:t>
+      </w:r>
+      <w:proofErr w:type="spellStart"/>
+      <w:r>
+        <w:t>gonna</w:t>
+      </w:r>
+      <w:proofErr w:type="spellEnd"/>
+      <w:r>
+        <w:t xml:space="preserve"> hack </w:t>
       </w:r>
       <w:r>
         <w:t>zero</w:t>
@@ -5277,8 +6664,13 @@
     </w:p>
     <w:p>
       <w:r>
-        <w:t>User 4: ahahahah</w:t>
-      </w:r>
+        <w:t xml:space="preserve">User 4: </w:t>
+      </w:r>
+      <w:proofErr w:type="spellStart"/>
+      <w:r>
+        <w:t>ahahahah</w:t>
+      </w:r>
+      <w:proofErr w:type="spellEnd"/>
     </w:p>
     <w:p>
       <w:r>
@@ -5292,7 +6684,15 @@
     </w:p>
     <w:p>
       <w:r>
-        <w:t>User 6: u can’t even use a keyboard son fym hack</w:t>
+        <w:t xml:space="preserve">User 6: u can’t even use a keyboard son </w:t>
+      </w:r>
+      <w:proofErr w:type="spellStart"/>
+      <w:r>
+        <w:t>fym</w:t>
+      </w:r>
+      <w:proofErr w:type="spellEnd"/>
+      <w:r>
+        <w:t xml:space="preserve"> hack</w:t>
       </w:r>
     </w:p>
     <w:p>
@@ -5311,37 +6711,81 @@
       </w:r>
     </w:p>
     <w:p>
-      <w:r>
-        <w:t>Main_hero: nah y’all will see, I actually can do it</w:t>
-      </w:r>
-    </w:p>
-    <w:p>
-      <w:r>
-        <w:t>User 4: bro</w:t>
-      </w:r>
-      <w:r>
-        <w:t>chacho stfu</w:t>
-      </w:r>
-    </w:p>
-    <w:p>
-      <w:r>
-        <w:t>User 6: im crying wtf are u talking about lmaooo</w:t>
-      </w:r>
+      <w:proofErr w:type="spellStart"/>
+      <w:r>
+        <w:t>Main_hero</w:t>
+      </w:r>
+      <w:proofErr w:type="spellEnd"/>
+      <w:r>
+        <w:t xml:space="preserve">: nah y’all will see, I </w:t>
+      </w:r>
+      <w:proofErr w:type="gramStart"/>
+      <w:r>
+        <w:t>actually can</w:t>
+      </w:r>
+      <w:proofErr w:type="gramEnd"/>
+      <w:r>
+        <w:t xml:space="preserve"> do it</w:t>
+      </w:r>
+    </w:p>
+    <w:p>
+      <w:r>
+        <w:t xml:space="preserve">User 4: </w:t>
+      </w:r>
+      <w:proofErr w:type="spellStart"/>
+      <w:r>
+        <w:t>bro</w:t>
+      </w:r>
+      <w:r>
+        <w:t>chacho</w:t>
+      </w:r>
+      <w:proofErr w:type="spellEnd"/>
+      <w:r>
+        <w:t xml:space="preserve"> stfu</w:t>
+      </w:r>
+    </w:p>
+    <w:p>
+      <w:r>
+        <w:t xml:space="preserve">User 6: </w:t>
+      </w:r>
+      <w:proofErr w:type="spellStart"/>
+      <w:r>
+        <w:t>im</w:t>
+      </w:r>
+      <w:proofErr w:type="spellEnd"/>
+      <w:r>
+        <w:t xml:space="preserve"> crying wtf are u talking about </w:t>
+      </w:r>
+      <w:proofErr w:type="spellStart"/>
+      <w:r>
+        <w:t>lmaooo</w:t>
+      </w:r>
+      <w:proofErr w:type="spellEnd"/>
     </w:p>
     <w:p>
       <w:r>
         <w:t xml:space="preserve">User 5: u r like in the top 10 worst </w:t>
       </w:r>
+      <w:proofErr w:type="spellStart"/>
       <w:r>
         <w:t>cyberdivers</w:t>
       </w:r>
+      <w:proofErr w:type="spellEnd"/>
       <w:r>
         <w:t xml:space="preserve"> oat and u r saying u can hack anything? Bruh wtf</w:t>
       </w:r>
     </w:p>
     <w:p>
       <w:r>
-        <w:t>User 13: instant cyberdivers classic</w:t>
+        <w:t xml:space="preserve">User 13: instant </w:t>
+      </w:r>
+      <w:proofErr w:type="spellStart"/>
+      <w:r>
+        <w:t>cyberdivers</w:t>
+      </w:r>
+      <w:proofErr w:type="spellEnd"/>
+      <w:r>
+        <w:t xml:space="preserve"> classic</w:t>
       </w:r>
     </w:p>
     <w:p>
@@ -5354,12 +6798,36 @@
     </w:p>
     <w:p>
       <w:r>
-        <w:t>User 10: bro is a poser lmao, proly don’t even know what is sqli is lol</w:t>
-      </w:r>
-    </w:p>
-    <w:p>
-      <w:r>
-        <w:t xml:space="preserve">No no, I know what it is, it’s a language…for hacking databases…or something. </w:t>
+        <w:t xml:space="preserve">User 10: bro is a poser lmao, </w:t>
+      </w:r>
+      <w:proofErr w:type="spellStart"/>
+      <w:r>
+        <w:t>proly</w:t>
+      </w:r>
+      <w:proofErr w:type="spellEnd"/>
+      <w:r>
+        <w:t xml:space="preserve"> don’t even know what is </w:t>
+      </w:r>
+      <w:proofErr w:type="spellStart"/>
+      <w:r>
+        <w:t>sqli</w:t>
+      </w:r>
+      <w:proofErr w:type="spellEnd"/>
+      <w:r>
+        <w:t xml:space="preserve"> is lol</w:t>
+      </w:r>
+    </w:p>
+    <w:p>
+      <w:r>
+        <w:t xml:space="preserve">No </w:t>
+      </w:r>
+      <w:proofErr w:type="spellStart"/>
+      <w:r>
+        <w:t>no</w:t>
+      </w:r>
+      <w:proofErr w:type="spellEnd"/>
+      <w:r>
+        <w:t xml:space="preserve">, I know what it is, it’s a language…for hacking databases…or something. </w:t>
       </w:r>
       <w:r>
         <w:t>It doesn’t</w:t>
@@ -5386,7 +6854,15 @@
     <w:p>
       <w:r>
         <w:lastRenderedPageBreak/>
-        <w:t xml:space="preserve">Alright, I need a plan. How am I gonna do that? Brief search on phishing shows that </w:t>
+        <w:t xml:space="preserve">Alright, I need a plan. How am I </w:t>
+      </w:r>
+      <w:proofErr w:type="spellStart"/>
+      <w:r>
+        <w:t>gonna</w:t>
+      </w:r>
+      <w:proofErr w:type="spellEnd"/>
+      <w:r>
+        <w:t xml:space="preserve"> do that? Brief search on phishing shows that </w:t>
       </w:r>
       <w:r>
         <w:t>hackers send fake login screens and people fall for them. Why don’t I do the same</w:t>
@@ -5395,14 +6871,37 @@
         <w:t xml:space="preserve">? </w:t>
       </w:r>
       <w:r>
-        <w:t>Admin will click on the link and…well yeah, he’ll probably suspect something. Well, ummm…maybee</w:t>
-      </w:r>
+        <w:t xml:space="preserve">Admin will click on the link and…well yeah, he’ll probably suspect something. Well, </w:t>
+      </w:r>
+      <w:proofErr w:type="spellStart"/>
+      <w:r>
+        <w:t>ummm</w:t>
+      </w:r>
+      <w:proofErr w:type="spellEnd"/>
+      <w:r>
+        <w:t>…</w:t>
+      </w:r>
+      <w:proofErr w:type="spellStart"/>
+      <w:r>
+        <w:t>maybee</w:t>
+      </w:r>
+      <w:proofErr w:type="spellEnd"/>
       <w:r>
         <w:t xml:space="preserve"> </w:t>
       </w:r>
       <w:r>
-        <w:t>…uhhh..</w:t>
-      </w:r>
+        <w:t>…</w:t>
+      </w:r>
+      <w:proofErr w:type="spellStart"/>
+      <w:proofErr w:type="gramStart"/>
+      <w:r>
+        <w:t>uhhh</w:t>
+      </w:r>
+      <w:proofErr w:type="spellEnd"/>
+      <w:r>
+        <w:t>..</w:t>
+      </w:r>
+      <w:proofErr w:type="gramEnd"/>
       <w:r>
         <w:t xml:space="preserve"> </w:t>
       </w:r>
@@ -5424,7 +6923,15 @@
     </w:p>
     <w:p>
       <w:r>
-        <w:t>Yeah, that is fucking retarded, this is never gonna work, this is like the stupidest thing ever I could suggest.</w:t>
+        <w:t xml:space="preserve">Yeah, that is fucking retarded, this is never </w:t>
+      </w:r>
+      <w:proofErr w:type="spellStart"/>
+      <w:r>
+        <w:t>gonna</w:t>
+      </w:r>
+      <w:proofErr w:type="spellEnd"/>
+      <w:r>
+        <w:t xml:space="preserve"> work, this is like the stupidest thing ever I could suggest.</w:t>
       </w:r>
     </w:p>
     <w:p>
@@ -5434,7 +6941,15 @@
     </w:p>
     <w:p>
       <w:r>
-        <w:t>(Chat window appears with message from main_hero about the post)</w:t>
+        <w:t xml:space="preserve">(Chat window appears with message from </w:t>
+      </w:r>
+      <w:proofErr w:type="spellStart"/>
+      <w:r>
+        <w:t>main_hero</w:t>
+      </w:r>
+      <w:proofErr w:type="spellEnd"/>
+      <w:r>
+        <w:t xml:space="preserve"> about the post)</w:t>
       </w:r>
     </w:p>
     <w:p>
@@ -5461,11 +6976,16 @@
     </w:p>
     <w:p>
       <w:r>
-        <w:t>(Fake post appear</w:t>
+        <w:t xml:space="preserve">(Fake </w:t>
+      </w:r>
+      <w:proofErr w:type="gramStart"/>
+      <w:r>
+        <w:t>post appear</w:t>
       </w:r>
       <w:r>
         <w:t>s</w:t>
       </w:r>
+      <w:proofErr w:type="gramEnd"/>
       <w:r>
         <w:t>)</w:t>
       </w:r>
@@ -5482,7 +7002,15 @@
     </w:p>
     <w:p>
       <w:r>
-        <w:t xml:space="preserve">and suddenly it takes him to fake login screen with message like ur </w:t>
+        <w:t xml:space="preserve">and suddenly it takes him to fake login screen with message like </w:t>
+      </w:r>
+      <w:proofErr w:type="spellStart"/>
+      <w:r>
+        <w:t>ur</w:t>
+      </w:r>
+      <w:proofErr w:type="spellEnd"/>
+      <w:r>
+        <w:t xml:space="preserve"> </w:t>
       </w:r>
       <w:r>
         <w:t>session</w:t>
@@ -5493,7 +7021,15 @@
     </w:p>
     <w:p>
       <w:r>
-        <w:t xml:space="preserve">(Login screen appears, with the message “ur </w:t>
+        <w:t>(Login screen appears, with the message “</w:t>
+      </w:r>
+      <w:proofErr w:type="spellStart"/>
+      <w:r>
+        <w:t>ur</w:t>
+      </w:r>
+      <w:proofErr w:type="spellEnd"/>
+      <w:r>
+        <w:t xml:space="preserve"> </w:t>
       </w:r>
       <w:r>
         <w:t>session</w:t>
@@ -5521,7 +7057,15 @@
     </w:p>
     <w:p>
       <w:r>
-        <w:t>(User is prompted to login and forwarded to page where the post is deleted)</w:t>
+        <w:t xml:space="preserve">(User is prompted to login and </w:t>
+      </w:r>
+      <w:proofErr w:type="gramStart"/>
+      <w:r>
+        <w:t>forwarded</w:t>
+      </w:r>
+      <w:proofErr w:type="gramEnd"/>
+      <w:r>
+        <w:t xml:space="preserve"> to page where the post is deleted)</w:t>
       </w:r>
     </w:p>
     <w:p>
@@ -5553,7 +7097,15 @@
     </w:p>
     <w:p>
       <w:r>
-        <w:t>Alright, first I gotta open vim. Fuck IDEs they are for pussies.</w:t>
+        <w:t xml:space="preserve">Alright, first I </w:t>
+      </w:r>
+      <w:proofErr w:type="spellStart"/>
+      <w:r>
+        <w:t>gotta</w:t>
+      </w:r>
+      <w:proofErr w:type="spellEnd"/>
+      <w:r>
+        <w:t xml:space="preserve"> open vim. Fuck IDEs they are for pussies.</w:t>
       </w:r>
     </w:p>
     <w:p>
@@ -5563,7 +7115,15 @@
     </w:p>
     <w:p>
       <w:r>
-        <w:t xml:space="preserve">So uhhhhh, how do I create a page? I </w:t>
+        <w:t xml:space="preserve">So </w:t>
+      </w:r>
+      <w:proofErr w:type="spellStart"/>
+      <w:r>
+        <w:t>uhhhhh</w:t>
+      </w:r>
+      <w:proofErr w:type="spellEnd"/>
+      <w:r>
+        <w:t xml:space="preserve">, how do I create a page? I </w:t>
       </w:r>
       <w:r>
         <w:t>think I still remember something.</w:t>
@@ -5571,10 +7131,34 @@
     </w:p>
     <w:p>
       <w:r>
-        <w:t>(User is prompted to type the code</w:t>
-      </w:r>
-      <w:r>
-        <w:t xml:space="preserve"> up to the some point. Code is from Post.tsx, but with mistakes</w:t>
+        <w:t>(</w:t>
+      </w:r>
+      <w:proofErr w:type="gramStart"/>
+      <w:r>
+        <w:t>User is</w:t>
+      </w:r>
+      <w:proofErr w:type="gramEnd"/>
+      <w:r>
+        <w:t xml:space="preserve"> prompted to type the code</w:t>
+      </w:r>
+      <w:r>
+        <w:t xml:space="preserve"> up to </w:t>
+      </w:r>
+      <w:proofErr w:type="gramStart"/>
+      <w:r>
+        <w:t>the some</w:t>
+      </w:r>
+      <w:proofErr w:type="gramEnd"/>
+      <w:r>
+        <w:t xml:space="preserve"> point. Code is from </w:t>
+      </w:r>
+      <w:proofErr w:type="spellStart"/>
+      <w:r>
+        <w:t>Post.tsx</w:t>
+      </w:r>
+      <w:proofErr w:type="spellEnd"/>
+      <w:r>
+        <w:t>, but with mistakes</w:t>
       </w:r>
       <w:r>
         <w:t>)</w:t>
@@ -5583,7 +7167,15 @@
     <w:p>
       <w:r>
         <w:lastRenderedPageBreak/>
-        <w:t xml:space="preserve">Ok, I actually forgot everything. I don’t think this even works. </w:t>
+        <w:t xml:space="preserve">Ok, I </w:t>
+      </w:r>
+      <w:proofErr w:type="gramStart"/>
+      <w:r>
+        <w:t>actually forgot</w:t>
+      </w:r>
+      <w:proofErr w:type="gramEnd"/>
+      <w:r>
+        <w:t xml:space="preserve"> everything. I don’t think this even works. </w:t>
       </w:r>
     </w:p>
     <w:p>
@@ -5606,32 +7198,71 @@
       </w:r>
     </w:p>
     <w:p>
+      <w:proofErr w:type="spellStart"/>
       <w:r>
         <w:t>Aight</w:t>
       </w:r>
+      <w:proofErr w:type="spellEnd"/>
       <w:r>
         <w:t>…this goes here…</w:t>
       </w:r>
     </w:p>
     <w:p>
       <w:r>
-        <w:t>And first page done!</w:t>
-      </w:r>
-    </w:p>
-    <w:p>
-      <w:r>
-        <w:t>(Main_hero tries to exit vim)</w:t>
-      </w:r>
-    </w:p>
-    <w:p>
-      <w:r>
-        <w:t>Ok, how do I?...fuck..uhhh…I forgot again</w:t>
+        <w:t xml:space="preserve">And first page </w:t>
+      </w:r>
+      <w:proofErr w:type="gramStart"/>
+      <w:r>
+        <w:t>done</w:t>
+      </w:r>
+      <w:proofErr w:type="gramEnd"/>
+      <w:r>
+        <w:t>!</w:t>
+      </w:r>
+    </w:p>
+    <w:p>
+      <w:r>
+        <w:t>(</w:t>
+      </w:r>
+      <w:proofErr w:type="spellStart"/>
+      <w:r>
+        <w:t>Main_hero</w:t>
+      </w:r>
+      <w:proofErr w:type="spellEnd"/>
+      <w:r>
+        <w:t xml:space="preserve"> tries to exit vim)</w:t>
+      </w:r>
+    </w:p>
+    <w:p>
+      <w:r>
+        <w:t xml:space="preserve">Ok, how do </w:t>
+      </w:r>
+      <w:proofErr w:type="gramStart"/>
+      <w:r>
+        <w:t>I?...fuck..</w:t>
+      </w:r>
+      <w:proofErr w:type="spellStart"/>
+      <w:proofErr w:type="gramEnd"/>
+      <w:r>
+        <w:t>uhhh</w:t>
+      </w:r>
+      <w:proofErr w:type="spellEnd"/>
+      <w:r>
+        <w:t>…I forgot again</w:t>
       </w:r>
       <w:r>
         <w:t>…fucking dumbass</w:t>
       </w:r>
       <w:r>
-        <w:t>…uhhhh…here it is</w:t>
+        <w:t>…</w:t>
+      </w:r>
+      <w:proofErr w:type="spellStart"/>
+      <w:r>
+        <w:t>uhhhh</w:t>
+      </w:r>
+      <w:proofErr w:type="spellEnd"/>
+      <w:r>
+        <w:t>…here it is</w:t>
       </w:r>
       <w:r>
         <w:t>.</w:t>
@@ -5673,7 +7304,15 @@
     </w:p>
     <w:p>
       <w:r>
-        <w:t>(Some time later)</w:t>
+        <w:t>(</w:t>
+      </w:r>
+      <w:proofErr w:type="spellStart"/>
+      <w:r>
+        <w:t>Some time</w:t>
+      </w:r>
+      <w:proofErr w:type="spellEnd"/>
+      <w:r>
+        <w:t xml:space="preserve"> later)</w:t>
       </w:r>
     </w:p>
     <w:p>
@@ -5682,13 +7321,42 @@
       </w:r>
     </w:p>
     <w:p>
-      <w:r>
-        <w:t>Aaaand im done! Now I just need to trick sillygoose228</w:t>
-      </w:r>
-    </w:p>
-    <w:p>
-      <w:r>
-        <w:t>(Screen goes to main_hero’s profile page. User is prompted to search for sillygoose228 nickname)</w:t>
+      <w:proofErr w:type="spellStart"/>
+      <w:r>
+        <w:t>Aaaand</w:t>
+      </w:r>
+      <w:proofErr w:type="spellEnd"/>
+      <w:r>
+        <w:t xml:space="preserve"> </w:t>
+      </w:r>
+      <w:proofErr w:type="spellStart"/>
+      <w:r>
+        <w:t>im</w:t>
+      </w:r>
+      <w:proofErr w:type="spellEnd"/>
+      <w:r>
+        <w:t xml:space="preserve"> done! Now I just need to trick sillygoose228</w:t>
+      </w:r>
+    </w:p>
+    <w:p>
+      <w:r>
+        <w:t xml:space="preserve">(Screen goes to </w:t>
+      </w:r>
+      <w:proofErr w:type="spellStart"/>
+      <w:r>
+        <w:t>main_hero’s</w:t>
+      </w:r>
+      <w:proofErr w:type="spellEnd"/>
+      <w:r>
+        <w:t xml:space="preserve"> profile page. </w:t>
+      </w:r>
+      <w:proofErr w:type="gramStart"/>
+      <w:r>
+        <w:t>User is</w:t>
+      </w:r>
+      <w:proofErr w:type="gramEnd"/>
+      <w:r>
+        <w:t xml:space="preserve"> prompted to search for sillygoose228 nickname)</w:t>
       </w:r>
     </w:p>
     <w:p>
@@ -5699,7 +7367,23 @@
         <w:t>h</w:t>
       </w:r>
       <w:r>
-        <w:t xml:space="preserve">is name is stupid. Not like mine tho. Main_hero. </w:t>
+        <w:t xml:space="preserve">is name is stupid. Not like mine </w:t>
+      </w:r>
+      <w:proofErr w:type="spellStart"/>
+      <w:r>
+        <w:t>tho</w:t>
+      </w:r>
+      <w:proofErr w:type="spellEnd"/>
+      <w:r>
+        <w:t xml:space="preserve">. </w:t>
+      </w:r>
+      <w:proofErr w:type="spellStart"/>
+      <w:r>
+        <w:t>Main_hero</w:t>
+      </w:r>
+      <w:proofErr w:type="spellEnd"/>
+      <w:r>
+        <w:t xml:space="preserve">. </w:t>
       </w:r>
       <w:r>
         <w:t>You might not see this yet, but my nickname has at least</w:t>
@@ -5750,13 +7434,53 @@
     </w:p>
     <w:p>
       <w:r>
-        <w:t>Ok, so, It ‘ll go like that, uhhh “</w:t>
+        <w:t xml:space="preserve">Ok, so, </w:t>
+      </w:r>
+      <w:proofErr w:type="gramStart"/>
+      <w:r>
+        <w:t>It</w:t>
+      </w:r>
+      <w:proofErr w:type="gramEnd"/>
+      <w:r>
+        <w:t xml:space="preserve"> ‘ll go like that, </w:t>
+      </w:r>
+      <w:proofErr w:type="spellStart"/>
+      <w:r>
+        <w:t>uhhh</w:t>
+      </w:r>
+      <w:proofErr w:type="spellEnd"/>
+      <w:r>
+        <w:t xml:space="preserve"> “</w:t>
       </w:r>
       <w:r>
         <w:t>D</w:t>
       </w:r>
       <w:r>
-        <w:t>ear sillygoose228, it came to my attention that- no who the fuck reports posts like that? “Dear sillygoose228, there is a post I want you to look at- nah it sounds so stupid, he’ll definitely catch me. No, I need to go simple, like “Dear sillygoose228, look at this post”- Nooo why “dear”? We haven’t even met. No, I need to be plain and direct</w:t>
+        <w:t xml:space="preserve">ear sillygoose228, it came to my attention that- </w:t>
+      </w:r>
+      <w:proofErr w:type="spellStart"/>
+      <w:r>
+        <w:t>no</w:t>
+      </w:r>
+      <w:proofErr w:type="spellEnd"/>
+      <w:r>
+        <w:t xml:space="preserve"> who the fuck reports posts like that? “Dear sillygoose228, there is a post I want you to look at- nah it sounds so stupid, he’ll </w:t>
+      </w:r>
+      <w:proofErr w:type="gramStart"/>
+      <w:r>
+        <w:t>definitely catch</w:t>
+      </w:r>
+      <w:proofErr w:type="gramEnd"/>
+      <w:r>
+        <w:t xml:space="preserve"> me. No, I need to go simple, like “Dear sillygoose228, look at this post”- </w:t>
+      </w:r>
+      <w:proofErr w:type="spellStart"/>
+      <w:r>
+        <w:t>Nooo</w:t>
+      </w:r>
+      <w:proofErr w:type="spellEnd"/>
+      <w:r>
+        <w:t xml:space="preserve"> why “dear”? We haven’t even met. No, I need to be plain and direct</w:t>
       </w:r>
       <w:r>
         <w:t xml:space="preserve"> like</w:t>
@@ -5770,8 +7494,13 @@
       <w:r>
         <w:t xml:space="preserve">it </w:t>
       </w:r>
-      <w:r>
-        <w:t>definitely won’t arouse suspicion</w:t>
+      <w:proofErr w:type="gramStart"/>
+      <w:r>
+        <w:t>definitely won’t</w:t>
+      </w:r>
+      <w:proofErr w:type="gramEnd"/>
+      <w:r>
+        <w:t xml:space="preserve"> arouse suspicion</w:t>
       </w:r>
       <w:r>
         <w:t>!</w:t>
@@ -5783,8 +7512,13 @@
       </w:r>
     </w:p>
     <w:p>
-      <w:r>
-        <w:t xml:space="preserve">Main_hero: </w:t>
+      <w:proofErr w:type="spellStart"/>
+      <w:r>
+        <w:t>Main_hero</w:t>
+      </w:r>
+      <w:proofErr w:type="spellEnd"/>
+      <w:r>
+        <w:t xml:space="preserve">: </w:t>
       </w:r>
       <w:r>
         <w:rPr>
@@ -5795,11 +7529,16 @@
     </w:p>
     <w:p>
       <w:r>
-        <w:t>Sillygoose228:</w:t>
+        <w:t>Sillygoose</w:t>
+      </w:r>
+      <w:proofErr w:type="gramStart"/>
+      <w:r>
+        <w:t>228:</w:t>
       </w:r>
       <w:r>
         <w:t>?</w:t>
       </w:r>
+      <w:proofErr w:type="gramEnd"/>
     </w:p>
     <w:p>
       <w:r>
@@ -5819,18 +7558,41 @@
       </w:r>
     </w:p>
     <w:p>
-      <w:r>
-        <w:t>Main_hero: it’s the post from ur sub</w:t>
-      </w:r>
-    </w:p>
-    <w:p>
-      <w:r>
-        <w:t>Main_hero: I’m reporting it</w:t>
-      </w:r>
-    </w:p>
-    <w:p>
-      <w:r>
-        <w:t xml:space="preserve">Main_hero: like a </w:t>
+      <w:proofErr w:type="spellStart"/>
+      <w:r>
+        <w:t>Main_hero</w:t>
+      </w:r>
+      <w:proofErr w:type="spellEnd"/>
+      <w:r>
+        <w:t xml:space="preserve">: it’s the post from </w:t>
+      </w:r>
+      <w:proofErr w:type="spellStart"/>
+      <w:r>
+        <w:t>ur</w:t>
+      </w:r>
+      <w:proofErr w:type="spellEnd"/>
+      <w:r>
+        <w:t xml:space="preserve"> sub</w:t>
+      </w:r>
+    </w:p>
+    <w:p>
+      <w:proofErr w:type="spellStart"/>
+      <w:r>
+        <w:t>Main_hero</w:t>
+      </w:r>
+      <w:proofErr w:type="spellEnd"/>
+      <w:r>
+        <w:t>: I’m reporting it</w:t>
+      </w:r>
+    </w:p>
+    <w:p>
+      <w:proofErr w:type="spellStart"/>
+      <w:r>
+        <w:t>Main_hero</w:t>
+      </w:r>
+      <w:proofErr w:type="spellEnd"/>
+      <w:r>
+        <w:t xml:space="preserve">: like a </w:t>
       </w:r>
       <w:r>
         <w:t>good</w:t>
@@ -5838,9 +7600,11 @@
       <w:r>
         <w:t xml:space="preserve"> </w:t>
       </w:r>
+      <w:proofErr w:type="spellStart"/>
       <w:r>
         <w:t>forumer</w:t>
       </w:r>
+      <w:proofErr w:type="spellEnd"/>
     </w:p>
     <w:p>
       <w:r>
@@ -5852,7 +7616,23 @@
     </w:p>
     <w:p>
       <w:r>
-        <w:t>Sillygoose228: uhhh ok, lemme look at it</w:t>
+        <w:t xml:space="preserve">Sillygoose228: </w:t>
+      </w:r>
+      <w:proofErr w:type="spellStart"/>
+      <w:r>
+        <w:t>uhhh</w:t>
+      </w:r>
+      <w:proofErr w:type="spellEnd"/>
+      <w:r>
+        <w:t xml:space="preserve"> ok, </w:t>
+      </w:r>
+      <w:proofErr w:type="spellStart"/>
+      <w:r>
+        <w:t>lemme</w:t>
+      </w:r>
+      <w:proofErr w:type="spellEnd"/>
+      <w:r>
+        <w:t xml:space="preserve"> look at it</w:t>
       </w:r>
     </w:p>
     <w:p>
@@ -5867,7 +7647,17 @@
     </w:p>
     <w:p>
       <w:r>
-        <w:t>(Every sentence is in it’s own typing box)</w:t>
+        <w:t xml:space="preserve">(Every sentence is in </w:t>
+      </w:r>
+      <w:proofErr w:type="spellStart"/>
+      <w:proofErr w:type="gramStart"/>
+      <w:r>
+        <w:t>it’s</w:t>
+      </w:r>
+      <w:proofErr w:type="spellEnd"/>
+      <w:proofErr w:type="gramEnd"/>
+      <w:r>
+        <w:t xml:space="preserve"> own typing box)</w:t>
       </w:r>
     </w:p>
     <w:p>
@@ -5878,7 +7668,15 @@
         <w:t>should,</w:t>
       </w:r>
       <w:r>
-        <w:t xml:space="preserve"> no? </w:t>
+        <w:t xml:space="preserve"> </w:t>
+      </w:r>
+      <w:proofErr w:type="gramStart"/>
+      <w:r>
+        <w:t>no</w:t>
+      </w:r>
+      <w:proofErr w:type="gramEnd"/>
+      <w:r>
+        <w:t xml:space="preserve">? </w:t>
       </w:r>
     </w:p>
     <w:p>
@@ -5910,7 +7708,23 @@
     </w:p>
     <w:p>
       <w:r>
-        <w:t>I’m fucked, I’m definitely fucked. I need to bail.</w:t>
+        <w:t xml:space="preserve">I’m </w:t>
+      </w:r>
+      <w:proofErr w:type="gramStart"/>
+      <w:r>
+        <w:t>fucked,</w:t>
+      </w:r>
+      <w:proofErr w:type="gramEnd"/>
+      <w:r>
+        <w:t xml:space="preserve"> I’m </w:t>
+      </w:r>
+      <w:proofErr w:type="gramStart"/>
+      <w:r>
+        <w:t>definitely fucked</w:t>
+      </w:r>
+      <w:proofErr w:type="gramEnd"/>
+      <w:r>
+        <w:t>. I need to bail.</w:t>
       </w:r>
     </w:p>
     <w:p>
@@ -5920,12 +7734,28 @@
     </w:p>
     <w:p>
       <w:r>
-        <w:t>(User is prompted to block sillygoose228, but as he reaches for the button, creds pop in the terminal and sillygoose starts typing)</w:t>
-      </w:r>
-    </w:p>
-    <w:p>
-      <w:r>
-        <w:t>Oh, oh shit, I got him! Here his password!</w:t>
+        <w:t xml:space="preserve">(User is prompted to block sillygoose228, but as he reaches for the button, creds pop in the terminal and </w:t>
+      </w:r>
+      <w:proofErr w:type="spellStart"/>
+      <w:r>
+        <w:t>sillygoose</w:t>
+      </w:r>
+      <w:proofErr w:type="spellEnd"/>
+      <w:r>
+        <w:t xml:space="preserve"> starts typing)</w:t>
+      </w:r>
+    </w:p>
+    <w:p>
+      <w:r>
+        <w:t xml:space="preserve">Oh, oh shit, I got him! Here </w:t>
+      </w:r>
+      <w:proofErr w:type="gramStart"/>
+      <w:r>
+        <w:t>his</w:t>
+      </w:r>
+      <w:proofErr w:type="gramEnd"/>
+      <w:r>
+        <w:t xml:space="preserve"> password!</w:t>
       </w:r>
       <w:r>
         <w:t xml:space="preserve"> His password is iwant</w:t>
@@ -5990,7 +7820,17 @@
     <w:p>
       <w:r>
         <w:lastRenderedPageBreak/>
-        <w:t>Even tho I got his creds already, he might realize what’s going on and change his password. I need to convince him it’s ok.</w:t>
+        <w:t xml:space="preserve">Even </w:t>
+      </w:r>
+      <w:proofErr w:type="spellStart"/>
+      <w:proofErr w:type="gramStart"/>
+      <w:r>
+        <w:t>tho</w:t>
+      </w:r>
+      <w:proofErr w:type="spellEnd"/>
+      <w:proofErr w:type="gramEnd"/>
+      <w:r>
+        <w:t xml:space="preserve"> I got his creds already, he might realize what’s going on and change his password. I need to convince him it’s ok.</w:t>
       </w:r>
     </w:p>
     <w:p>
@@ -5999,16 +7839,50 @@
       </w:r>
     </w:p>
     <w:p>
-      <w:r>
-        <w:t>Main_hero: uhhh idk, this user shows as deleted to me already. Maybe The Forum admins already</w:t>
+      <w:proofErr w:type="spellStart"/>
+      <w:r>
+        <w:t>Main_hero</w:t>
+      </w:r>
+      <w:proofErr w:type="spellEnd"/>
+      <w:r>
+        <w:t xml:space="preserve">: </w:t>
+      </w:r>
+      <w:proofErr w:type="spellStart"/>
+      <w:r>
+        <w:t>uhhh</w:t>
+      </w:r>
+      <w:proofErr w:type="spellEnd"/>
+      <w:r>
+        <w:t xml:space="preserve"> idk, this user shows as deleted to me already. Maybe The Forum admins already</w:t>
       </w:r>
       <w:r>
         <w:t xml:space="preserve"> banned this guy, but website doesn’t reflect it yet.</w:t>
       </w:r>
     </w:p>
     <w:p>
-      <w:r>
-        <w:t>Main_hero: yk the forum is really buggy sometimes.</w:t>
+      <w:proofErr w:type="spellStart"/>
+      <w:r>
+        <w:t>Main_hero</w:t>
+      </w:r>
+      <w:proofErr w:type="spellEnd"/>
+      <w:r>
+        <w:t xml:space="preserve">: </w:t>
+      </w:r>
+      <w:proofErr w:type="spellStart"/>
+      <w:r>
+        <w:t>yk</w:t>
+      </w:r>
+      <w:proofErr w:type="spellEnd"/>
+      <w:r>
+        <w:t xml:space="preserve"> the forum is </w:t>
+      </w:r>
+      <w:proofErr w:type="gramStart"/>
+      <w:r>
+        <w:t>really buggy</w:t>
+      </w:r>
+      <w:proofErr w:type="gramEnd"/>
+      <w:r>
+        <w:t xml:space="preserve"> sometimes.</w:t>
       </w:r>
     </w:p>
     <w:p>
@@ -6054,7 +7928,17 @@
     </w:p>
     <w:p>
       <w:r>
-        <w:t>(Every sentence is in it’s own typing box)</w:t>
+        <w:t xml:space="preserve">(Every sentence is in </w:t>
+      </w:r>
+      <w:proofErr w:type="spellStart"/>
+      <w:proofErr w:type="gramStart"/>
+      <w:r>
+        <w:t>it’s</w:t>
+      </w:r>
+      <w:proofErr w:type="spellEnd"/>
+      <w:proofErr w:type="gramEnd"/>
+      <w:r>
+        <w:t xml:space="preserve"> own typing box)</w:t>
       </w:r>
     </w:p>
     <w:p>
@@ -6062,7 +7946,39 @@
         <w:t xml:space="preserve">What is he typing for so long? Fuck, I </w:t>
       </w:r>
       <w:r>
-        <w:t xml:space="preserve">might be burned here. What if he is gonna ask me about how did I find this post? Or why am I reporting it even tho im not even a follower? Shit, I </w:t>
+        <w:t xml:space="preserve">might be burned here. What if he is </w:t>
+      </w:r>
+      <w:proofErr w:type="spellStart"/>
+      <w:r>
+        <w:t>gonna</w:t>
+      </w:r>
+      <w:proofErr w:type="spellEnd"/>
+      <w:r>
+        <w:t xml:space="preserve"> ask me about how did I </w:t>
+      </w:r>
+      <w:proofErr w:type="gramStart"/>
+      <w:r>
+        <w:t>find</w:t>
+      </w:r>
+      <w:proofErr w:type="gramEnd"/>
+      <w:r>
+        <w:t xml:space="preserve"> this post? Or why am I reporting it even </w:t>
+      </w:r>
+      <w:proofErr w:type="spellStart"/>
+      <w:r>
+        <w:t>tho</w:t>
+      </w:r>
+      <w:proofErr w:type="spellEnd"/>
+      <w:r>
+        <w:t xml:space="preserve"> </w:t>
+      </w:r>
+      <w:proofErr w:type="spellStart"/>
+      <w:r>
+        <w:t>im</w:t>
+      </w:r>
+      <w:proofErr w:type="spellEnd"/>
+      <w:r>
+        <w:t xml:space="preserve"> not even a follower? Shit, I </w:t>
       </w:r>
       <w:r>
         <w:t xml:space="preserve">even </w:t>
@@ -6098,8 +8014,13 @@
       <w:r>
         <w:t>…</w:t>
       </w:r>
-      <w:r>
-        <w:t xml:space="preserve">jesus bro </w:t>
+      <w:proofErr w:type="spellStart"/>
+      <w:r>
+        <w:t>jesus</w:t>
+      </w:r>
+      <w:proofErr w:type="spellEnd"/>
+      <w:r>
+        <w:t xml:space="preserve"> bro </w:t>
       </w:r>
       <w:r>
         <w:t>I was losing my shit here</w:t>
@@ -6118,8 +8039,13 @@
       </w:r>
     </w:p>
     <w:p>
-      <w:r>
-        <w:t xml:space="preserve">Main_hero: </w:t>
+      <w:proofErr w:type="spellStart"/>
+      <w:r>
+        <w:t>Main_hero</w:t>
+      </w:r>
+      <w:proofErr w:type="spellEnd"/>
+      <w:r>
+        <w:t xml:space="preserve">: </w:t>
       </w:r>
       <w:r>
         <w:t>for sure</w:t>
@@ -6147,21 +8073,57 @@
     </w:p>
     <w:p>
       <w:r>
-        <w:t xml:space="preserve">And I’m done lol. That’s it, I fucking did it! Now I gotta go back and tell </w:t>
-      </w:r>
+        <w:t xml:space="preserve">And I’m done lol. That’s it, I fucking did it! Now I </w:t>
+      </w:r>
+      <w:proofErr w:type="spellStart"/>
+      <w:r>
+        <w:t>gotta</w:t>
+      </w:r>
+      <w:proofErr w:type="spellEnd"/>
+      <w:r>
+        <w:t xml:space="preserve"> go back and tell </w:t>
+      </w:r>
+      <w:proofErr w:type="spellStart"/>
       <w:r>
         <w:t>cyberdivers</w:t>
       </w:r>
+      <w:proofErr w:type="spellEnd"/>
       <w:r>
         <w:t xml:space="preserve"> I got the keys.</w:t>
       </w:r>
     </w:p>
     <w:p>
       <w:r>
-        <w:t xml:space="preserve">(User is prompted to log out and log in as main_hero and go to the </w:t>
-      </w:r>
-      <w:r>
-        <w:t xml:space="preserve">cyberdivers </w:t>
+        <w:t>(</w:t>
+      </w:r>
+      <w:proofErr w:type="gramStart"/>
+      <w:r>
+        <w:t>User is</w:t>
+      </w:r>
+      <w:proofErr w:type="gramEnd"/>
+      <w:r>
+        <w:t xml:space="preserve"> prompted to log out and log in as </w:t>
+      </w:r>
+      <w:proofErr w:type="spellStart"/>
+      <w:r>
+        <w:t>main_hero</w:t>
+      </w:r>
+      <w:proofErr w:type="spellEnd"/>
+      <w:r>
+        <w:t xml:space="preserve"> and go to </w:t>
+      </w:r>
+      <w:proofErr w:type="gramStart"/>
+      <w:r>
+        <w:t xml:space="preserve">the </w:t>
+      </w:r>
+      <w:proofErr w:type="spellStart"/>
+      <w:r>
+        <w:t>cyberdivers</w:t>
+      </w:r>
+      <w:proofErr w:type="spellEnd"/>
+      <w:proofErr w:type="gramEnd"/>
+      <w:r>
+        <w:t xml:space="preserve"> </w:t>
       </w:r>
       <w:r>
         <w:t>chat)</w:t>
@@ -6174,7 +8136,15 @@
     </w:p>
     <w:p>
       <w:r>
-        <w:t>User 4: bro ts is just too funny</w:t>
+        <w:t xml:space="preserve">User 4: bro </w:t>
+      </w:r>
+      <w:proofErr w:type="spellStart"/>
+      <w:r>
+        <w:t>ts</w:t>
+      </w:r>
+      <w:proofErr w:type="spellEnd"/>
+      <w:r>
+        <w:t xml:space="preserve"> is just too funny</w:t>
       </w:r>
     </w:p>
     <w:p>
@@ -6190,12 +8160,25 @@
     </w:p>
     <w:p>
       <w:r>
-        <w:t xml:space="preserve">User 7: he is actually retarded idk </w:t>
-      </w:r>
-    </w:p>
-    <w:p>
-      <w:r>
-        <w:t xml:space="preserve">Main_hero: I hacked the </w:t>
+        <w:t xml:space="preserve">User 7: he is </w:t>
+      </w:r>
+      <w:proofErr w:type="gramStart"/>
+      <w:r>
+        <w:t>actually retarded</w:t>
+      </w:r>
+      <w:proofErr w:type="gramEnd"/>
+      <w:r>
+        <w:t xml:space="preserve"> idk </w:t>
+      </w:r>
+    </w:p>
+    <w:p>
+      <w:proofErr w:type="spellStart"/>
+      <w:r>
+        <w:t>Main_hero</w:t>
+      </w:r>
+      <w:proofErr w:type="spellEnd"/>
+      <w:r>
+        <w:t xml:space="preserve">: I hacked the </w:t>
       </w:r>
       <w:r>
         <w:t>zero</w:t>
@@ -6205,8 +8188,13 @@
       </w:r>
     </w:p>
     <w:p>
-      <w:r>
-        <w:t>Main_hero: check the admins</w:t>
+      <w:proofErr w:type="spellStart"/>
+      <w:r>
+        <w:t>Main_hero</w:t>
+      </w:r>
+      <w:proofErr w:type="spellEnd"/>
+      <w:r>
+        <w:t>: check the admins</w:t>
       </w:r>
     </w:p>
     <w:p>
@@ -6234,7 +8222,15 @@
     </w:p>
     <w:p>
       <w:r>
-        <w:t>User 3: no way</w:t>
+        <w:t xml:space="preserve">User 3: </w:t>
+      </w:r>
+      <w:proofErr w:type="gramStart"/>
+      <w:r>
+        <w:t>no</w:t>
+      </w:r>
+      <w:proofErr w:type="gramEnd"/>
+      <w:r>
+        <w:t xml:space="preserve"> way</w:t>
       </w:r>
     </w:p>
     <w:p>
@@ -6245,7 +8241,23 @@
         <w:t>’re</w:t>
       </w:r>
       <w:r>
-        <w:t xml:space="preserve"> crazy son of a bitch, you actually did it</w:t>
+        <w:t xml:space="preserve"> crazy son of a </w:t>
+      </w:r>
+      <w:proofErr w:type="gramStart"/>
+      <w:r>
+        <w:t>bitch,</w:t>
+      </w:r>
+      <w:proofErr w:type="gramEnd"/>
+      <w:r>
+        <w:t xml:space="preserve"> you </w:t>
+      </w:r>
+      <w:proofErr w:type="gramStart"/>
+      <w:r>
+        <w:t>actually did</w:t>
+      </w:r>
+      <w:proofErr w:type="gramEnd"/>
+      <w:r>
+        <w:t xml:space="preserve"> it</w:t>
       </w:r>
     </w:p>
     <w:p>
@@ -6265,23 +8277,62 @@
     </w:p>
     <w:p>
       <w:r>
-        <w:t>User 8: of all people it’s main_hero who did that lmaooo</w:t>
-      </w:r>
-    </w:p>
-    <w:p>
-      <w:r>
-        <w:t>Main_hero: fuck yeah, it was me</w:t>
+        <w:t xml:space="preserve">User 8: of all people it’s </w:t>
+      </w:r>
+      <w:proofErr w:type="spellStart"/>
+      <w:r>
+        <w:t>main_hero</w:t>
+      </w:r>
+      <w:proofErr w:type="spellEnd"/>
+      <w:r>
+        <w:t xml:space="preserve"> who did that </w:t>
+      </w:r>
+      <w:proofErr w:type="spellStart"/>
+      <w:r>
+        <w:t>lmaooo</w:t>
+      </w:r>
+      <w:proofErr w:type="spellEnd"/>
+    </w:p>
+    <w:p>
+      <w:proofErr w:type="spellStart"/>
+      <w:r>
+        <w:t>Main_hero</w:t>
+      </w:r>
+      <w:proofErr w:type="spellEnd"/>
+      <w:r>
+        <w:t>: fuck yeah, it was me</w:t>
       </w:r>
       <w:r>
         <w:t>, just simple phishing and social engineering</w:t>
       </w:r>
     </w:p>
     <w:p>
-      <w:r>
-        <w:t>Main_hero: let’s spam whatever we want on this sub, we can do it</w:t>
-      </w:r>
-      <w:r>
-        <w:t>, cuz I have the keys now</w:t>
+      <w:proofErr w:type="spellStart"/>
+      <w:r>
+        <w:t>Main_</w:t>
+      </w:r>
+      <w:proofErr w:type="gramStart"/>
+      <w:r>
+        <w:t>hero</w:t>
+      </w:r>
+      <w:proofErr w:type="spellEnd"/>
+      <w:r>
+        <w:t>:</w:t>
+      </w:r>
+      <w:proofErr w:type="gramEnd"/>
+      <w:r>
+        <w:t xml:space="preserve"> let’s spam whatever we want on this sub, we can do it</w:t>
+      </w:r>
+      <w:r>
+        <w:t xml:space="preserve">, </w:t>
+      </w:r>
+      <w:proofErr w:type="spellStart"/>
+      <w:r>
+        <w:t>cuz</w:t>
+      </w:r>
+      <w:proofErr w:type="spellEnd"/>
+      <w:r>
+        <w:t xml:space="preserve"> I have the keys now</w:t>
       </w:r>
     </w:p>
     <w:p>
@@ -6302,8 +8353,13 @@
     </w:p>
     <w:p>
       <w:r>
-        <w:t>User 6: omw</w:t>
-      </w:r>
+        <w:t xml:space="preserve">User 6: </w:t>
+      </w:r>
+      <w:proofErr w:type="spellStart"/>
+      <w:r>
+        <w:t>omw</w:t>
+      </w:r>
+      <w:proofErr w:type="spellEnd"/>
     </w:p>
     <w:p>
       <w:r>
@@ -6312,12 +8368,28 @@
     </w:p>
     <w:p>
       <w:r>
-        <w:t>User 7: alr why not</w:t>
-      </w:r>
-    </w:p>
-    <w:p>
-      <w:r>
-        <w:t>User 9: hell yeah lmao</w:t>
+        <w:t xml:space="preserve">User 7: </w:t>
+      </w:r>
+      <w:proofErr w:type="spellStart"/>
+      <w:r>
+        <w:t>alr</w:t>
+      </w:r>
+      <w:proofErr w:type="spellEnd"/>
+      <w:r>
+        <w:t xml:space="preserve"> why not</w:t>
+      </w:r>
+    </w:p>
+    <w:p>
+      <w:r>
+        <w:t xml:space="preserve">User 9: </w:t>
+      </w:r>
+      <w:proofErr w:type="gramStart"/>
+      <w:r>
+        <w:t>hell</w:t>
+      </w:r>
+      <w:proofErr w:type="gramEnd"/>
+      <w:r>
+        <w:t xml:space="preserve"> yeah lmao</w:t>
       </w:r>
     </w:p>
     <w:p>
@@ -6327,13 +8399,29 @@
     </w:p>
     <w:p>
       <w:r>
-        <w:t xml:space="preserve">(User is prompted to search for </w:t>
+        <w:t>(</w:t>
+      </w:r>
+      <w:proofErr w:type="gramStart"/>
+      <w:r>
+        <w:t>User is</w:t>
+      </w:r>
+      <w:proofErr w:type="gramEnd"/>
+      <w:r>
+        <w:t xml:space="preserve"> prompted to search for </w:t>
       </w:r>
       <w:r>
         <w:t>zero</w:t>
       </w:r>
       <w:r>
-        <w:t xml:space="preserve"> sub and go there)</w:t>
+        <w:t xml:space="preserve"> </w:t>
+      </w:r>
+      <w:proofErr w:type="gramStart"/>
+      <w:r>
+        <w:t>sub</w:t>
+      </w:r>
+      <w:proofErr w:type="gramEnd"/>
+      <w:r>
+        <w:t xml:space="preserve"> and go there)</w:t>
       </w:r>
     </w:p>
     <w:p>
@@ -6350,7 +8438,15 @@
         <w:t>goated</w:t>
       </w:r>
       <w:r>
-        <w:t xml:space="preserve"> ain’t I? And now people see it too.</w:t>
+        <w:t xml:space="preserve"> </w:t>
+      </w:r>
+      <w:proofErr w:type="spellStart"/>
+      <w:r>
+        <w:t>ain’t</w:t>
+      </w:r>
+      <w:proofErr w:type="spellEnd"/>
+      <w:r>
+        <w:t xml:space="preserve"> I? And now people see it too.</w:t>
       </w:r>
     </w:p>
     <w:p>
@@ -6358,8 +8454,13 @@
         <w:lastRenderedPageBreak/>
         <w:t xml:space="preserve">(User is prompted to go back to </w:t>
       </w:r>
-      <w:r>
-        <w:t xml:space="preserve">cyberdivers </w:t>
+      <w:proofErr w:type="spellStart"/>
+      <w:r>
+        <w:t>cyberdivers</w:t>
+      </w:r>
+      <w:proofErr w:type="spellEnd"/>
+      <w:r>
+        <w:t xml:space="preserve"> </w:t>
       </w:r>
       <w:r>
         <w:t>chat)</w:t>
@@ -6367,49 +8468,130 @@
     </w:p>
     <w:p>
       <w:r>
-        <w:t xml:space="preserve">User 5: nah ts is instant </w:t>
-      </w:r>
+        <w:t xml:space="preserve">User 5: nah </w:t>
+      </w:r>
+      <w:proofErr w:type="spellStart"/>
+      <w:r>
+        <w:t>ts</w:t>
+      </w:r>
+      <w:proofErr w:type="spellEnd"/>
+      <w:r>
+        <w:t xml:space="preserve"> is instant </w:t>
+      </w:r>
+      <w:proofErr w:type="spellStart"/>
       <w:r>
         <w:t>cyberdivers</w:t>
       </w:r>
+      <w:proofErr w:type="spellEnd"/>
       <w:r>
         <w:t xml:space="preserve"> classic</w:t>
       </w:r>
     </w:p>
     <w:p>
-      <w:r>
-        <w:t xml:space="preserve">Main_hero: Ikr? </w:t>
-      </w:r>
-    </w:p>
-    <w:p>
-      <w:r>
-        <w:t>Main_hero: Im fucking legendary for t</w:t>
+      <w:proofErr w:type="spellStart"/>
+      <w:r>
+        <w:t>Main_hero</w:t>
+      </w:r>
+      <w:proofErr w:type="spellEnd"/>
+      <w:r>
+        <w:t xml:space="preserve">: Ikr? </w:t>
+      </w:r>
+    </w:p>
+    <w:p>
+      <w:proofErr w:type="spellStart"/>
+      <w:r>
+        <w:t>Main_hero</w:t>
+      </w:r>
+      <w:proofErr w:type="spellEnd"/>
+      <w:r>
+        <w:t xml:space="preserve">: </w:t>
+      </w:r>
+      <w:proofErr w:type="spellStart"/>
+      <w:r>
+        <w:t>Im</w:t>
+      </w:r>
+      <w:proofErr w:type="spellEnd"/>
+      <w:r>
+        <w:t xml:space="preserve"> fucking legendary for </w:t>
+      </w:r>
+      <w:proofErr w:type="spellStart"/>
+      <w:r>
+        <w:t>t</w:t>
       </w:r>
       <w:r>
         <w:t>s</w:t>
       </w:r>
-      <w:r>
-        <w:t>, idc what y’all say</w:t>
-      </w:r>
-    </w:p>
-    <w:p>
-      <w:r>
-        <w:t>User 2: lowk yeah</w:t>
-      </w:r>
-    </w:p>
-    <w:p>
-      <w:r>
-        <w:t>User 3: inducted in cyberdivers hall of fame</w:t>
-      </w:r>
-    </w:p>
-    <w:p>
-      <w:r>
-        <w:t>User 4: can we make him a mod please mods?</w:t>
-      </w:r>
-    </w:p>
-    <w:p>
-      <w:r>
-        <w:t>User 13: bruh, all he did is just vibe coded some slop and somehow tricked sillygoose228 into clicking on his bullshit</w:t>
+      <w:proofErr w:type="spellEnd"/>
+      <w:r>
+        <w:t xml:space="preserve">, </w:t>
+      </w:r>
+      <w:proofErr w:type="spellStart"/>
+      <w:r>
+        <w:t>idc</w:t>
+      </w:r>
+      <w:proofErr w:type="spellEnd"/>
+      <w:r>
+        <w:t xml:space="preserve"> what y’all say</w:t>
+      </w:r>
+    </w:p>
+    <w:p>
+      <w:r>
+        <w:t xml:space="preserve">User 2: </w:t>
+      </w:r>
+      <w:proofErr w:type="spellStart"/>
+      <w:r>
+        <w:t>lowk</w:t>
+      </w:r>
+      <w:proofErr w:type="spellEnd"/>
+      <w:r>
+        <w:t xml:space="preserve"> yeah</w:t>
+      </w:r>
+    </w:p>
+    <w:p>
+      <w:r>
+        <w:t xml:space="preserve">User 3: inducted in </w:t>
+      </w:r>
+      <w:proofErr w:type="spellStart"/>
+      <w:r>
+        <w:t>cyberdivers</w:t>
+      </w:r>
+      <w:proofErr w:type="spellEnd"/>
+      <w:r>
+        <w:t xml:space="preserve"> hall of fame</w:t>
+      </w:r>
+    </w:p>
+    <w:p>
+      <w:r>
+        <w:t xml:space="preserve">User 4: can we make him a mod please </w:t>
+      </w:r>
+      <w:proofErr w:type="gramStart"/>
+      <w:r>
+        <w:t>mods</w:t>
+      </w:r>
+      <w:proofErr w:type="gramEnd"/>
+      <w:r>
+        <w:t>?</w:t>
+      </w:r>
+    </w:p>
+    <w:p>
+      <w:r>
+        <w:t xml:space="preserve">User 13: </w:t>
+      </w:r>
+      <w:proofErr w:type="spellStart"/>
+      <w:r>
+        <w:t>bruh</w:t>
+      </w:r>
+      <w:proofErr w:type="spellEnd"/>
+      <w:r>
+        <w:t xml:space="preserve">, all he did is just vibe </w:t>
+      </w:r>
+      <w:proofErr w:type="gramStart"/>
+      <w:r>
+        <w:t>coded</w:t>
+      </w:r>
+      <w:proofErr w:type="gramEnd"/>
+      <w:r>
+        <w:t xml:space="preserve"> some slop and somehow tricked sillygoose228 into clicking on his bullshit</w:t>
       </w:r>
     </w:p>
     <w:p>
@@ -6427,8 +8609,13 @@
       <w:r>
         <w:t xml:space="preserve">User 13: </w:t>
       </w:r>
-      <w:r>
-        <w:t>fym mod</w:t>
+      <w:proofErr w:type="spellStart"/>
+      <w:r>
+        <w:t>fym</w:t>
+      </w:r>
+      <w:proofErr w:type="spellEnd"/>
+      <w:r>
+        <w:t xml:space="preserve"> mod</w:t>
       </w:r>
       <w:r>
         <w:t>, get a grip, and a life optionally</w:t>
@@ -6446,7 +8633,15 @@
     </w:p>
     <w:p>
       <w:r>
-        <w:t>User 12: so what? I need to suck his dick for it?</w:t>
+        <w:t xml:space="preserve">User 12: </w:t>
+      </w:r>
+      <w:proofErr w:type="gramStart"/>
+      <w:r>
+        <w:t>so</w:t>
+      </w:r>
+      <w:proofErr w:type="gramEnd"/>
+      <w:r>
+        <w:t xml:space="preserve"> what? I need to suck his dick for it?</w:t>
       </w:r>
     </w:p>
     <w:p>
@@ -6466,7 +8661,15 @@
     </w:p>
     <w:p>
       <w:r>
-        <w:t>User 8: yeah, it was fun, but it’s lowk cringe now</w:t>
+        <w:t xml:space="preserve">User 8: yeah, it was fun, but it’s </w:t>
+      </w:r>
+      <w:proofErr w:type="spellStart"/>
+      <w:r>
+        <w:t>lowk</w:t>
+      </w:r>
+      <w:proofErr w:type="spellEnd"/>
+      <w:r>
+        <w:t xml:space="preserve"> cringe now</w:t>
       </w:r>
     </w:p>
     <w:p>
@@ -6475,18 +8678,41 @@
       </w:r>
     </w:p>
     <w:p>
-      <w:r>
-        <w:t>Main_hero: go fuck yourselves. I singlehandedly hacked a subforum and what did you do?</w:t>
-      </w:r>
-    </w:p>
-    <w:p>
-      <w:r>
-        <w:t>Main_hero: absolutely fucking nothing</w:t>
-      </w:r>
-    </w:p>
-    <w:p>
-      <w:r>
-        <w:t>Main_hero: you just envy me because I actually managed to pull this off</w:t>
+      <w:proofErr w:type="spellStart"/>
+      <w:r>
+        <w:t>Main_hero</w:t>
+      </w:r>
+      <w:proofErr w:type="spellEnd"/>
+      <w:r>
+        <w:t>: go fuck yourselves. I singlehandedly hacked a subforum and what did you do?</w:t>
+      </w:r>
+    </w:p>
+    <w:p>
+      <w:proofErr w:type="spellStart"/>
+      <w:r>
+        <w:t>Main_hero</w:t>
+      </w:r>
+      <w:proofErr w:type="spellEnd"/>
+      <w:r>
+        <w:t>: absolutely fucking nothing</w:t>
+      </w:r>
+    </w:p>
+    <w:p>
+      <w:proofErr w:type="spellStart"/>
+      <w:r>
+        <w:t>Main_hero</w:t>
+      </w:r>
+      <w:proofErr w:type="spellEnd"/>
+      <w:r>
+        <w:t xml:space="preserve">: you just envy me because I </w:t>
+      </w:r>
+      <w:proofErr w:type="gramStart"/>
+      <w:r>
+        <w:t>actually managed</w:t>
+      </w:r>
+      <w:proofErr w:type="gramEnd"/>
+      <w:r>
+        <w:t xml:space="preserve"> to pull this off</w:t>
       </w:r>
     </w:p>
     <w:p>
@@ -6494,7 +8720,15 @@
         <w:t xml:space="preserve">User 11: oh wow, u hacked a subforum, so we can </w:t>
       </w:r>
       <w:r>
-        <w:t>spam some bs on it</w:t>
+        <w:t xml:space="preserve">spam some </w:t>
+      </w:r>
+      <w:proofErr w:type="gramStart"/>
+      <w:r>
+        <w:t>bs</w:t>
+      </w:r>
+      <w:proofErr w:type="gramEnd"/>
+      <w:r>
+        <w:t xml:space="preserve"> on it</w:t>
       </w:r>
     </w:p>
     <w:p>
@@ -6508,20 +8742,57 @@
       </w:r>
     </w:p>
     <w:p>
-      <w:r>
-        <w:t>Main_hero: well yeah</w:t>
+      <w:proofErr w:type="spellStart"/>
+      <w:r>
+        <w:t>Main_hero</w:t>
+      </w:r>
+      <w:proofErr w:type="spellEnd"/>
+      <w:r>
+        <w:t>: well yeah</w:t>
       </w:r>
     </w:p>
     <w:p>
       <w:r>
         <w:lastRenderedPageBreak/>
-        <w:t xml:space="preserve">User 10: @main_hero truth is, </w:t>
+        <w:t xml:space="preserve">User </w:t>
+      </w:r>
+      <w:proofErr w:type="gramStart"/>
+      <w:r>
+        <w:t>10: @</w:t>
+      </w:r>
+      <w:proofErr w:type="gramEnd"/>
+      <w:r>
+        <w:t xml:space="preserve">main_hero truth is, </w:t>
       </w:r>
       <w:r>
         <w:t>you are</w:t>
       </w:r>
       <w:r>
-        <w:t xml:space="preserve"> just an upjumped loser who couldn’t play cyberdivers to save his life, and then suddenly u hacked a subforum and everyone are supposed to kiss the ground underneath you</w:t>
+        <w:t xml:space="preserve"> just an </w:t>
+      </w:r>
+      <w:proofErr w:type="spellStart"/>
+      <w:r>
+        <w:t>upjumped</w:t>
+      </w:r>
+      <w:proofErr w:type="spellEnd"/>
+      <w:r>
+        <w:t xml:space="preserve"> loser who couldn’t play </w:t>
+      </w:r>
+      <w:proofErr w:type="spellStart"/>
+      <w:r>
+        <w:t>cyberdivers</w:t>
+      </w:r>
+      <w:proofErr w:type="spellEnd"/>
+      <w:r>
+        <w:t xml:space="preserve"> to save his life, and then suddenly u hacked a subforum and everyone </w:t>
+      </w:r>
+      <w:proofErr w:type="gramStart"/>
+      <w:r>
+        <w:t>are</w:t>
+      </w:r>
+      <w:proofErr w:type="gramEnd"/>
+      <w:r>
+        <w:t xml:space="preserve"> supposed to kiss the ground underneath you</w:t>
       </w:r>
     </w:p>
     <w:p>
@@ -6536,7 +8807,15 @@
     </w:p>
     <w:p>
       <w:r>
-        <w:t>User 1: gadayum bro</w:t>
+        <w:t xml:space="preserve">User 1: </w:t>
+      </w:r>
+      <w:proofErr w:type="spellStart"/>
+      <w:r>
+        <w:t>gadayum</w:t>
+      </w:r>
+      <w:proofErr w:type="spellEnd"/>
+      <w:r>
+        <w:t xml:space="preserve"> bro</w:t>
       </w:r>
     </w:p>
     <w:p>
@@ -6557,12 +8836,25 @@
     </w:p>
     <w:p>
       <w:r>
-        <w:t>Man, fuck him and all these cunts.</w:t>
-      </w:r>
-    </w:p>
-    <w:p>
-      <w:r>
-        <w:t xml:space="preserve">Main_hero: </w:t>
+        <w:t xml:space="preserve">Man, fuck him and all these </w:t>
+      </w:r>
+      <w:proofErr w:type="spellStart"/>
+      <w:r>
+        <w:t>cunts</w:t>
+      </w:r>
+      <w:proofErr w:type="spellEnd"/>
+      <w:r>
+        <w:t>.</w:t>
+      </w:r>
+    </w:p>
+    <w:p>
+      <w:proofErr w:type="spellStart"/>
+      <w:r>
+        <w:t>Main_hero</w:t>
+      </w:r>
+      <w:proofErr w:type="spellEnd"/>
+      <w:r>
+        <w:t xml:space="preserve">: </w:t>
       </w:r>
       <w:r>
         <w:t xml:space="preserve">@User10 </w:t>
@@ -6630,8 +8922,13 @@
       </w:r>
     </w:p>
     <w:p>
-      <w:r>
-        <w:t>Main_hero: fuck u</w:t>
+      <w:proofErr w:type="spellStart"/>
+      <w:r>
+        <w:t>Main_hero</w:t>
+      </w:r>
+      <w:proofErr w:type="spellEnd"/>
+      <w:r>
+        <w:t>: fuck u</w:t>
       </w:r>
     </w:p>
     <w:p>
@@ -6697,9 +8994,11 @@
       <w:r>
         <w:t xml:space="preserve"> </w:t>
       </w:r>
+      <w:proofErr w:type="spellStart"/>
       <w:r>
         <w:t>cyberdivers</w:t>
       </w:r>
+      <w:proofErr w:type="spellEnd"/>
       <w:r>
         <w:t xml:space="preserve">, I’ve hacked sillygoose228 and </w:t>
       </w:r>
@@ -6791,11 +9090,21 @@
     </w:p>
     <w:p>
       <w:r>
-        <w:t xml:space="preserve">I’ve spent hours and hours trying to convince everyone around me and myself, that I am skillful, smart and just the best person on earth and not just some useless </w:t>
-      </w:r>
+        <w:t xml:space="preserve">I’ve spent </w:t>
+      </w:r>
+      <w:proofErr w:type="gramStart"/>
+      <w:r>
+        <w:t>hours and hours</w:t>
+      </w:r>
+      <w:proofErr w:type="gramEnd"/>
+      <w:r>
+        <w:t xml:space="preserve"> trying to convince everyone around me and myself, that I am skillful, smart and just the best person on earth and not just some useless </w:t>
+      </w:r>
+      <w:proofErr w:type="spellStart"/>
       <w:r>
         <w:t>forumer</w:t>
       </w:r>
+      <w:proofErr w:type="spellEnd"/>
       <w:r>
         <w:t xml:space="preserve">, although I probably am, </w:t>
       </w:r>
@@ -6815,7 +9124,15 @@
         <w:t>.</w:t>
       </w:r>
       <w:r>
-        <w:t xml:space="preserve"> But how much safety am I willing to trade for it? Because it</w:t>
+        <w:t xml:space="preserve"> But </w:t>
+      </w:r>
+      <w:proofErr w:type="gramStart"/>
+      <w:r>
+        <w:t>how much safety</w:t>
+      </w:r>
+      <w:proofErr w:type="gramEnd"/>
+      <w:r>
+        <w:t xml:space="preserve"> am I willing to trade for it? Because it</w:t>
       </w:r>
       <w:r>
         <w:t xml:space="preserve">’s </w:t>
@@ -6824,8 +9141,13 @@
         <w:t>never</w:t>
       </w:r>
       <w:r>
-        <w:t xml:space="preserve"> gonna</w:t>
-      </w:r>
+        <w:t xml:space="preserve"> </w:t>
+      </w:r>
+      <w:proofErr w:type="spellStart"/>
+      <w:r>
+        <w:t>gonna</w:t>
+      </w:r>
+      <w:proofErr w:type="spellEnd"/>
       <w:r>
         <w:t xml:space="preserve"> stop, </w:t>
       </w:r>
@@ -6841,8 +9163,13 @@
         <w:t xml:space="preserve"> an alternative,</w:t>
       </w:r>
       <w:r>
-        <w:t xml:space="preserve"> real healthy relationships</w:t>
-      </w:r>
+        <w:t xml:space="preserve"> real healthy </w:t>
+      </w:r>
+      <w:proofErr w:type="gramStart"/>
+      <w:r>
+        <w:t>relationships</w:t>
+      </w:r>
+      <w:proofErr w:type="gramEnd"/>
       <w:r>
         <w:t>, where respect and boundaries exist</w:t>
       </w:r>
@@ -6868,7 +9195,16 @@
     </w:p>
     <w:p>
       <w:r>
-        <w:t xml:space="preserve">User 1: yo </w:t>
+        <w:t xml:space="preserve">User 1: </w:t>
+      </w:r>
+      <w:proofErr w:type="spellStart"/>
+      <w:proofErr w:type="gramStart"/>
+      <w:r>
+        <w:t>yo</w:t>
+      </w:r>
+      <w:proofErr w:type="spellEnd"/>
+      <w:r>
+        <w:t xml:space="preserve"> </w:t>
       </w:r>
       <w:r>
         <w:rPr>
@@ -6876,18 +9212,42 @@
         </w:rPr>
         <w:t>@</w:t>
       </w:r>
-      <w:r>
-        <w:t xml:space="preserve">main_hero, u do know that u can get urself banned for </w:t>
+      <w:proofErr w:type="spellStart"/>
+      <w:proofErr w:type="gramEnd"/>
+      <w:r>
+        <w:t>main_</w:t>
+      </w:r>
+      <w:proofErr w:type="gramStart"/>
+      <w:r>
+        <w:t>hero</w:t>
+      </w:r>
+      <w:proofErr w:type="spellEnd"/>
+      <w:proofErr w:type="gramEnd"/>
+      <w:r>
+        <w:t xml:space="preserve">, u do know that u can get </w:t>
+      </w:r>
+      <w:proofErr w:type="spellStart"/>
+      <w:r>
+        <w:t>urself</w:t>
+      </w:r>
+      <w:proofErr w:type="spellEnd"/>
+      <w:r>
+        <w:t xml:space="preserve"> banned for </w:t>
       </w:r>
       <w:r>
         <w:t>stealing</w:t>
       </w:r>
       <w:r>
-        <w:t xml:space="preserve"> other user</w:t>
+        <w:t xml:space="preserve"> other </w:t>
+      </w:r>
+      <w:proofErr w:type="gramStart"/>
+      <w:r>
+        <w:t>user</w:t>
       </w:r>
       <w:r>
         <w:t>s</w:t>
       </w:r>
+      <w:proofErr w:type="gramEnd"/>
       <w:r>
         <w:t xml:space="preserve"> </w:t>
       </w:r>
@@ -6902,8 +9262,21 @@
       </w:r>
     </w:p>
     <w:p>
-      <w:r>
-        <w:t>Main_hero: yeah of course I kno</w:t>
+      <w:proofErr w:type="spellStart"/>
+      <w:r>
+        <w:t>Main_hero</w:t>
+      </w:r>
+      <w:proofErr w:type="spellEnd"/>
+      <w:r>
+        <w:t xml:space="preserve">: </w:t>
+      </w:r>
+      <w:proofErr w:type="gramStart"/>
+      <w:r>
+        <w:t>yeah</w:t>
+      </w:r>
+      <w:proofErr w:type="gramEnd"/>
+      <w:r>
+        <w:t xml:space="preserve"> of course I kno</w:t>
       </w:r>
       <w:r>
         <w:t>w</w:t>
@@ -6911,7 +9284,15 @@
     </w:p>
     <w:p>
       <w:r>
-        <w:t>(Screen shows that main_hero’s account has been banned)</w:t>
+        <w:t xml:space="preserve">(Screen shows that </w:t>
+      </w:r>
+      <w:proofErr w:type="spellStart"/>
+      <w:r>
+        <w:t>main_hero’s</w:t>
+      </w:r>
+      <w:proofErr w:type="spellEnd"/>
+      <w:r>
+        <w:t xml:space="preserve"> account has been banned)</w:t>
       </w:r>
     </w:p>
     <w:p>
@@ -6938,7 +9319,7 @@
 </file>
 
 <file path=word/numbering.xml><?xml version="1.0" encoding="utf-8"?>
-<w:numbering xmlns:wpc="http://schemas.microsoft.com/office/word/2010/wordprocessingCanvas" xmlns:cx="http://schemas.microsoft.com/office/drawing/2014/chartex" xmlns:cx1="http://schemas.microsoft.com/office/drawing/2015/9/8/chartex" xmlns:cx2="http://schemas.microsoft.com/office/drawing/2015/10/21/chartex" xmlns:cx3="http://schemas.microsoft.com/office/drawing/2016/5/9/chartex" xmlns:cx4="http://schemas.microsoft.com/office/drawing/2016/5/10/chartex" xmlns:cx5="http://schemas.microsoft.com/office/drawing/2016/5/11/chartex" xmlns:cx6="http://schemas.microsoft.com/office/drawing/2016/5/12/chartex" xmlns:cx7="http://schemas.microsoft.com/office/drawing/2016/5/13/chartex" xmlns:cx8="http://schemas.microsoft.com/office/drawing/2016/5/14/chartex" xmlns:mc="http://schemas.openxmlformats.org/markup-compatibility/2006" xmlns:aink="http://schemas.microsoft.com/office/drawing/2016/ink" xmlns:am3d="http://schemas.microsoft.com/office/drawing/2017/model3d" xmlns:o="urn:schemas-microsoft-com:office:office" xmlns:oel="http://schemas.microsoft.com/office/2019/extlst" xmlns:r="http://schemas.openxmlformats.org/officeDocument/2006/relationships" xmlns:m="http://schemas.openxmlformats.org/officeDocument/2006/math" xmlns:v="urn:schemas-microsoft-com:vml" xmlns:wp14="http://schemas.microsoft.com/office/word/2010/wordprocessingDrawing" xmlns:wp="http://schemas.openxmlformats.org/drawingml/2006/wordprocessingDrawing" xmlns:w10="urn:schemas-microsoft-com:office:word" xmlns:w="http://schemas.openxmlformats.org/wordprocessingml/2006/main" xmlns:w14="http://schemas.microsoft.com/office/word/2010/wordml" xmlns:w15="http://schemas.microsoft.com/office/word/2012/wordml" xmlns:w16cei="http://schemas.microsoft.com/office/word/2026/wordml/cei" xmlns:w16cex="http://schemas.microsoft.com/office/word/2018/wordml/cex" xmlns:w16cid="http://schemas.microsoft.com/office/word/2016/wordml/cid" xmlns:w16="http://schemas.microsoft.com/office/word/2018/wordml" xmlns:w16du="http://schemas.microsoft.com/office/word/2023/wordml/word16du" xmlns:w16sdtdh="http://schemas.microsoft.com/office/word/2020/wordml/sdtdatahash" xmlns:w16sdtfl="http://schemas.microsoft.com/office/word/2024/wordml/sdtformatlock" xmlns:w16se="http://schemas.microsoft.com/office/word/2015/wordml/symex" xmlns:wpg="http://schemas.microsoft.com/office/word/2010/wordprocessingGroup" xmlns:wpi="http://schemas.microsoft.com/office/word/2010/wordprocessingInk" xmlns:wne="http://schemas.microsoft.com/office/word/2006/wordml" xmlns:wps="http://schemas.microsoft.com/office/word/2010/wordprocessingShape" mc:Ignorable="w14 w15 w16se w16cid w16 w16cex w16sdtdh w16sdtfl w16du wp14">
+<w:numbering xmlns:wpc="http://schemas.microsoft.com/office/word/2010/wordprocessingCanvas" xmlns:cx="http://schemas.microsoft.com/office/drawing/2014/chartex" xmlns:cx1="http://schemas.microsoft.com/office/drawing/2015/9/8/chartex" xmlns:cx2="http://schemas.microsoft.com/office/drawing/2015/10/21/chartex" xmlns:cx3="http://schemas.microsoft.com/office/drawing/2016/5/9/chartex" xmlns:cx4="http://schemas.microsoft.com/office/drawing/2016/5/10/chartex" xmlns:cx5="http://schemas.microsoft.com/office/drawing/2016/5/11/chartex" xmlns:cx6="http://schemas.microsoft.com/office/drawing/2016/5/12/chartex" xmlns:cx7="http://schemas.microsoft.com/office/drawing/2016/5/13/chartex" xmlns:cx8="http://schemas.microsoft.com/office/drawing/2016/5/14/chartex" xmlns:mc="http://schemas.openxmlformats.org/markup-compatibility/2006" xmlns:aink="http://schemas.microsoft.com/office/drawing/2016/ink" xmlns:am3d="http://schemas.microsoft.com/office/drawing/2017/model3d" xmlns:o="urn:schemas-microsoft-com:office:office" xmlns:oel="http://schemas.microsoft.com/office/2019/extlst" xmlns:r="http://schemas.openxmlformats.org/officeDocument/2006/relationships" xmlns:m="http://schemas.openxmlformats.org/officeDocument/2006/math" xmlns:v="urn:schemas-microsoft-com:vml" xmlns:wp14="http://schemas.microsoft.com/office/word/2010/wordprocessingDrawing" xmlns:wp="http://schemas.openxmlformats.org/drawingml/2006/wordprocessingDrawing" xmlns:w10="urn:schemas-microsoft-com:office:word" xmlns:w="http://schemas.openxmlformats.org/wordprocessingml/2006/main" xmlns:w14="http://schemas.microsoft.com/office/word/2010/wordml" xmlns:w15="http://schemas.microsoft.com/office/word/2012/wordml" xmlns:w16cex="http://schemas.microsoft.com/office/word/2018/wordml/cex" xmlns:w16cid="http://schemas.microsoft.com/office/word/2016/wordml/cid" xmlns:w16="http://schemas.microsoft.com/office/word/2018/wordml" xmlns:w16du="http://schemas.microsoft.com/office/word/2023/wordml/word16du" xmlns:w16sdtdh="http://schemas.microsoft.com/office/word/2020/wordml/sdtdatahash" xmlns:w16sdtfl="http://schemas.microsoft.com/office/word/2024/wordml/sdtformatlock" xmlns:w16se="http://schemas.microsoft.com/office/word/2015/wordml/symex" xmlns:wpg="http://schemas.microsoft.com/office/word/2010/wordprocessingGroup" xmlns:wpi="http://schemas.microsoft.com/office/word/2010/wordprocessingInk" xmlns:wne="http://schemas.microsoft.com/office/word/2006/wordml" xmlns:wps="http://schemas.microsoft.com/office/word/2010/wordprocessingShape" mc:Ignorable="w14 w15 w16se w16cid w16 w16cex w16sdtdh w16sdtfl w16du wp14">
   <w:abstractNum w:abstractNumId="0" w15:restartNumberingAfterBreak="0">
     <w:nsid w:val="15A05A1F"/>
     <w:multiLevelType w:val="multilevel"/>

</xml_diff>

<commit_message>
new part in script
</commit_message>
<xml_diff>
--- a/docs/Script.docx
+++ b/docs/Script.docx
@@ -2766,21 +2766,7 @@
         <w:rPr>
           <w:lang w:val="en-AU"/>
         </w:rPr>
-        <w:t xml:space="preserve"> Posts are some memes and whines about balance of the guns and </w:t>
-      </w:r>
-      <w:proofErr w:type="gramStart"/>
-      <w:r>
-        <w:rPr>
-          <w:lang w:val="en-AU"/>
-        </w:rPr>
-        <w:t>maps</w:t>
-      </w:r>
-      <w:proofErr w:type="gramEnd"/>
-      <w:r>
-        <w:rPr>
-          <w:lang w:val="en-AU"/>
-        </w:rPr>
-        <w:t xml:space="preserve"> or </w:t>
+        <w:t xml:space="preserve"> Posts are some memes and whines about balance of the guns and maps or </w:t>
       </w:r>
       <w:r>
         <w:rPr>
@@ -8277,15 +8263,18 @@
     </w:p>
     <w:p>
       <w:r>
-        <w:t xml:space="preserve">User 8: of all people it’s </w:t>
-      </w:r>
-      <w:proofErr w:type="spellStart"/>
-      <w:r>
-        <w:t>main_hero</w:t>
-      </w:r>
-      <w:proofErr w:type="spellEnd"/>
-      <w:r>
-        <w:t xml:space="preserve"> who did that </w:t>
+        <w:t xml:space="preserve">User 8: of all people </w:t>
+      </w:r>
+      <w:proofErr w:type="gramStart"/>
+      <w:r>
+        <w:t xml:space="preserve">it’s </w:t>
+      </w:r>
+      <w:r>
+        <w:t>@</w:t>
+      </w:r>
+      <w:proofErr w:type="gramEnd"/>
+      <w:r>
+        <w:t xml:space="preserve">main_hero who did that </w:t>
       </w:r>
       <w:proofErr w:type="spellStart"/>
       <w:r>
@@ -8696,6 +8685,9 @@
       <w:r>
         <w:t>: absolutely fucking nothing</w:t>
       </w:r>
+      <w:r>
+        <w:t>, except bitching and moaning</w:t>
+      </w:r>
     </w:p>
     <w:p>
       <w:proofErr w:type="spellStart"/>
@@ -8704,7 +8696,25 @@
       </w:r>
       <w:proofErr w:type="spellEnd"/>
       <w:r>
-        <w:t xml:space="preserve">: you just envy me because I </w:t>
+        <w:t xml:space="preserve">: </w:t>
+      </w:r>
+      <w:r>
+        <w:t>u r</w:t>
+      </w:r>
+      <w:r>
+        <w:t xml:space="preserve"> just </w:t>
+      </w:r>
+      <w:r>
+        <w:t>jealous</w:t>
+      </w:r>
+      <w:r>
+        <w:t xml:space="preserve"> </w:t>
+      </w:r>
+      <w:r>
+        <w:t xml:space="preserve">of </w:t>
+      </w:r>
+      <w:r>
+        <w:t xml:space="preserve">me because I </w:t>
       </w:r>
       <w:proofErr w:type="gramStart"/>
       <w:r>
@@ -8754,29 +8764,303 @@
     <w:p>
       <w:r>
         <w:lastRenderedPageBreak/>
+        <w:t xml:space="preserve">User 10: </w:t>
+      </w:r>
+      <w:proofErr w:type="spellStart"/>
+      <w:r>
+        <w:t>bruh</w:t>
+      </w:r>
+      <w:proofErr w:type="spellEnd"/>
+      <w:r>
+        <w:t xml:space="preserve"> u</w:t>
+      </w:r>
+      <w:r>
+        <w:t xml:space="preserve"> </w:t>
+      </w:r>
+      <w:r>
+        <w:t>r</w:t>
+      </w:r>
+      <w:r>
+        <w:t xml:space="preserve"> just an </w:t>
+      </w:r>
+      <w:r>
+        <w:t>unemployed</w:t>
+      </w:r>
+      <w:r>
+        <w:t xml:space="preserve"> friendless</w:t>
+      </w:r>
+      <w:r>
+        <w:t xml:space="preserve"> cringe</w:t>
+      </w:r>
+      <w:r>
+        <w:t xml:space="preserve"> loser who couldn’t play </w:t>
+      </w:r>
+      <w:proofErr w:type="spellStart"/>
+      <w:r>
+        <w:t>cyberdivers</w:t>
+      </w:r>
+      <w:proofErr w:type="spellEnd"/>
+      <w:r>
+        <w:t xml:space="preserve"> to save his life, and then suddenly u hacked </w:t>
+      </w:r>
+      <w:r>
+        <w:t>some</w:t>
+      </w:r>
+      <w:r>
+        <w:t xml:space="preserve"> subforum and everyone </w:t>
+      </w:r>
+      <w:r>
+        <w:t>is</w:t>
+      </w:r>
+      <w:r>
+        <w:t xml:space="preserve"> supposed to kiss the ground underneath </w:t>
+      </w:r>
+      <w:r>
+        <w:t>u</w:t>
+      </w:r>
+      <w:r>
+        <w:t xml:space="preserve"> </w:t>
+      </w:r>
+    </w:p>
+    <w:p>
+      <w:r>
+        <w:t xml:space="preserve">User 10: well guess what, it’s not happening </w:t>
+      </w:r>
+    </w:p>
+    <w:p>
+      <w:r>
+        <w:t xml:space="preserve">User 10: no matter what </w:t>
+      </w:r>
+      <w:r>
+        <w:t>u</w:t>
+      </w:r>
+      <w:r>
+        <w:t xml:space="preserve"> do, </w:t>
+      </w:r>
+      <w:r>
+        <w:t>u always will be cringe</w:t>
+      </w:r>
+    </w:p>
+    <w:p>
+      <w:r>
+        <w:t xml:space="preserve">User 1: </w:t>
+      </w:r>
+      <w:proofErr w:type="spellStart"/>
+      <w:r>
+        <w:t>gadayum</w:t>
+      </w:r>
+      <w:proofErr w:type="spellEnd"/>
+      <w:r>
+        <w:t xml:space="preserve"> bro</w:t>
+      </w:r>
+    </w:p>
+    <w:p>
+      <w:r>
+        <w:t>User 2: that was brutal</w:t>
+      </w:r>
+    </w:p>
+    <w:p>
+      <w:r>
+        <w:t>User 3: holy shit</w:t>
+      </w:r>
+      <w:r>
+        <w:t>, bro got roasted</w:t>
+      </w:r>
+      <w:r>
+        <w:t xml:space="preserve"> so hard</w:t>
+      </w:r>
+    </w:p>
+    <w:p>
+      <w:r>
+        <w:t xml:space="preserve">Man, fuck him and all these </w:t>
+      </w:r>
+      <w:proofErr w:type="spellStart"/>
+      <w:r>
+        <w:t>cunts</w:t>
+      </w:r>
+      <w:proofErr w:type="spellEnd"/>
+      <w:r>
+        <w:t>.</w:t>
+      </w:r>
+    </w:p>
+    <w:p>
+      <w:proofErr w:type="spellStart"/>
+      <w:r>
+        <w:t>Main_hero</w:t>
+      </w:r>
+      <w:proofErr w:type="spellEnd"/>
+      <w:r>
+        <w:t>: fuck u</w:t>
+      </w:r>
+    </w:p>
+    <w:p>
+      <w:r>
+        <w:t>User 3: me?</w:t>
+      </w:r>
+    </w:p>
+    <w:p>
+      <w:r>
+        <w:t>User</w:t>
+      </w:r>
+      <w:r>
+        <w:t xml:space="preserve"> </w:t>
+      </w:r>
+      <w:r>
+        <w:t>1</w:t>
+      </w:r>
+      <w:r>
+        <w:t>0</w:t>
+      </w:r>
+      <w:r>
+        <w:t>: fuck u, u delusional fuckwit</w:t>
+      </w:r>
+    </w:p>
+    <w:p>
+      <w:r>
+        <w:t>User 5: no fuck u, u fucking twat</w:t>
+      </w:r>
+    </w:p>
+    <w:p>
+      <w:r>
         <w:t xml:space="preserve">User </w:t>
       </w:r>
+      <w:r>
+        <w:t>1</w:t>
+      </w:r>
+      <w:r>
+        <w:t>0</w:t>
+      </w:r>
+      <w:r>
+        <w:t xml:space="preserve">: </w:t>
+      </w:r>
+      <w:r>
+        <w:t xml:space="preserve">u called me </w:t>
+      </w:r>
+      <w:r>
+        <w:t>twat? I never felt less insulted</w:t>
+      </w:r>
+    </w:p>
+    <w:p>
+      <w:r>
+        <w:t>User 3: bro wtf did I do?</w:t>
+      </w:r>
+    </w:p>
+    <w:p>
+      <w:r>
+        <w:t>User 5: fuck u</w:t>
+      </w:r>
+    </w:p>
+    <w:p>
+      <w:r>
+        <w:t xml:space="preserve">User </w:t>
+      </w:r>
+      <w:r>
+        <w:t>1</w:t>
+      </w:r>
+      <w:r>
+        <w:t>3: fuck u</w:t>
+      </w:r>
+    </w:p>
+    <w:p>
+      <w:proofErr w:type="spellStart"/>
+      <w:r>
+        <w:t>Main_hero</w:t>
+      </w:r>
+      <w:proofErr w:type="spellEnd"/>
+      <w:r>
+        <w:t>: fuck u</w:t>
+      </w:r>
+    </w:p>
+    <w:p>
+      <w:r>
+        <w:t>User 12: fuck u</w:t>
+      </w:r>
+    </w:p>
+    <w:p>
+      <w:r>
+        <w:t>User 13:</w:t>
+      </w:r>
+      <w:r>
+        <w:t xml:space="preserve"> </w:t>
+      </w:r>
+      <w:r>
+        <w:t>fuck u</w:t>
+      </w:r>
+    </w:p>
+    <w:p>
+      <w:r>
+        <w:t>User 3: what is everyone saying fuck me for?</w:t>
+      </w:r>
+    </w:p>
+    <w:p>
+      <w:r>
+        <w:t>User 10: fuck u</w:t>
+      </w:r>
+    </w:p>
+    <w:p>
+      <w:r>
+        <w:t>User 2: fuck u</w:t>
+      </w:r>
+    </w:p>
+    <w:p>
+      <w:r>
+        <w:t>User 3: fuck u</w:t>
+      </w:r>
+    </w:p>
+    <w:p>
+      <w:r>
+        <w:t>User 4: fuck u</w:t>
+      </w:r>
+    </w:p>
+    <w:p>
+      <w:r>
+        <w:t>User 5: fuck u</w:t>
+      </w:r>
+    </w:p>
+    <w:p>
+      <w:r>
+        <w:lastRenderedPageBreak/>
+        <w:t>(Screen slowly goes red and blurry</w:t>
+      </w:r>
+      <w:r>
+        <w:t xml:space="preserve"> as messages fuck u keep popping up from all the </w:t>
+      </w:r>
       <w:proofErr w:type="gramStart"/>
       <w:r>
-        <w:t>10: @</w:t>
+        <w:t>members</w:t>
+      </w:r>
+      <w:r>
+        <w:t xml:space="preserve"> </w:t>
+      </w:r>
+      <w:r>
+        <w:t>,</w:t>
       </w:r>
       <w:proofErr w:type="gramEnd"/>
       <w:r>
-        <w:t xml:space="preserve">main_hero truth is, </w:t>
-      </w:r>
-      <w:r>
-        <w:t>you are</w:t>
-      </w:r>
-      <w:r>
-        <w:t xml:space="preserve"> just an </w:t>
-      </w:r>
-      <w:proofErr w:type="spellStart"/>
-      <w:r>
-        <w:t>upjumped</w:t>
-      </w:r>
-      <w:proofErr w:type="spellEnd"/>
-      <w:r>
-        <w:t xml:space="preserve"> loser who couldn’t play </w:t>
+        <w:t xml:space="preserve"> and then suddenly white)</w:t>
+      </w:r>
+    </w:p>
+    <w:p>
+      <w:r>
+        <w:t>Man, this shit is fucking stupid.</w:t>
+      </w:r>
+      <w:r>
+        <w:t xml:space="preserve"> The fuck am I even doing?</w:t>
+      </w:r>
+      <w:r>
+        <w:t xml:space="preserve"> I’ve s</w:t>
+      </w:r>
+      <w:r>
+        <w:t>unk</w:t>
+      </w:r>
+      <w:r>
+        <w:t xml:space="preserve"> 1000h </w:t>
+      </w:r>
+      <w:r>
+        <w:t>sweating in</w:t>
+      </w:r>
+      <w:r>
+        <w:t xml:space="preserve"> </w:t>
       </w:r>
       <w:proofErr w:type="spellStart"/>
       <w:r>
@@ -8784,413 +9068,235 @@
       </w:r>
       <w:proofErr w:type="spellEnd"/>
       <w:r>
-        <w:t xml:space="preserve"> to save his life, and then suddenly u hacked a subforum and everyone </w:t>
+        <w:t xml:space="preserve">, I’ve hacked sillygoose228 and </w:t>
+      </w:r>
+      <w:r>
+        <w:t>zero</w:t>
+      </w:r>
+      <w:r>
+        <w:t xml:space="preserve"> sub even though they did nothing </w:t>
+      </w:r>
+      <w:r>
+        <w:t>but show love for one another</w:t>
+      </w:r>
+      <w:r>
+        <w:t xml:space="preserve"> and </w:t>
+      </w:r>
+      <w:r>
+        <w:t>why</w:t>
+      </w:r>
+      <w:r>
+        <w:t xml:space="preserve">? </w:t>
+      </w:r>
+      <w:r>
+        <w:t>Because I wanted</w:t>
+      </w:r>
+      <w:r>
+        <w:t xml:space="preserve"> fucking validation from my friends. M</w:t>
+      </w:r>
+      <w:r>
+        <w:t xml:space="preserve">y only </w:t>
+      </w:r>
+      <w:r>
+        <w:t>“</w:t>
+      </w:r>
+      <w:r>
+        <w:t>friends</w:t>
+      </w:r>
+      <w:r>
+        <w:t>” who</w:t>
+      </w:r>
+      <w:r>
+        <w:t xml:space="preserve"> don’t even respect me</w:t>
+      </w:r>
+      <w:r>
+        <w:t xml:space="preserve">, who confuse </w:t>
+      </w:r>
+      <w:r>
+        <w:t>bullying</w:t>
+      </w:r>
+      <w:r>
+        <w:t xml:space="preserve"> with honesty</w:t>
+      </w:r>
+      <w:r>
+        <w:t xml:space="preserve"> and </w:t>
+      </w:r>
+      <w:r>
+        <w:t>who are</w:t>
+      </w:r>
+      <w:r>
+        <w:t xml:space="preserve"> </w:t>
+      </w:r>
+      <w:r>
+        <w:t xml:space="preserve">every </w:t>
+      </w:r>
+      <w:r>
+        <w:t>bit as stupid as I am</w:t>
+      </w:r>
+      <w:r>
+        <w:t>.</w:t>
+      </w:r>
+      <w:r>
+        <w:t xml:space="preserve"> </w:t>
+      </w:r>
+      <w:r>
+        <w:t>And the only reason I’m trying to hang onto them is</w:t>
+      </w:r>
+      <w:r>
+        <w:t xml:space="preserve"> that</w:t>
+      </w:r>
+      <w:r>
+        <w:t xml:space="preserve"> I </w:t>
+      </w:r>
+      <w:r>
+        <w:t xml:space="preserve">don’t </w:t>
+      </w:r>
+      <w:r>
+        <w:t xml:space="preserve">have </w:t>
+      </w:r>
+      <w:r>
+        <w:t>any</w:t>
+      </w:r>
+      <w:r>
+        <w:t>one else.</w:t>
+      </w:r>
+    </w:p>
+    <w:p>
+      <w:r>
+        <w:t xml:space="preserve">I’ve spent </w:t>
       </w:r>
       <w:proofErr w:type="gramStart"/>
       <w:r>
-        <w:t>are</w:t>
+        <w:t>hours and hours</w:t>
       </w:r>
       <w:proofErr w:type="gramEnd"/>
       <w:r>
-        <w:t xml:space="preserve"> supposed to kiss the ground underneath you</w:t>
-      </w:r>
-    </w:p>
-    <w:p>
-      <w:r>
-        <w:t xml:space="preserve">User 10: well guess what, it’s not happening </w:t>
-      </w:r>
-    </w:p>
-    <w:p>
-      <w:r>
-        <w:t>User 10: no matter what you do, you always will be a clown, a fucking joke</w:t>
-      </w:r>
-    </w:p>
-    <w:p>
-      <w:r>
-        <w:t xml:space="preserve">User 1: </w:t>
-      </w:r>
-      <w:proofErr w:type="spellStart"/>
-      <w:r>
-        <w:t>gadayum</w:t>
-      </w:r>
-      <w:proofErr w:type="spellEnd"/>
-      <w:r>
-        <w:t xml:space="preserve"> bro</w:t>
-      </w:r>
-    </w:p>
-    <w:p>
-      <w:r>
-        <w:t>User 2: that was brutal</w:t>
-      </w:r>
-    </w:p>
-    <w:p>
-      <w:r>
-        <w:t>User 3: holy shit</w:t>
-      </w:r>
-      <w:r>
-        <w:t>, bro got roasted</w:t>
-      </w:r>
-      <w:r>
-        <w:t xml:space="preserve"> so hard</w:t>
-      </w:r>
-    </w:p>
-    <w:p>
-      <w:r>
-        <w:t xml:space="preserve">Man, fuck him and all these </w:t>
-      </w:r>
-      <w:proofErr w:type="spellStart"/>
-      <w:r>
-        <w:t>cunts</w:t>
-      </w:r>
-      <w:proofErr w:type="spellEnd"/>
+        <w:t xml:space="preserve"> trying to convince everyone around me and myself, that I am skillful, smart and just the best person on earth and not just some useless </w:t>
+      </w:r>
+      <w:proofErr w:type="spellStart"/>
+      <w:r>
+        <w:t>forumer</w:t>
+      </w:r>
+      <w:proofErr w:type="spellEnd"/>
+      <w:r>
+        <w:t xml:space="preserve">, although I probably am, </w:t>
+      </w:r>
+      <w:r>
+        <w:t xml:space="preserve">just to get that power. Power that makes me say what I </w:t>
+      </w:r>
+      <w:r>
+        <w:t>want to</w:t>
+      </w:r>
+      <w:r>
+        <w:t xml:space="preserve"> say, whenever I want, however I want</w:t>
+      </w:r>
+      <w:r>
+        <w:t xml:space="preserve"> and be untouchable</w:t>
+      </w:r>
       <w:r>
         <w:t>.</w:t>
       </w:r>
-    </w:p>
-    <w:p>
-      <w:proofErr w:type="spellStart"/>
-      <w:r>
-        <w:t>Main_hero</w:t>
-      </w:r>
-      <w:proofErr w:type="spellEnd"/>
-      <w:r>
-        <w:t xml:space="preserve">: </w:t>
-      </w:r>
-      <w:r>
-        <w:t xml:space="preserve">@User10 </w:t>
-      </w:r>
-      <w:r>
-        <w:t>fuck u</w:t>
-      </w:r>
-    </w:p>
-    <w:p>
-      <w:r>
-        <w:t>User</w:t>
+      <w:r>
+        <w:t xml:space="preserve"> But </w:t>
+      </w:r>
+      <w:proofErr w:type="gramStart"/>
+      <w:r>
+        <w:t>how much safety</w:t>
+      </w:r>
+      <w:proofErr w:type="gramEnd"/>
+      <w:r>
+        <w:t xml:space="preserve"> am I willing to trade for it? Because it</w:t>
+      </w:r>
+      <w:r>
+        <w:t xml:space="preserve">’s </w:t>
+      </w:r>
+      <w:r>
+        <w:t>never</w:t>
       </w:r>
       <w:r>
         <w:t xml:space="preserve"> </w:t>
       </w:r>
-      <w:r>
-        <w:t>1</w:t>
-      </w:r>
-      <w:r>
-        <w:t>0</w:t>
-      </w:r>
-      <w:r>
-        <w:t>: fuck u, u delusional fuckwit</w:t>
-      </w:r>
-    </w:p>
-    <w:p>
-      <w:r>
-        <w:t>User 5: no fuck u, u fucking twat</w:t>
-      </w:r>
-    </w:p>
-    <w:p>
-      <w:r>
-        <w:t xml:space="preserve">User </w:t>
-      </w:r>
-      <w:r>
-        <w:t>1</w:t>
-      </w:r>
-      <w:r>
-        <w:t>0</w:t>
-      </w:r>
-      <w:r>
-        <w:t xml:space="preserve">: </w:t>
-      </w:r>
-      <w:r>
-        <w:t xml:space="preserve">u called me </w:t>
-      </w:r>
-      <w:r>
-        <w:t>twat? I never felt less insulted</w:t>
-      </w:r>
-    </w:p>
-    <w:p>
-      <w:r>
-        <w:t>User 5: fuck u</w:t>
-      </w:r>
-    </w:p>
-    <w:p>
-      <w:r>
-        <w:t xml:space="preserve">User </w:t>
-      </w:r>
-      <w:r>
-        <w:t>1</w:t>
-      </w:r>
-      <w:r>
-        <w:t>3: fuck u</w:t>
-      </w:r>
-    </w:p>
-    <w:p>
-      <w:proofErr w:type="spellStart"/>
-      <w:r>
-        <w:t>Main_hero</w:t>
-      </w:r>
-      <w:proofErr w:type="spellEnd"/>
-      <w:r>
-        <w:t>: fuck u</w:t>
-      </w:r>
-    </w:p>
-    <w:p>
-      <w:r>
-        <w:t>User 12: fuck u</w:t>
-      </w:r>
-    </w:p>
-    <w:p>
-      <w:r>
-        <w:t>User 13:</w:t>
+      <w:proofErr w:type="spellStart"/>
+      <w:r>
+        <w:t>gonna</w:t>
+      </w:r>
+      <w:proofErr w:type="spellEnd"/>
+      <w:r>
+        <w:t xml:space="preserve"> stop, </w:t>
+      </w:r>
+      <w:r>
+        <w:t>I will try to poke people where it hurts and they will do the same to me, because everybody wants power</w:t>
+      </w:r>
+      <w:r>
+        <w:t xml:space="preserve"> and be on top</w:t>
+      </w:r>
+      <w:r>
+        <w:t>, and before you know it, everyone is in that puddle of toxicity, being afraid to stick out</w:t>
+      </w:r>
+      <w:r>
+        <w:t>.</w:t>
       </w:r>
       <w:r>
         <w:t xml:space="preserve"> </w:t>
       </w:r>
       <w:r>
-        <w:t>fuck u</w:t>
-      </w:r>
-    </w:p>
-    <w:p>
-      <w:r>
-        <w:t>User 10: fuck u</w:t>
-      </w:r>
-    </w:p>
-    <w:p>
-      <w:r>
-        <w:t>User 2: fuck u</w:t>
-      </w:r>
-    </w:p>
-    <w:p>
-      <w:r>
-        <w:t>User 3: fuck u</w:t>
-      </w:r>
-    </w:p>
-    <w:p>
-      <w:r>
-        <w:t>User 4: fuck u</w:t>
-      </w:r>
-    </w:p>
-    <w:p>
-      <w:r>
-        <w:t>(Screen slowly goes red and blurry, and then suddenly white)</w:t>
-      </w:r>
-    </w:p>
-    <w:p>
-      <w:r>
-        <w:t>Man, this shit is fucking stupid.</w:t>
-      </w:r>
-      <w:r>
-        <w:t xml:space="preserve"> The fuck am I even doing?</w:t>
-      </w:r>
-      <w:r>
-        <w:t xml:space="preserve"> I’ve s</w:t>
-      </w:r>
-      <w:r>
-        <w:t>unk</w:t>
-      </w:r>
-      <w:r>
-        <w:t xml:space="preserve"> 1000h </w:t>
-      </w:r>
-      <w:r>
-        <w:t>sweating in</w:t>
-      </w:r>
-      <w:r>
-        <w:t xml:space="preserve"> </w:t>
-      </w:r>
-      <w:proofErr w:type="spellStart"/>
-      <w:r>
-        <w:t>cyberdivers</w:t>
-      </w:r>
-      <w:proofErr w:type="spellEnd"/>
-      <w:r>
-        <w:t xml:space="preserve">, I’ve hacked sillygoose228 and </w:t>
-      </w:r>
-      <w:r>
-        <w:t>zero</w:t>
-      </w:r>
-      <w:r>
-        <w:t xml:space="preserve"> sub even though they did nothing </w:t>
-      </w:r>
-      <w:r>
-        <w:t>but show love for one another</w:t>
-      </w:r>
-      <w:r>
-        <w:t xml:space="preserve"> and </w:t>
-      </w:r>
-      <w:r>
-        <w:t>why</w:t>
-      </w:r>
-      <w:r>
-        <w:t xml:space="preserve">? </w:t>
-      </w:r>
-      <w:r>
-        <w:t>Because I wanted</w:t>
-      </w:r>
-      <w:r>
-        <w:t xml:space="preserve"> fucking validation from my friends. M</w:t>
-      </w:r>
-      <w:r>
-        <w:t xml:space="preserve">y only </w:t>
-      </w:r>
-      <w:r>
-        <w:t>“</w:t>
-      </w:r>
-      <w:r>
-        <w:t>friends</w:t>
-      </w:r>
-      <w:r>
-        <w:t>” who</w:t>
-      </w:r>
-      <w:r>
-        <w:t xml:space="preserve"> don’t even respect me</w:t>
-      </w:r>
-      <w:r>
-        <w:t>, who confuse brutality with honesty</w:t>
-      </w:r>
-      <w:r>
-        <w:t xml:space="preserve"> and </w:t>
-      </w:r>
-      <w:r>
-        <w:t>who are</w:t>
-      </w:r>
-      <w:r>
-        <w:t xml:space="preserve"> </w:t>
-      </w:r>
-      <w:r>
-        <w:lastRenderedPageBreak/>
-        <w:t xml:space="preserve">every </w:t>
-      </w:r>
-      <w:r>
-        <w:t>bit as stupid as I am</w:t>
+        <w:t>It’s a cycle that can’t be stopped. Or can it?</w:t>
+      </w:r>
+    </w:p>
+    <w:p>
+      <w:r>
+        <w:t>And when I saw</w:t>
+      </w:r>
+      <w:r>
+        <w:t xml:space="preserve"> an alternative,</w:t>
+      </w:r>
+      <w:r>
+        <w:t xml:space="preserve"> real healthy </w:t>
+      </w:r>
+      <w:proofErr w:type="gramStart"/>
+      <w:r>
+        <w:t>relationships</w:t>
+      </w:r>
+      <w:proofErr w:type="gramEnd"/>
+      <w:r>
+        <w:t>, where respect and boundaries exist</w:t>
+      </w:r>
+      <w:r>
+        <w:t>, all I wanted to do was burn them to the ground, based on the presumption that they are just weak</w:t>
+      </w:r>
+      <w:r>
+        <w:t xml:space="preserve"> and fake</w:t>
+      </w:r>
+      <w:r>
+        <w:t xml:space="preserve">. But let’s be real, I was </w:t>
+      </w:r>
+      <w:r>
+        <w:t>the one who is weak</w:t>
       </w:r>
       <w:r>
         <w:t>.</w:t>
       </w:r>
-      <w:r>
-        <w:t xml:space="preserve"> </w:t>
-      </w:r>
-      <w:r>
-        <w:t>And the only reason I’m trying to hang onto them is</w:t>
-      </w:r>
-      <w:r>
-        <w:t xml:space="preserve"> that</w:t>
-      </w:r>
-      <w:r>
-        <w:t xml:space="preserve"> I </w:t>
-      </w:r>
-      <w:r>
-        <w:t xml:space="preserve">don’t </w:t>
-      </w:r>
-      <w:r>
-        <w:t xml:space="preserve">have </w:t>
-      </w:r>
-      <w:r>
-        <w:t>any</w:t>
-      </w:r>
-      <w:r>
-        <w:t>one else.</w:t>
-      </w:r>
-    </w:p>
-    <w:p>
-      <w:r>
-        <w:t xml:space="preserve">I’ve spent </w:t>
-      </w:r>
-      <w:proofErr w:type="gramStart"/>
-      <w:r>
-        <w:t>hours and hours</w:t>
-      </w:r>
-      <w:proofErr w:type="gramEnd"/>
-      <w:r>
-        <w:t xml:space="preserve"> trying to convince everyone around me and myself, that I am skillful, smart and just the best person on earth and not just some useless </w:t>
-      </w:r>
-      <w:proofErr w:type="spellStart"/>
-      <w:r>
-        <w:t>forumer</w:t>
-      </w:r>
-      <w:proofErr w:type="spellEnd"/>
-      <w:r>
-        <w:t xml:space="preserve">, although I probably am, </w:t>
-      </w:r>
-      <w:r>
-        <w:t xml:space="preserve">just to get that power. Power that makes me say what I </w:t>
-      </w:r>
-      <w:r>
-        <w:t>want to</w:t>
-      </w:r>
-      <w:r>
-        <w:t xml:space="preserve"> say, whenever I want, however I want</w:t>
-      </w:r>
-      <w:r>
-        <w:t xml:space="preserve"> and be untouchable</w:t>
-      </w:r>
-      <w:r>
-        <w:t>.</w:t>
-      </w:r>
-      <w:r>
-        <w:t xml:space="preserve"> But </w:t>
-      </w:r>
-      <w:proofErr w:type="gramStart"/>
-      <w:r>
-        <w:t>how much safety</w:t>
-      </w:r>
-      <w:proofErr w:type="gramEnd"/>
-      <w:r>
-        <w:t xml:space="preserve"> am I willing to trade for it? Because it</w:t>
-      </w:r>
-      <w:r>
-        <w:t xml:space="preserve">’s </w:t>
-      </w:r>
-      <w:r>
-        <w:t>never</w:t>
-      </w:r>
-      <w:r>
-        <w:t xml:space="preserve"> </w:t>
-      </w:r>
-      <w:proofErr w:type="spellStart"/>
-      <w:r>
-        <w:t>gonna</w:t>
-      </w:r>
-      <w:proofErr w:type="spellEnd"/>
-      <w:r>
-        <w:t xml:space="preserve"> stop, </w:t>
-      </w:r>
-      <w:r>
-        <w:t>I will try to poke people where it hurts and they will do the same to me, because everybody wants power.</w:t>
-      </w:r>
-    </w:p>
-    <w:p>
-      <w:r>
-        <w:t>And when I saw</w:t>
-      </w:r>
-      <w:r>
-        <w:t xml:space="preserve"> an alternative,</w:t>
-      </w:r>
-      <w:r>
-        <w:t xml:space="preserve"> real healthy </w:t>
-      </w:r>
-      <w:proofErr w:type="gramStart"/>
-      <w:r>
-        <w:t>relationships</w:t>
-      </w:r>
-      <w:proofErr w:type="gramEnd"/>
-      <w:r>
-        <w:t>, where respect and boundaries exist</w:t>
-      </w:r>
-      <w:r>
-        <w:t xml:space="preserve">, all I wanted to do was burn them to the ground, based on the presumption that they are just weak. But let’s be real, I was </w:t>
-      </w:r>
-      <w:r>
-        <w:t>the one who is weak</w:t>
-      </w:r>
-      <w:r>
-        <w:t>.</w:t>
-      </w:r>
-    </w:p>
-    <w:p>
-      <w:r>
-        <w:t>It’s fucking bullshit, isn’t it?</w:t>
-      </w:r>
-    </w:p>
-    <w:p>
-      <w:r>
-        <w:t>(Screen goes back to normal through blur)</w:t>
+    </w:p>
+    <w:p>
+      <w:r>
+        <w:t xml:space="preserve">It’s fucking </w:t>
+      </w:r>
+      <w:r>
+        <w:t>stupid</w:t>
+      </w:r>
+      <w:r>
+        <w:t>, isn’t it?</w:t>
+      </w:r>
+    </w:p>
+    <w:p>
+      <w:r>
+        <w:t>(Screen goes</w:t>
+      </w:r>
+      <w:r>
+        <w:t xml:space="preserve"> to blur, white disappears and goes</w:t>
+      </w:r>
+      <w:r>
+        <w:t xml:space="preserve"> back to normal)</w:t>
       </w:r>
     </w:p>
     <w:p>
@@ -9298,6 +9404,9 @@
     <w:p>
       <w:r>
         <w:t>oh wow</w:t>
+      </w:r>
+      <w:r>
+        <w:t>.</w:t>
       </w:r>
     </w:p>
     <w:p>

</xml_diff>

<commit_message>
script.json new script applied
</commit_message>
<xml_diff>
--- a/docs/Script.docx
+++ b/docs/Script.docx
@@ -19,7 +19,17 @@
           <w:szCs w:val="40"/>
           <w:lang w:val="en-AU"/>
         </w:rPr>
-        <w:t>B v</w:t>
+        <w:t xml:space="preserve">B </w:t>
+      </w:r>
+      <w:proofErr w:type="spellStart"/>
+      <w:r>
+        <w:rPr>
+          <w:color w:val="501549" w:themeColor="accent5" w:themeShade="80"/>
+          <w:sz w:val="40"/>
+          <w:szCs w:val="40"/>
+          <w:lang w:val="en-AU"/>
+        </w:rPr>
+        <w:t>v</w:t>
       </w:r>
       <w:r>
         <w:rPr>
@@ -30,6 +40,7 @@
         </w:rPr>
         <w:t>Script</w:t>
       </w:r>
+      <w:proofErr w:type="spellEnd"/>
     </w:p>
     <w:sdt>
       <w:sdtPr>
@@ -1477,7 +1488,15 @@
         </w:numPr>
       </w:pPr>
       <w:r>
-        <w:t>Intro still lowk blows</w:t>
+        <w:t xml:space="preserve">Intro still </w:t>
+      </w:r>
+      <w:proofErr w:type="spellStart"/>
+      <w:r>
+        <w:t>lowk</w:t>
+      </w:r>
+      <w:proofErr w:type="spellEnd"/>
+      <w:r>
+        <w:t xml:space="preserve"> blows</w:t>
       </w:r>
     </w:p>
     <w:p>
@@ -1525,7 +1544,25 @@
         </w:numPr>
       </w:pPr>
       <w:r>
-        <w:t>Make main hero alittle bit more softer, so he is more relatable rather than cringe</w:t>
+        <w:t xml:space="preserve">Make main hero </w:t>
+      </w:r>
+      <w:proofErr w:type="spellStart"/>
+      <w:proofErr w:type="gramStart"/>
+      <w:r>
+        <w:t>alittle</w:t>
+      </w:r>
+      <w:proofErr w:type="spellEnd"/>
+      <w:proofErr w:type="gramEnd"/>
+      <w:r>
+        <w:t xml:space="preserve"> bit </w:t>
+      </w:r>
+      <w:proofErr w:type="gramStart"/>
+      <w:r>
+        <w:t>more softer</w:t>
+      </w:r>
+      <w:proofErr w:type="gramEnd"/>
+      <w:r>
+        <w:t>, so he is more relatable rather than cringe</w:t>
       </w:r>
     </w:p>
     <w:p>
@@ -1538,7 +1575,15 @@
       </w:pPr>
       <w:r>
         <w:lastRenderedPageBreak/>
-        <w:t xml:space="preserve">Consistency in chat users behavior </w:t>
+        <w:t xml:space="preserve">Consistency in chat </w:t>
+      </w:r>
+      <w:proofErr w:type="gramStart"/>
+      <w:r>
+        <w:t>users</w:t>
+      </w:r>
+      <w:proofErr w:type="gramEnd"/>
+      <w:r>
+        <w:t xml:space="preserve"> behavior </w:t>
       </w:r>
     </w:p>
     <w:p>
@@ -1669,10 +1714,12 @@
         <w:ind w:left="720"/>
       </w:pPr>
       <w:bookmarkStart w:id="5" w:name="_Toc231307569"/>
+      <w:proofErr w:type="spellStart"/>
       <w:r>
         <w:t>Main_hero</w:t>
       </w:r>
       <w:bookmarkEnd w:id="5"/>
+      <w:proofErr w:type="spellEnd"/>
     </w:p>
     <w:p>
       <w:pPr>
@@ -1701,7 +1748,15 @@
         <w:t xml:space="preserve"> of a story, a</w:t>
       </w:r>
       <w:r>
-        <w:t xml:space="preserve"> guy who doesn’t have a real life and spends all his time on The Forum</w:t>
+        <w:t xml:space="preserve"> guy who doesn’t have </w:t>
+      </w:r>
+      <w:proofErr w:type="gramStart"/>
+      <w:r>
+        <w:t>a real</w:t>
+      </w:r>
+      <w:proofErr w:type="gramEnd"/>
+      <w:r>
+        <w:t xml:space="preserve"> life and spends all his time on The Forum</w:t>
       </w:r>
     </w:p>
     <w:p>
@@ -1793,9 +1848,11 @@
       <w:r>
         <w:t xml:space="preserve">00hours in </w:t>
       </w:r>
+      <w:proofErr w:type="spellStart"/>
       <w:r>
         <w:t>cyberdivers</w:t>
       </w:r>
+      <w:proofErr w:type="spellEnd"/>
       <w:r>
         <w:t>, but still is bad at the game</w:t>
       </w:r>
@@ -1847,8 +1904,13 @@
           <w:numId w:val="1"/>
         </w:numPr>
       </w:pPr>
-      <w:r>
-        <w:t>Spends a lot of time online</w:t>
+      <w:proofErr w:type="gramStart"/>
+      <w:r>
+        <w:t>Spends</w:t>
+      </w:r>
+      <w:proofErr w:type="gramEnd"/>
+      <w:r>
+        <w:t xml:space="preserve"> a lot of time online</w:t>
       </w:r>
     </w:p>
     <w:p>
@@ -1860,7 +1922,15 @@
         </w:numPr>
       </w:pPr>
       <w:r>
-        <w:t>He trapped in the cyberdivers community, because he hates being bullied, but at the same time, he is afraid to lose his only “friends”.</w:t>
+        <w:t xml:space="preserve">He trapped in the </w:t>
+      </w:r>
+      <w:proofErr w:type="spellStart"/>
+      <w:r>
+        <w:t>cyberdivers</w:t>
+      </w:r>
+      <w:proofErr w:type="spellEnd"/>
+      <w:r>
+        <w:t xml:space="preserve"> community, because he hates being bullied, but at the same time, he is afraid to lose his only “friends”.</w:t>
       </w:r>
       <w:r>
         <w:t xml:space="preserve"> He believes that being able to endure that is strong</w:t>
@@ -1938,13 +2008,45 @@
         </w:numPr>
       </w:pPr>
       <w:r>
-        <w:t xml:space="preserve">First main_hero develops an exact copy of the The Forum login page, post page and server side. During phishing attack, main_hero will ask an admin of the </w:t>
+        <w:t xml:space="preserve">First </w:t>
+      </w:r>
+      <w:proofErr w:type="spellStart"/>
+      <w:r>
+        <w:t>main_hero</w:t>
+      </w:r>
+      <w:proofErr w:type="spellEnd"/>
+      <w:r>
+        <w:t xml:space="preserve"> develops an exact copy of the </w:t>
+      </w:r>
+      <w:proofErr w:type="spellStart"/>
+      <w:r>
+        <w:t>The</w:t>
+      </w:r>
+      <w:proofErr w:type="spellEnd"/>
+      <w:r>
+        <w:t xml:space="preserve"> Forum login page, post page and server side. During phishing attack, </w:t>
+      </w:r>
+      <w:proofErr w:type="spellStart"/>
+      <w:r>
+        <w:t>main_hero</w:t>
+      </w:r>
+      <w:proofErr w:type="spellEnd"/>
+      <w:r>
+        <w:t xml:space="preserve"> will ask an admin of the </w:t>
       </w:r>
       <w:r>
         <w:t>cycle</w:t>
       </w:r>
       <w:r>
-        <w:t xml:space="preserve"> to check out the post, saying it’s should be taken down for inappropriate content. </w:t>
+        <w:t xml:space="preserve"> to check out the post, saying </w:t>
+      </w:r>
+      <w:proofErr w:type="gramStart"/>
+      <w:r>
+        <w:t>it’s should be</w:t>
+      </w:r>
+      <w:proofErr w:type="gramEnd"/>
+      <w:r>
+        <w:t xml:space="preserve"> taken down for inappropriate content. </w:t>
       </w:r>
     </w:p>
     <w:p>
@@ -1956,7 +2058,39 @@
         </w:numPr>
       </w:pPr>
       <w:r>
-        <w:t>Admin will see the fake post, will try to delete it, but delete action will redirect him to the fake login page. Admin will login, and proceed to remove non-existent post on the fake page. His creds will be send to the server</w:t>
+        <w:t xml:space="preserve">Admin will see the fake post, will try to delete it, but </w:t>
+      </w:r>
+      <w:proofErr w:type="gramStart"/>
+      <w:r>
+        <w:t>delete</w:t>
+      </w:r>
+      <w:proofErr w:type="gramEnd"/>
+      <w:r>
+        <w:t xml:space="preserve"> action will redirect him to the fake login page. Admin will </w:t>
+      </w:r>
+      <w:proofErr w:type="gramStart"/>
+      <w:r>
+        <w:t>login, and</w:t>
+      </w:r>
+      <w:proofErr w:type="gramEnd"/>
+      <w:r>
+        <w:t xml:space="preserve"> proceed to remove non-existent </w:t>
+      </w:r>
+      <w:proofErr w:type="gramStart"/>
+      <w:r>
+        <w:t>post</w:t>
+      </w:r>
+      <w:proofErr w:type="gramEnd"/>
+      <w:r>
+        <w:t xml:space="preserve"> on the fake page. His creds will be </w:t>
+      </w:r>
+      <w:proofErr w:type="gramStart"/>
+      <w:r>
+        <w:t>send</w:t>
+      </w:r>
+      <w:proofErr w:type="gramEnd"/>
+      <w:r>
+        <w:t xml:space="preserve"> to the server</w:t>
       </w:r>
       <w:r>
         <w:t>.</w:t>
@@ -1971,7 +2105,15 @@
         </w:numPr>
       </w:pPr>
       <w:r>
-        <w:t>After main_hero obtains the creds</w:t>
+        <w:t xml:space="preserve">After </w:t>
+      </w:r>
+      <w:proofErr w:type="spellStart"/>
+      <w:r>
+        <w:t>main_hero</w:t>
+      </w:r>
+      <w:proofErr w:type="spellEnd"/>
+      <w:r>
+        <w:t xml:space="preserve"> obtains the creds</w:t>
       </w:r>
       <w:r>
         <w:t xml:space="preserve">, </w:t>
@@ -1979,14 +2121,24 @@
       <w:r>
         <w:t xml:space="preserve">he logins into the admin’s account. </w:t>
       </w:r>
+      <w:proofErr w:type="spellStart"/>
       <w:r>
         <w:t>Main_hero</w:t>
       </w:r>
+      <w:proofErr w:type="spellEnd"/>
       <w:r>
         <w:t xml:space="preserve"> first</w:t>
       </w:r>
       <w:r>
-        <w:t xml:space="preserve"> has to </w:t>
+        <w:t xml:space="preserve"> </w:t>
+      </w:r>
+      <w:proofErr w:type="gramStart"/>
+      <w:r>
+        <w:t>has to</w:t>
+      </w:r>
+      <w:proofErr w:type="gramEnd"/>
+      <w:r>
+        <w:t xml:space="preserve"> </w:t>
       </w:r>
       <w:r>
         <w:t xml:space="preserve">demote all the mods on this subforum. Then he will transfer the ownership of this subforum to </w:t>
@@ -1997,8 +2149,13 @@
       <w:r>
         <w:t xml:space="preserve"> account. After that, he’ll let </w:t>
       </w:r>
-      <w:r>
-        <w:t>cyberdivers know</w:t>
+      <w:proofErr w:type="spellStart"/>
+      <w:r>
+        <w:t>cyberdivers</w:t>
+      </w:r>
+      <w:proofErr w:type="spellEnd"/>
+      <w:r>
+        <w:t xml:space="preserve"> know</w:t>
       </w:r>
       <w:r>
         <w:t xml:space="preserve"> that he owns the sub now and they can flood it with whatever they want</w:t>
@@ -2012,9 +2169,11 @@
           <w:numId w:val="1"/>
         </w:numPr>
       </w:pPr>
+      <w:proofErr w:type="spellStart"/>
       <w:r>
         <w:t>Cyberdivers</w:t>
       </w:r>
+      <w:proofErr w:type="spellEnd"/>
       <w:r>
         <w:t xml:space="preserve"> </w:t>
       </w:r>
@@ -2168,10 +2327,12 @@
         <w:ind w:left="720"/>
       </w:pPr>
       <w:bookmarkStart w:id="8" w:name="_Toc231307571"/>
+      <w:proofErr w:type="spellStart"/>
       <w:r>
         <w:lastRenderedPageBreak/>
         <w:t>Cyberdivers</w:t>
       </w:r>
+      <w:proofErr w:type="spellEnd"/>
       <w:r>
         <w:t xml:space="preserve"> </w:t>
       </w:r>
@@ -2245,9 +2406,11 @@
         </w:rPr>
         <w:t xml:space="preserve"> for the game </w:t>
       </w:r>
+      <w:proofErr w:type="spellStart"/>
       <w:r>
         <w:t>Cyberdivers</w:t>
       </w:r>
+      <w:proofErr w:type="spellEnd"/>
       <w:r>
         <w:t xml:space="preserve"> made by Spearhead</w:t>
       </w:r>
@@ -2312,7 +2475,21 @@
         <w:rPr>
           <w:lang w:val="en-AU"/>
         </w:rPr>
-        <w:t>hackers. AI faction consists of big, powerful, but dumb and small in numbers enemies. Bugs are small, big in numbers and popping up everywhere. Hackers are represented as sneaky squids, where tentacles could go through the walls, medium sized enemies and smartest of them all.</w:t>
+        <w:t xml:space="preserve">hackers. AI faction consists of big, powerful, but dumb and small in </w:t>
+      </w:r>
+      <w:proofErr w:type="gramStart"/>
+      <w:r>
+        <w:rPr>
+          <w:lang w:val="en-AU"/>
+        </w:rPr>
+        <w:t>numbers</w:t>
+      </w:r>
+      <w:proofErr w:type="gramEnd"/>
+      <w:r>
+        <w:rPr>
+          <w:lang w:val="en-AU"/>
+        </w:rPr>
+        <w:t xml:space="preserve"> enemies. Bugs are small, big in numbers and popping up everywhere. Hackers are represented as sneaky squids, where tentacles could go through the walls, medium sized enemies and smartest of them all.</w:t>
       </w:r>
       <w:r>
         <w:rPr>
@@ -2444,7 +2621,15 @@
         </w:numPr>
       </w:pPr>
       <w:r>
-        <w:t>People have love and hate relationship with the game, many play just because sunk cost fallacy.</w:t>
+        <w:t xml:space="preserve">People have love and hate </w:t>
+      </w:r>
+      <w:proofErr w:type="gramStart"/>
+      <w:r>
+        <w:t>relationship</w:t>
+      </w:r>
+      <w:proofErr w:type="gramEnd"/>
+      <w:r>
+        <w:t xml:space="preserve"> with the game, many play just because sunk cost fallacy.</w:t>
       </w:r>
     </w:p>
     <w:p>
@@ -2470,8 +2655,29 @@
           <w:numId w:val="1"/>
         </w:numPr>
       </w:pPr>
-      <w:r>
-        <w:t>Main_hero played together with some people and they saw how bad he is, so now he is a laughing stock in the chat</w:t>
+      <w:proofErr w:type="spellStart"/>
+      <w:r>
+        <w:t>Main_hero</w:t>
+      </w:r>
+      <w:proofErr w:type="spellEnd"/>
+      <w:r>
+        <w:t xml:space="preserve"> played together with some </w:t>
+      </w:r>
+      <w:proofErr w:type="gramStart"/>
+      <w:r>
+        <w:t>people</w:t>
+      </w:r>
+      <w:proofErr w:type="gramEnd"/>
+      <w:r>
+        <w:t xml:space="preserve"> and they saw how bad he is, so now he is a </w:t>
+      </w:r>
+      <w:proofErr w:type="gramStart"/>
+      <w:r>
+        <w:t>laughing stock</w:t>
+      </w:r>
+      <w:proofErr w:type="gramEnd"/>
+      <w:r>
+        <w:t xml:space="preserve"> in the chat</w:t>
       </w:r>
     </w:p>
     <w:p>
@@ -2482,8 +2688,21 @@
           <w:numId w:val="1"/>
         </w:numPr>
       </w:pPr>
-      <w:r>
-        <w:t>Main_hero is quite active in the chat and always tries to prove how good he is</w:t>
+      <w:proofErr w:type="spellStart"/>
+      <w:r>
+        <w:t>Main_hero</w:t>
+      </w:r>
+      <w:proofErr w:type="spellEnd"/>
+      <w:r>
+        <w:t xml:space="preserve"> is quite active </w:t>
+      </w:r>
+      <w:proofErr w:type="gramStart"/>
+      <w:r>
+        <w:t>in the chat</w:t>
+      </w:r>
+      <w:proofErr w:type="gramEnd"/>
+      <w:r>
+        <w:t xml:space="preserve"> and always tries to prove how good he is</w:t>
       </w:r>
     </w:p>
     <w:p>
@@ -2503,9 +2722,11 @@
       <w:r>
         <w:t xml:space="preserve">, because it was released by the same publisher and instead of updates for </w:t>
       </w:r>
+      <w:proofErr w:type="spellStart"/>
       <w:r>
         <w:t>cyberdivers</w:t>
       </w:r>
+      <w:proofErr w:type="spellEnd"/>
       <w:r>
         <w:t xml:space="preserve"> they got </w:t>
       </w:r>
@@ -2534,11 +2755,21 @@
         </w:numPr>
       </w:pPr>
       <w:r>
-        <w:t xml:space="preserve">They bully main_hero for playing bad in </w:t>
-      </w:r>
+        <w:t xml:space="preserve">They bully </w:t>
+      </w:r>
+      <w:proofErr w:type="spellStart"/>
+      <w:r>
+        <w:t>main_hero</w:t>
+      </w:r>
+      <w:proofErr w:type="spellEnd"/>
+      <w:r>
+        <w:t xml:space="preserve"> for playing bad in </w:t>
+      </w:r>
+      <w:proofErr w:type="spellStart"/>
       <w:r>
         <w:t>cyberdivers</w:t>
       </w:r>
+      <w:proofErr w:type="spellEnd"/>
       <w:r>
         <w:t xml:space="preserve"> yet bragging how good he is</w:t>
       </w:r>
@@ -2552,7 +2783,15 @@
         </w:numPr>
       </w:pPr>
       <w:r>
-        <w:t>After main_hero comes to them</w:t>
+        <w:t xml:space="preserve">After </w:t>
+      </w:r>
+      <w:proofErr w:type="spellStart"/>
+      <w:r>
+        <w:t>main_hero</w:t>
+      </w:r>
+      <w:proofErr w:type="spellEnd"/>
+      <w:r>
+        <w:t xml:space="preserve"> comes to them</w:t>
       </w:r>
       <w:r>
         <w:t xml:space="preserve"> </w:t>
@@ -2570,10 +2809,26 @@
         <w:t>sub</w:t>
       </w:r>
       <w:r>
-        <w:t xml:space="preserve"> at first praises main_hero, but some people downplay it, saying it’s nothing special</w:t>
-      </w:r>
-      <w:r>
-        <w:t>, trying to bring main_hero down to his level, reassert themselves at his expense.</w:t>
+        <w:t xml:space="preserve"> at first praises </w:t>
+      </w:r>
+      <w:proofErr w:type="spellStart"/>
+      <w:r>
+        <w:t>main_hero</w:t>
+      </w:r>
+      <w:proofErr w:type="spellEnd"/>
+      <w:r>
+        <w:t>, but some people downplay it, saying it’s nothing special</w:t>
+      </w:r>
+      <w:r>
+        <w:t xml:space="preserve">, trying to bring </w:t>
+      </w:r>
+      <w:proofErr w:type="spellStart"/>
+      <w:r>
+        <w:t>main_hero</w:t>
+      </w:r>
+      <w:proofErr w:type="spellEnd"/>
+      <w:r>
+        <w:t xml:space="preserve"> down to his level, reassert themselves at his expense.</w:t>
       </w:r>
     </w:p>
     <w:p>
@@ -2638,9 +2893,11 @@
         </w:rPr>
         <w:t xml:space="preserve"> </w:t>
       </w:r>
+      <w:proofErr w:type="spellStart"/>
       <w:r>
         <w:t>pinchIt</w:t>
       </w:r>
+      <w:proofErr w:type="spellEnd"/>
     </w:p>
     <w:p>
       <w:pPr>
@@ -2664,9 +2921,11 @@
         </w:rPr>
         <w:t xml:space="preserve"> </w:t>
       </w:r>
+      <w:proofErr w:type="spellStart"/>
       <w:r>
         <w:t>MironYanch</w:t>
       </w:r>
+      <w:proofErr w:type="spellEnd"/>
     </w:p>
     <w:p>
       <w:pPr>
@@ -2679,9 +2938,11 @@
       <w:r>
         <w:t xml:space="preserve">User 3: </w:t>
       </w:r>
+      <w:proofErr w:type="spellStart"/>
       <w:r>
         <w:t>caffeine_up_the_ass</w:t>
       </w:r>
+      <w:proofErr w:type="spellEnd"/>
     </w:p>
     <w:p>
       <w:pPr>
@@ -2694,9 +2955,11 @@
       <w:r>
         <w:t xml:space="preserve">User 4: </w:t>
       </w:r>
+      <w:proofErr w:type="spellStart"/>
       <w:r>
         <w:t>musky_diver</w:t>
       </w:r>
+      <w:proofErr w:type="spellEnd"/>
     </w:p>
     <w:p>
       <w:pPr>
@@ -2709,9 +2972,11 @@
       <w:r>
         <w:t xml:space="preserve">User 5: </w:t>
       </w:r>
+      <w:proofErr w:type="spellStart"/>
       <w:r>
         <w:t>do_not_the_dog</w:t>
       </w:r>
+      <w:proofErr w:type="spellEnd"/>
     </w:p>
     <w:p>
       <w:pPr>
@@ -2724,9 +2989,11 @@
       <w:r>
         <w:t xml:space="preserve">User 6: </w:t>
       </w:r>
+      <w:proofErr w:type="spellStart"/>
       <w:r>
         <w:t>ink_and_iron</w:t>
       </w:r>
+      <w:proofErr w:type="spellEnd"/>
     </w:p>
     <w:p>
       <w:pPr>
@@ -2766,8 +3033,13 @@
         <w:t>User 8:</w:t>
       </w:r>
       <w:r>
-        <w:t xml:space="preserve"> SmoothOperator</w:t>
-      </w:r>
+        <w:t xml:space="preserve"> </w:t>
+      </w:r>
+      <w:proofErr w:type="spellStart"/>
+      <w:r>
+        <w:t>SmoothOperator</w:t>
+      </w:r>
+      <w:proofErr w:type="spellEnd"/>
     </w:p>
     <w:p>
       <w:pPr>
@@ -2791,9 +3063,11 @@
         </w:rPr>
         <w:t xml:space="preserve"> </w:t>
       </w:r>
+      <w:proofErr w:type="spellStart"/>
       <w:r>
         <w:t>DarkSolace</w:t>
       </w:r>
+      <w:proofErr w:type="spellEnd"/>
     </w:p>
     <w:p>
       <w:pPr>
@@ -2817,9 +3091,11 @@
         </w:rPr>
         <w:t xml:space="preserve"> </w:t>
       </w:r>
+      <w:proofErr w:type="spellStart"/>
       <w:r>
         <w:t>clanker_oil_stain</w:t>
       </w:r>
+      <w:proofErr w:type="spellEnd"/>
     </w:p>
     <w:p>
       <w:pPr>
@@ -2921,9 +3197,11 @@
         </w:rPr>
         <w:t xml:space="preserve"> </w:t>
       </w:r>
+      <w:proofErr w:type="spellStart"/>
       <w:r>
         <w:t>buggedFeature</w:t>
       </w:r>
+      <w:proofErr w:type="spellEnd"/>
     </w:p>
     <w:p>
       <w:pPr>
@@ -2936,9 +3214,11 @@
       <w:r>
         <w:t xml:space="preserve">User 15: </w:t>
       </w:r>
+      <w:proofErr w:type="spellStart"/>
       <w:r>
         <w:t>brundmartindle</w:t>
       </w:r>
+      <w:proofErr w:type="spellEnd"/>
     </w:p>
     <w:p>
       <w:pPr>
@@ -2980,9 +3260,11 @@
       <w:r>
         <w:t xml:space="preserve"> imaginary friend of </w:t>
       </w:r>
+      <w:proofErr w:type="spellStart"/>
       <w:r>
         <w:t>main_hero</w:t>
       </w:r>
+      <w:proofErr w:type="spellEnd"/>
       <w:r>
         <w:t>, with whom he talks in internal monologues that he writes in the notepad (fake one). Breaks 4</w:t>
       </w:r>
@@ -3166,13 +3448,29 @@
         <w:t>.</w:t>
       </w:r>
       <w:r>
-        <w:t xml:space="preserve"> Story is set in the same universe as Cyberdivers and roughly is about a hacker, who used to breach different</w:t>
+        <w:t xml:space="preserve"> Story is set in the same universe as </w:t>
+      </w:r>
+      <w:proofErr w:type="spellStart"/>
+      <w:r>
+        <w:t>Cyberdivers</w:t>
+      </w:r>
+      <w:proofErr w:type="spellEnd"/>
+      <w:r>
+        <w:t xml:space="preserve"> and roughly is about a hacker, who used to breach different</w:t>
       </w:r>
       <w:r>
         <w:t xml:space="preserve"> companies</w:t>
       </w:r>
       <w:r>
-        <w:t xml:space="preserve"> for profit, cuz he thought he was smarter than everyone </w:t>
+        <w:t xml:space="preserve"> for profit, </w:t>
+      </w:r>
+      <w:proofErr w:type="spellStart"/>
+      <w:r>
+        <w:t>cuz</w:t>
+      </w:r>
+      <w:proofErr w:type="spellEnd"/>
+      <w:r>
+        <w:t xml:space="preserve"> he thought he was smarter than everyone </w:t>
       </w:r>
       <w:r>
         <w:lastRenderedPageBreak/>
@@ -3182,7 +3480,23 @@
         <w:t>tter</w:t>
       </w:r>
       <w:r>
-        <w:t>, but in the end they separated, cuz ai girlfriend is not real (</w:t>
+        <w:t xml:space="preserve">, but in the </w:t>
+      </w:r>
+      <w:proofErr w:type="gramStart"/>
+      <w:r>
+        <w:t>end</w:t>
+      </w:r>
+      <w:proofErr w:type="gramEnd"/>
+      <w:r>
+        <w:t xml:space="preserve"> they separated, </w:t>
+      </w:r>
+      <w:proofErr w:type="spellStart"/>
+      <w:r>
+        <w:t>cuz</w:t>
+      </w:r>
+      <w:proofErr w:type="spellEnd"/>
+      <w:r>
+        <w:t xml:space="preserve"> ai girlfriend is not real (</w:t>
       </w:r>
       <w:r>
         <w:t xml:space="preserve">peak fiction). </w:t>
@@ -3218,7 +3532,15 @@
         </w:numPr>
       </w:pPr>
       <w:r>
-        <w:t>Posts are memes about game, some tips about completing the game and story discussions.</w:t>
+        <w:t xml:space="preserve">Posts are memes about </w:t>
+      </w:r>
+      <w:proofErr w:type="gramStart"/>
+      <w:r>
+        <w:t>game</w:t>
+      </w:r>
+      <w:proofErr w:type="gramEnd"/>
+      <w:r>
+        <w:t>, some tips about completing the game and story discussions.</w:t>
       </w:r>
     </w:p>
     <w:p>
@@ -3266,7 +3588,15 @@
         </w:numPr>
       </w:pPr>
       <w:r>
-        <w:t>Game is inspired by halo and god of war 2018</w:t>
+        <w:t xml:space="preserve">Game is inspired by halo and </w:t>
+      </w:r>
+      <w:proofErr w:type="gramStart"/>
+      <w:r>
+        <w:t>god</w:t>
+      </w:r>
+      <w:proofErr w:type="gramEnd"/>
+      <w:r>
+        <w:t xml:space="preserve"> of war 2018</w:t>
       </w:r>
     </w:p>
     <w:p>
@@ -3372,8 +3702,13 @@
         </w:numPr>
       </w:pPr>
       <w:r>
-        <w:t>Not tech savy</w:t>
-      </w:r>
+        <w:t xml:space="preserve">Not tech </w:t>
+      </w:r>
+      <w:proofErr w:type="spellStart"/>
+      <w:r>
+        <w:t>savy</w:t>
+      </w:r>
+      <w:proofErr w:type="spellEnd"/>
     </w:p>
     <w:p>
       <w:pPr>
@@ -3433,23 +3768,56 @@
       <w:bookmarkEnd w:id="13"/>
     </w:p>
     <w:p>
-      <w:r>
-        <w:t xml:space="preserve">Main_hero </w:t>
+      <w:proofErr w:type="spellStart"/>
+      <w:r>
+        <w:t>Main_hero</w:t>
+      </w:r>
+      <w:proofErr w:type="spellEnd"/>
+      <w:r>
+        <w:t xml:space="preserve"> </w:t>
       </w:r>
       <w:r>
         <w:t xml:space="preserve">starts talking about himself. He first states that he wants to write a book and decided he needs to write all his thoughts, so he could use them later. He then proceeds to talk about his skills in </w:t>
       </w:r>
+      <w:proofErr w:type="spellStart"/>
       <w:r>
         <w:t>cyberdivers</w:t>
       </w:r>
-      <w:r>
-        <w:t xml:space="preserve">, how he is good in it and how many hours he’s got. He shows his stats on the profile, but it has long streak of </w:t>
-      </w:r>
-      <w:r>
-        <w:t>failed extrractions and bad stats</w:t>
-      </w:r>
-      <w:r>
-        <w:t xml:space="preserve"> and main_hero justifies himself by saying that matchmaking is fucked, </w:t>
+      <w:proofErr w:type="spellEnd"/>
+      <w:r>
+        <w:t xml:space="preserve">, how he is good </w:t>
+      </w:r>
+      <w:proofErr w:type="gramStart"/>
+      <w:r>
+        <w:t>in</w:t>
+      </w:r>
+      <w:proofErr w:type="gramEnd"/>
+      <w:r>
+        <w:t xml:space="preserve"> it and how many hours he’s got. He shows his stats on the profile, but it has long streak of </w:t>
+      </w:r>
+      <w:r>
+        <w:t xml:space="preserve">failed </w:t>
+      </w:r>
+      <w:proofErr w:type="spellStart"/>
+      <w:proofErr w:type="gramStart"/>
+      <w:r>
+        <w:t>extrractions</w:t>
+      </w:r>
+      <w:proofErr w:type="spellEnd"/>
+      <w:proofErr w:type="gramEnd"/>
+      <w:r>
+        <w:t xml:space="preserve"> and bad stats</w:t>
+      </w:r>
+      <w:r>
+        <w:t xml:space="preserve"> and </w:t>
+      </w:r>
+      <w:proofErr w:type="spellStart"/>
+      <w:r>
+        <w:t>main_hero</w:t>
+      </w:r>
+      <w:proofErr w:type="spellEnd"/>
+      <w:r>
+        <w:t xml:space="preserve"> justifies himself by saying that matchmaking is fucked, </w:t>
       </w:r>
       <w:r>
         <w:t>balance is cooked and everything is bugged</w:t>
@@ -3457,9 +3825,11 @@
       <w:r>
         <w:t xml:space="preserve">. He then says that he is well respected in the </w:t>
       </w:r>
+      <w:proofErr w:type="spellStart"/>
       <w:r>
         <w:t>cyberdivers</w:t>
       </w:r>
+      <w:proofErr w:type="spellEnd"/>
       <w:r>
         <w:t xml:space="preserve"> community </w:t>
       </w:r>
@@ -3477,13 +3847,50 @@
         <w:t xml:space="preserve"> and even played with them and showed himself pretty good</w:t>
       </w:r>
       <w:r>
-        <w:t>.  He says smth like “yo” and instantly gets flamed</w:t>
-      </w:r>
-      <w:r>
-        <w:t xml:space="preserve"> and mocked for his recent game with the community and his overall perfomance</w:t>
-      </w:r>
-      <w:r>
-        <w:t>. Main_hero says that’s how they show affection to one another and it’s pretty normal.</w:t>
+        <w:t xml:space="preserve">.  He says </w:t>
+      </w:r>
+      <w:proofErr w:type="spellStart"/>
+      <w:r>
+        <w:t>smth</w:t>
+      </w:r>
+      <w:proofErr w:type="spellEnd"/>
+      <w:r>
+        <w:t xml:space="preserve"> like “</w:t>
+      </w:r>
+      <w:proofErr w:type="spellStart"/>
+      <w:r>
+        <w:t>yo</w:t>
+      </w:r>
+      <w:proofErr w:type="spellEnd"/>
+      <w:r>
+        <w:t>” and instantly gets flamed</w:t>
+      </w:r>
+      <w:r>
+        <w:t xml:space="preserve"> and mocked for his recent game with the community and his overall </w:t>
+      </w:r>
+      <w:proofErr w:type="spellStart"/>
+      <w:r>
+        <w:t>perfomance</w:t>
+      </w:r>
+      <w:proofErr w:type="spellEnd"/>
+      <w:r>
+        <w:t xml:space="preserve">. </w:t>
+      </w:r>
+      <w:proofErr w:type="spellStart"/>
+      <w:r>
+        <w:t>Main_hero</w:t>
+      </w:r>
+      <w:proofErr w:type="spellEnd"/>
+      <w:r>
+        <w:t xml:space="preserve"> says that’s how they show affection to one another and it’s </w:t>
+      </w:r>
+      <w:proofErr w:type="gramStart"/>
+      <w:r>
+        <w:t>pretty normal</w:t>
+      </w:r>
+      <w:proofErr w:type="gramEnd"/>
+      <w:r>
+        <w:t>.</w:t>
       </w:r>
     </w:p>
     <w:p>
@@ -3504,7 +3911,31 @@
         <w:t>zero</w:t>
       </w:r>
       <w:r>
-        <w:t xml:space="preserve"> just got their dlc delayed. Everyone celebrate that, including main_hero. He explains that because it’s because </w:t>
+        <w:t xml:space="preserve"> just got their </w:t>
+      </w:r>
+      <w:proofErr w:type="spellStart"/>
+      <w:r>
+        <w:t>dlc</w:t>
+      </w:r>
+      <w:proofErr w:type="spellEnd"/>
+      <w:r>
+        <w:t xml:space="preserve"> delayed. Everyone </w:t>
+      </w:r>
+      <w:proofErr w:type="gramStart"/>
+      <w:r>
+        <w:t>celebrate</w:t>
+      </w:r>
+      <w:proofErr w:type="gramEnd"/>
+      <w:r>
+        <w:t xml:space="preserve"> that, including </w:t>
+      </w:r>
+      <w:proofErr w:type="spellStart"/>
+      <w:r>
+        <w:t>main_hero</w:t>
+      </w:r>
+      <w:proofErr w:type="spellEnd"/>
+      <w:r>
+        <w:t xml:space="preserve">. He explains that because it’s because </w:t>
       </w:r>
       <w:r>
         <w:t>Spearhead Studios</w:t>
@@ -3512,9 +3943,11 @@
       <w:r>
         <w:t xml:space="preserve">, developer of </w:t>
       </w:r>
+      <w:proofErr w:type="spellStart"/>
       <w:r>
         <w:t>cyberdivers</w:t>
       </w:r>
+      <w:proofErr w:type="spellEnd"/>
       <w:r>
         <w:t xml:space="preserve"> and </w:t>
       </w:r>
@@ -3524,14 +3957,24 @@
       <w:r>
         <w:t xml:space="preserve">, instead of working on new content for </w:t>
       </w:r>
-      <w:r>
-        <w:t xml:space="preserve">cyberdivers </w:t>
+      <w:proofErr w:type="spellStart"/>
+      <w:r>
+        <w:t>cyberdivers</w:t>
+      </w:r>
+      <w:proofErr w:type="spellEnd"/>
+      <w:r>
+        <w:t xml:space="preserve"> </w:t>
       </w:r>
       <w:r>
         <w:t xml:space="preserve">decided to do a new single player, so now, </w:t>
       </w:r>
-      <w:r>
-        <w:t xml:space="preserve">cyberdivers </w:t>
+      <w:proofErr w:type="spellStart"/>
+      <w:r>
+        <w:t>cyberdivers</w:t>
+      </w:r>
+      <w:proofErr w:type="spellEnd"/>
+      <w:r>
+        <w:t xml:space="preserve"> </w:t>
       </w:r>
       <w:r>
         <w:t xml:space="preserve">sub </w:t>
@@ -3542,8 +3985,21 @@
       <w:r>
         <w:t xml:space="preserve">. </w:t>
       </w:r>
-      <w:r>
-        <w:t xml:space="preserve">Main_hero wonders, how did they take news of delayed dlc in </w:t>
+      <w:proofErr w:type="spellStart"/>
+      <w:r>
+        <w:t>Main_hero</w:t>
+      </w:r>
+      <w:proofErr w:type="spellEnd"/>
+      <w:r>
+        <w:t xml:space="preserve"> wonders, how did they take news of delayed </w:t>
+      </w:r>
+      <w:proofErr w:type="spellStart"/>
+      <w:r>
+        <w:t>dlc</w:t>
+      </w:r>
+      <w:proofErr w:type="spellEnd"/>
+      <w:r>
+        <w:t xml:space="preserve"> in </w:t>
       </w:r>
       <w:r>
         <w:t>zero</w:t>
@@ -3555,11 +4011,77 @@
         <w:t>zero</w:t>
       </w:r>
       <w:r>
-        <w:t xml:space="preserve"> fans are chill about it, saying that devs should take all the time they need to finish the dlc. In addition to that, main_hero sees all the helpful posts for newcomers, peaceful discussions and funny memes. That sets him off, main_hero becomes angry, and tries to come up with a reason why it’s all wrong and shouldn’t be like this. He says something like noobs should be mocked for their stupidity so they start think for themselves, discussions shouldn’t be that peaceful, because if everyone agree with everyone no truth can be found and etc. He then says that even tho </w:t>
-      </w:r>
+        <w:t xml:space="preserve"> fans are chill about it, saying that </w:t>
+      </w:r>
+      <w:proofErr w:type="spellStart"/>
+      <w:r>
+        <w:t>devs</w:t>
+      </w:r>
+      <w:proofErr w:type="spellEnd"/>
+      <w:r>
+        <w:t xml:space="preserve"> should take all the time they need to finish the </w:t>
+      </w:r>
+      <w:proofErr w:type="spellStart"/>
+      <w:r>
+        <w:t>dlc</w:t>
+      </w:r>
+      <w:proofErr w:type="spellEnd"/>
+      <w:r>
+        <w:t xml:space="preserve">. In addition to that, </w:t>
+      </w:r>
+      <w:proofErr w:type="spellStart"/>
+      <w:r>
+        <w:t>main_hero</w:t>
+      </w:r>
+      <w:proofErr w:type="spellEnd"/>
+      <w:r>
+        <w:t xml:space="preserve"> sees all the helpful posts for newcomers, peaceful discussions and funny memes. That sets him off, </w:t>
+      </w:r>
+      <w:proofErr w:type="spellStart"/>
+      <w:r>
+        <w:t>main_hero</w:t>
+      </w:r>
+      <w:proofErr w:type="spellEnd"/>
+      <w:r>
+        <w:t xml:space="preserve"> becomes angry, and tries to come up with a reason why it’s all wrong and shouldn’t be like this. He says something like noobs should be mocked for their stupidity so they start </w:t>
+      </w:r>
+      <w:proofErr w:type="gramStart"/>
+      <w:r>
+        <w:t>think</w:t>
+      </w:r>
+      <w:proofErr w:type="gramEnd"/>
+      <w:r>
+        <w:t xml:space="preserve"> for themselves, discussions shouldn’t be that peaceful, because if everyone </w:t>
+      </w:r>
+      <w:proofErr w:type="gramStart"/>
+      <w:r>
+        <w:t>agree</w:t>
+      </w:r>
+      <w:proofErr w:type="gramEnd"/>
+      <w:r>
+        <w:t xml:space="preserve"> with everyone no truth can be found </w:t>
+      </w:r>
+      <w:proofErr w:type="gramStart"/>
+      <w:r>
+        <w:t>and etc.</w:t>
+      </w:r>
+      <w:proofErr w:type="gramEnd"/>
+      <w:r>
+        <w:t xml:space="preserve"> He then says that even </w:t>
+      </w:r>
+      <w:proofErr w:type="spellStart"/>
+      <w:r>
+        <w:t>tho</w:t>
+      </w:r>
+      <w:proofErr w:type="spellEnd"/>
+      <w:r>
+        <w:t xml:space="preserve"> </w:t>
+      </w:r>
+      <w:proofErr w:type="spellStart"/>
       <w:r>
         <w:t>cyberdivers</w:t>
       </w:r>
+      <w:proofErr w:type="spellEnd"/>
       <w:r>
         <w:t xml:space="preserve"> community can be rude sometimes they are honest and do not pretend.</w:t>
       </w:r>
@@ -3567,13 +4089,34 @@
         <w:t xml:space="preserve"> It’s so much better than this </w:t>
       </w:r>
       <w:r>
-        <w:t xml:space="preserve">phoniness. He then remembers his days when his mom forced him to go do some programming courses, cuz he was spending too much time in </w:t>
-      </w:r>
-      <w:r>
-        <w:t xml:space="preserve">cyberdivers </w:t>
-      </w:r>
-      <w:r>
-        <w:t xml:space="preserve">(she didn’t how good he was in it, maybe if she supported him, he would be </w:t>
+        <w:t xml:space="preserve">phoniness. He then remembers his days when his mom forced him to go do some programming courses, </w:t>
+      </w:r>
+      <w:proofErr w:type="spellStart"/>
+      <w:r>
+        <w:t>cuz</w:t>
+      </w:r>
+      <w:proofErr w:type="spellEnd"/>
+      <w:r>
+        <w:t xml:space="preserve"> he was spending too much time in </w:t>
+      </w:r>
+      <w:proofErr w:type="spellStart"/>
+      <w:r>
+        <w:t>cyberdivers</w:t>
+      </w:r>
+      <w:proofErr w:type="spellEnd"/>
+      <w:r>
+        <w:t xml:space="preserve"> </w:t>
+      </w:r>
+      <w:r>
+        <w:t xml:space="preserve">(she didn’t how good he was </w:t>
+      </w:r>
+      <w:proofErr w:type="gramStart"/>
+      <w:r>
+        <w:t>in</w:t>
+      </w:r>
+      <w:proofErr w:type="gramEnd"/>
+      <w:r>
+        <w:t xml:space="preserve"> it, maybe if she supported him, he would be </w:t>
       </w:r>
       <w:r>
         <w:t>a successful twitch streamer</w:t>
@@ -3584,14 +4127,27 @@
       <w:r>
         <w:t xml:space="preserve"> and decides to do a phishing website and steal the creds of the admin of this subreddit, sillygoose228. He comes back to the </w:t>
       </w:r>
-      <w:r>
-        <w:t xml:space="preserve">cyberdivers </w:t>
+      <w:proofErr w:type="spellStart"/>
+      <w:r>
+        <w:t>cyberdivers</w:t>
+      </w:r>
+      <w:proofErr w:type="spellEnd"/>
+      <w:r>
+        <w:t xml:space="preserve"> </w:t>
       </w:r>
       <w:r>
         <w:t>chat and</w:t>
       </w:r>
       <w:r>
-        <w:t xml:space="preserve"> tells them about his intentions. Naturally, he gets mocked even harder, but now main_hero wants to prove them all wrong.</w:t>
+        <w:t xml:space="preserve"> tells them about his intentions. Naturally, he gets mocked even harder, but now </w:t>
+      </w:r>
+      <w:proofErr w:type="spellStart"/>
+      <w:r>
+        <w:t>main_hero</w:t>
+      </w:r>
+      <w:proofErr w:type="spellEnd"/>
+      <w:r>
+        <w:t xml:space="preserve"> wants to prove them all wrong.</w:t>
       </w:r>
     </w:p>
     <w:p>
@@ -3617,10 +4173,39 @@
         </w:r>
       </w:hyperlink>
       <w:r>
-        <w:t>. First he tries to come up with simpler plans tho</w:t>
-      </w:r>
-      <w:r>
-        <w:t xml:space="preserve">. Then main_hero opens up vim in the terminal as every cool coder uses vim. After getting stuck in and eventually getting out, he </w:t>
+        <w:t xml:space="preserve">. </w:t>
+      </w:r>
+      <w:proofErr w:type="gramStart"/>
+      <w:r>
+        <w:t>First</w:t>
+      </w:r>
+      <w:proofErr w:type="gramEnd"/>
+      <w:r>
+        <w:t xml:space="preserve"> he tries to come up with simpler plans </w:t>
+      </w:r>
+      <w:proofErr w:type="spellStart"/>
+      <w:r>
+        <w:t>tho</w:t>
+      </w:r>
+      <w:proofErr w:type="spellEnd"/>
+      <w:r>
+        <w:t xml:space="preserve">. Then </w:t>
+      </w:r>
+      <w:proofErr w:type="spellStart"/>
+      <w:r>
+        <w:t>main_hero</w:t>
+      </w:r>
+      <w:proofErr w:type="spellEnd"/>
+      <w:r>
+        <w:t xml:space="preserve"> </w:t>
+      </w:r>
+      <w:proofErr w:type="gramStart"/>
+      <w:r>
+        <w:t>opens up</w:t>
+      </w:r>
+      <w:proofErr w:type="gramEnd"/>
+      <w:r>
+        <w:t xml:space="preserve"> vim in the terminal as every cool coder uses vim. After getting stuck in and eventually getting out, he </w:t>
       </w:r>
       <w:r>
         <w:t xml:space="preserve">then realizes he remembers fuck all about coding. He then decides to </w:t>
@@ -3629,20 +4214,68 @@
         <w:t xml:space="preserve">ask ai for help, promising it’s only for consulting. Then we see him copy and pasting huge chunks of code. </w:t>
       </w:r>
       <w:r>
-        <w:t xml:space="preserve">After he is done, he sends the message to sillygoose228. He replies that he will look into it. Main_hero waits for a few minutes with terminal open, coping that everything is fine and it takes longer than it should probably because admin types slowly or forgot where </w:t>
+        <w:t xml:space="preserve">After he is done, he sends the message to sillygoose228. He replies that he will </w:t>
+      </w:r>
+      <w:proofErr w:type="gramStart"/>
+      <w:r>
+        <w:t>look into</w:t>
+      </w:r>
+      <w:proofErr w:type="gramEnd"/>
+      <w:r>
+        <w:t xml:space="preserve"> it. </w:t>
+      </w:r>
+      <w:proofErr w:type="spellStart"/>
+      <w:r>
+        <w:t>Main_hero</w:t>
+      </w:r>
+      <w:proofErr w:type="spellEnd"/>
+      <w:r>
+        <w:t xml:space="preserve"> waits for a few minutes with terminal open, coping that everything is fine and it takes longer than it should probably because admin types slowly or forgot where </w:t>
       </w:r>
       <w:r>
         <w:t>the delete button is</w:t>
       </w:r>
       <w:r>
-        <w:t xml:space="preserve">. But then creds are popping up in the terminal. Main_hero is briefly happy, but then admin says that, even tho he deleted a post, he can’t ban a man who made it, because he is not in his sub. Main_hero realizes that he </w:t>
+        <w:t xml:space="preserve">. But then creds are popping up in the terminal. </w:t>
+      </w:r>
+      <w:proofErr w:type="spellStart"/>
+      <w:r>
+        <w:t>Main_hero</w:t>
+      </w:r>
+      <w:proofErr w:type="spellEnd"/>
+      <w:r>
+        <w:t xml:space="preserve"> is briefly happy, but then admin says that, even </w:t>
+      </w:r>
+      <w:proofErr w:type="spellStart"/>
+      <w:r>
+        <w:t>tho</w:t>
+      </w:r>
+      <w:proofErr w:type="spellEnd"/>
+      <w:r>
+        <w:t xml:space="preserve"> he deleted a post, he can’t ban a man who made it, because he is not in his sub. </w:t>
+      </w:r>
+      <w:proofErr w:type="spellStart"/>
+      <w:r>
+        <w:t>Main_hero</w:t>
+      </w:r>
+      <w:proofErr w:type="spellEnd"/>
+      <w:r>
+        <w:t xml:space="preserve"> realizes that he </w:t>
       </w:r>
       <w:r>
         <w:lastRenderedPageBreak/>
         <w:t>forgot to change the author</w:t>
       </w:r>
       <w:r>
-        <w:t xml:space="preserve"> of the post, freaks out and tells admin that it must be The Forum being laggy mess again, cuz for him it shows that user was deleted. Sillygoose228 replies suspicious</w:t>
+        <w:t xml:space="preserve"> of the post, freaks out and tells admin that it must be The Forum being laggy mess again, </w:t>
+      </w:r>
+      <w:proofErr w:type="spellStart"/>
+      <w:r>
+        <w:t>cuz</w:t>
+      </w:r>
+      <w:proofErr w:type="spellEnd"/>
+      <w:r>
+        <w:t xml:space="preserve"> for him it shows that user was deleted. Sillygoose228 replies suspicious</w:t>
       </w:r>
       <w:r>
         <w:t>ly</w:t>
@@ -3651,14 +4284,40 @@
         <w:t xml:space="preserve"> </w:t>
       </w:r>
       <w:r>
-        <w:t>that website was even more laggy then usual when he was deleting that post (main_hero blames ai for that)</w:t>
-      </w:r>
-      <w:r>
-        <w:t xml:space="preserve">, and after long typing dumps a story when he tried to reply to someone and his reply was sent multiple times, cuz the forum was bugging out. Main_hero realizes he is off the hook and proceeds to login as sillygoose228 and demotes all the mods and transfer ownership of the sub to his account. He goes back and tells </w:t>
-      </w:r>
+        <w:t>that website was even more laggy then usual when he was deleting that post (</w:t>
+      </w:r>
+      <w:proofErr w:type="spellStart"/>
+      <w:r>
+        <w:t>main_hero</w:t>
+      </w:r>
+      <w:proofErr w:type="spellEnd"/>
+      <w:r>
+        <w:t xml:space="preserve"> blames ai for that)</w:t>
+      </w:r>
+      <w:r>
+        <w:t xml:space="preserve">, and after long typing dumps a story when he tried to reply to someone and his reply was sent multiple times, </w:t>
+      </w:r>
+      <w:proofErr w:type="spellStart"/>
+      <w:r>
+        <w:t>cuz</w:t>
+      </w:r>
+      <w:proofErr w:type="spellEnd"/>
+      <w:r>
+        <w:t xml:space="preserve"> the forum was bugging out. </w:t>
+      </w:r>
+      <w:proofErr w:type="spellStart"/>
+      <w:r>
+        <w:t>Main_hero</w:t>
+      </w:r>
+      <w:proofErr w:type="spellEnd"/>
+      <w:r>
+        <w:t xml:space="preserve"> realizes he is off the hook and proceeds to login as sillygoose228 and demotes all the mods and transfer ownership of the sub to his account. He goes back and tells </w:t>
+      </w:r>
+      <w:proofErr w:type="spellStart"/>
       <w:r>
         <w:t>cyberdivers</w:t>
       </w:r>
+      <w:proofErr w:type="spellEnd"/>
       <w:r>
         <w:t xml:space="preserve"> chat that he hacked the </w:t>
       </w:r>
@@ -3666,7 +4325,15 @@
         <w:t>zero</w:t>
       </w:r>
       <w:r>
-        <w:t xml:space="preserve"> sub and now he is the owner and they should do whatever they want with it.</w:t>
+        <w:t xml:space="preserve"> sub and now he is the </w:t>
+      </w:r>
+      <w:proofErr w:type="gramStart"/>
+      <w:r>
+        <w:t>owner</w:t>
+      </w:r>
+      <w:proofErr w:type="gramEnd"/>
+      <w:r>
+        <w:t xml:space="preserve"> and they should do whatever they want with it.</w:t>
       </w:r>
     </w:p>
     <w:p>
@@ -3681,37 +4348,140 @@
     </w:p>
     <w:p>
       <w:r>
-        <w:t>Chat is surprised. It calls main_hero a legend</w:t>
-      </w:r>
-      <w:r>
-        <w:t>, praises him for actually pulling this off</w:t>
-      </w:r>
-      <w:r>
-        <w:t xml:space="preserve">. Main_hero suggests they go and post dickpics, spam whatever they want. He goes to </w:t>
+        <w:t xml:space="preserve">Chat is </w:t>
+      </w:r>
+      <w:proofErr w:type="gramStart"/>
+      <w:r>
+        <w:t>surprised</w:t>
+      </w:r>
+      <w:proofErr w:type="gramEnd"/>
+      <w:r>
+        <w:t xml:space="preserve">. It calls </w:t>
+      </w:r>
+      <w:proofErr w:type="spellStart"/>
+      <w:r>
+        <w:t>main_hero</w:t>
+      </w:r>
+      <w:proofErr w:type="spellEnd"/>
+      <w:r>
+        <w:t xml:space="preserve"> a legend</w:t>
+      </w:r>
+      <w:r>
+        <w:t xml:space="preserve">, praises him for </w:t>
+      </w:r>
+      <w:proofErr w:type="gramStart"/>
+      <w:r>
+        <w:t>actually pulling</w:t>
+      </w:r>
+      <w:proofErr w:type="gramEnd"/>
+      <w:r>
+        <w:t xml:space="preserve"> this off</w:t>
+      </w:r>
+      <w:r>
+        <w:t xml:space="preserve">. </w:t>
+      </w:r>
+      <w:proofErr w:type="spellStart"/>
+      <w:r>
+        <w:t>Main_hero</w:t>
+      </w:r>
+      <w:proofErr w:type="spellEnd"/>
+      <w:r>
+        <w:t xml:space="preserve"> suggests they go and post </w:t>
+      </w:r>
+      <w:proofErr w:type="spellStart"/>
+      <w:r>
+        <w:t>dickpics</w:t>
+      </w:r>
+      <w:proofErr w:type="spellEnd"/>
+      <w:r>
+        <w:t xml:space="preserve">, spam whatever they want. He goes to </w:t>
       </w:r>
       <w:r>
         <w:t>zero</w:t>
       </w:r>
       <w:r>
-        <w:t xml:space="preserve"> sub and sees people starting to spam all kinds of posts in the sub. Main_hero finally feels appreciated and proud of his work. He goes back to </w:t>
-      </w:r>
+        <w:t xml:space="preserve"> sub and sees people starting to spam all kinds of posts in the sub. </w:t>
+      </w:r>
+      <w:proofErr w:type="spellStart"/>
+      <w:r>
+        <w:t>Main_hero</w:t>
+      </w:r>
+      <w:proofErr w:type="spellEnd"/>
+      <w:r>
+        <w:t xml:space="preserve"> finally feels appreciated and proud of his work. He goes back to </w:t>
+      </w:r>
+      <w:proofErr w:type="spellStart"/>
       <w:r>
         <w:t>cyberdivers</w:t>
       </w:r>
+      <w:proofErr w:type="spellEnd"/>
       <w:r>
         <w:t xml:space="preserve"> chat to read more about his accomplishment, but then he sees messages of some people, </w:t>
       </w:r>
       <w:r>
-        <w:t xml:space="preserve">who start to downplay what he did. They are calling him out on vibecoding some slop and calling it his accomplishment. Some people are asking to move on already. Some people are saying that main_hero will always remain a clown in this chat, no matter what he does. </w:t>
-      </w:r>
-      <w:r>
-        <w:t>Main_hero is provoked by this, says that he singlehandedly hacked a subforum and they all didn’t do anything. Then argument evolves into insult throwing.</w:t>
+        <w:t xml:space="preserve">who start to downplay what he did. They </w:t>
+      </w:r>
+      <w:proofErr w:type="gramStart"/>
+      <w:r>
+        <w:t>are calling</w:t>
+      </w:r>
+      <w:proofErr w:type="gramEnd"/>
+      <w:r>
+        <w:t xml:space="preserve"> him out on </w:t>
+      </w:r>
+      <w:proofErr w:type="spellStart"/>
+      <w:r>
+        <w:t>vibecoding</w:t>
+      </w:r>
+      <w:proofErr w:type="spellEnd"/>
+      <w:r>
+        <w:t xml:space="preserve"> some slop and </w:t>
+      </w:r>
+      <w:proofErr w:type="gramStart"/>
+      <w:r>
+        <w:t>calling</w:t>
+      </w:r>
+      <w:proofErr w:type="gramEnd"/>
+      <w:r>
+        <w:t xml:space="preserve"> it his accomplishment. Some people are asking to move on already. Some people are saying that </w:t>
+      </w:r>
+      <w:proofErr w:type="spellStart"/>
+      <w:r>
+        <w:t>main_hero</w:t>
+      </w:r>
+      <w:proofErr w:type="spellEnd"/>
+      <w:r>
+        <w:t xml:space="preserve"> will always remain a clown in this chat, no matter what he does. </w:t>
+      </w:r>
+      <w:proofErr w:type="spellStart"/>
+      <w:r>
+        <w:t>Main_hero</w:t>
+      </w:r>
+      <w:proofErr w:type="spellEnd"/>
+      <w:r>
+        <w:t xml:space="preserve"> is provoked by this, says that he singlehandedly hacked a subforum and </w:t>
+      </w:r>
+      <w:proofErr w:type="gramStart"/>
+      <w:r>
+        <w:t>they all</w:t>
+      </w:r>
+      <w:proofErr w:type="gramEnd"/>
+      <w:r>
+        <w:t xml:space="preserve"> didn’t do anything. Then argument evolves into insult throwing.</w:t>
       </w:r>
       <w:r>
         <w:t xml:space="preserve"> </w:t>
       </w:r>
       <w:r>
-        <w:t xml:space="preserve">In the middle of this argument, main_hero </w:t>
+        <w:t xml:space="preserve">In the middle of this argument, </w:t>
+      </w:r>
+      <w:proofErr w:type="spellStart"/>
+      <w:r>
+        <w:t>main_hero</w:t>
+      </w:r>
+      <w:proofErr w:type="spellEnd"/>
+      <w:r>
+        <w:t xml:space="preserve"> </w:t>
       </w:r>
       <w:r>
         <w:t>is getting</w:t>
@@ -3719,9 +4489,11 @@
       <w:r>
         <w:t xml:space="preserve"> struck with realization. He says he wastes his life on some stupid shit like trying hard in </w:t>
       </w:r>
+      <w:proofErr w:type="spellStart"/>
       <w:r>
         <w:t>cyberdivers</w:t>
       </w:r>
+      <w:proofErr w:type="spellEnd"/>
       <w:r>
         <w:t xml:space="preserve"> for 1000 hours or hacking subforums and all for what, for fucking </w:t>
       </w:r>
@@ -3738,11 +4510,24 @@
         <w:t xml:space="preserve"> from idiots just like him. </w:t>
       </w:r>
       <w:r>
-        <w:t xml:space="preserve">And he can’t leave this idiots, because they are the only friends he has. </w:t>
-      </w:r>
-      <w:r>
-        <w:t>He is trying to convince himself and everyone around him that he is skillful, smart and overall</w:t>
-      </w:r>
+        <w:t xml:space="preserve">And he can’t leave </w:t>
+      </w:r>
+      <w:proofErr w:type="gramStart"/>
+      <w:r>
+        <w:t>this idiots</w:t>
+      </w:r>
+      <w:proofErr w:type="gramEnd"/>
+      <w:r>
+        <w:t xml:space="preserve">, because they are the only friends he has. </w:t>
+      </w:r>
+      <w:r>
+        <w:t xml:space="preserve">He is trying to convince himself and everyone around him that he is skillful, smart and </w:t>
+      </w:r>
+      <w:proofErr w:type="gramStart"/>
+      <w:r>
+        <w:t>overall</w:t>
+      </w:r>
+      <w:proofErr w:type="gramEnd"/>
       <w:r>
         <w:t xml:space="preserve"> the</w:t>
       </w:r>
@@ -3753,10 +4538,26 @@
         <w:t>not be alone</w:t>
       </w:r>
       <w:r>
-        <w:t xml:space="preserve">. He asks us if this life is fucking bullshit. He snaps out of it when someone pinged him and asked, does he know that The Forum could ban him for that. Main_hero replies, </w:t>
-      </w:r>
-      <w:r>
-        <w:t>yeah of course, but before he could sent that, he gets banned. Story ends with “oh wow”.</w:t>
+        <w:t xml:space="preserve">. He asks us if this life is fucking bullshit. He snaps out of it when someone pinged him and asked, does he know that The Forum could ban him for that. </w:t>
+      </w:r>
+      <w:proofErr w:type="spellStart"/>
+      <w:r>
+        <w:t>Main_hero</w:t>
+      </w:r>
+      <w:proofErr w:type="spellEnd"/>
+      <w:r>
+        <w:t xml:space="preserve"> replies, </w:t>
+      </w:r>
+      <w:r>
+        <w:t xml:space="preserve">yeah of course, but before he could </w:t>
+      </w:r>
+      <w:proofErr w:type="gramStart"/>
+      <w:r>
+        <w:t>sent</w:t>
+      </w:r>
+      <w:proofErr w:type="gramEnd"/>
+      <w:r>
+        <w:t xml:space="preserve"> that, he gets banned. Story ends with “oh wow”.</w:t>
       </w:r>
     </w:p>
     <w:p>
@@ -3795,7 +4596,15 @@
         <w:t xml:space="preserve"> Hello.</w:t>
       </w:r>
       <w:r>
-        <w:t xml:space="preserve"> I am main_hero.</w:t>
+        <w:t xml:space="preserve"> I am </w:t>
+      </w:r>
+      <w:proofErr w:type="spellStart"/>
+      <w:r>
+        <w:t>main_hero</w:t>
+      </w:r>
+      <w:proofErr w:type="spellEnd"/>
+      <w:r>
+        <w:t>.</w:t>
       </w:r>
       <w:r>
         <w:t xml:space="preserve"> This feels fucking weird, ugh.</w:t>
@@ -3816,8 +4625,21 @@
         <w:t xml:space="preserve">. </w:t>
       </w:r>
       <w:r>
-        <w:t>And uhhhhh I don’t even know why I am doing it tbh</w:t>
-      </w:r>
+        <w:t xml:space="preserve">And </w:t>
+      </w:r>
+      <w:proofErr w:type="spellStart"/>
+      <w:r>
+        <w:t>uhhhhh</w:t>
+      </w:r>
+      <w:proofErr w:type="spellEnd"/>
+      <w:r>
+        <w:t xml:space="preserve"> I don’t even know why I am doing it </w:t>
+      </w:r>
+      <w:proofErr w:type="spellStart"/>
+      <w:r>
+        <w:t>tbh</w:t>
+      </w:r>
+      <w:proofErr w:type="spellEnd"/>
       <w:r>
         <w:t xml:space="preserve">. </w:t>
       </w:r>
@@ -3851,7 +4673,15 @@
         <w:t>So,</w:t>
       </w:r>
       <w:r>
-        <w:t xml:space="preserve"> uhhh where do I start?</w:t>
+        <w:t xml:space="preserve"> </w:t>
+      </w:r>
+      <w:proofErr w:type="spellStart"/>
+      <w:r>
+        <w:t>uhhh</w:t>
+      </w:r>
+      <w:proofErr w:type="spellEnd"/>
+      <w:r>
+        <w:t xml:space="preserve"> where do I start?</w:t>
       </w:r>
       <w:r>
         <w:t xml:space="preserve"> I </w:t>
@@ -3883,9 +4713,11 @@
       <w:r>
         <w:t xml:space="preserve">in </w:t>
       </w:r>
+      <w:proofErr w:type="spellStart"/>
       <w:r>
         <w:t>Cyberdivers</w:t>
       </w:r>
+      <w:proofErr w:type="spellEnd"/>
       <w:r>
         <w:t>.</w:t>
       </w:r>
@@ -3896,7 +4728,15 @@
         <w:t xml:space="preserve"> in it</w:t>
       </w:r>
       <w:r>
-        <w:t xml:space="preserve"> and, boy, lemme tell you, I am very good </w:t>
+        <w:t xml:space="preserve"> and, boy, </w:t>
+      </w:r>
+      <w:proofErr w:type="spellStart"/>
+      <w:r>
+        <w:t>lemme</w:t>
+      </w:r>
+      <w:proofErr w:type="spellEnd"/>
+      <w:r>
+        <w:t xml:space="preserve"> tell you, I am very good </w:t>
       </w:r>
       <w:r>
         <w:t>at</w:t>
@@ -3921,9 +4761,11 @@
       <w:r>
         <w:t xml:space="preserve">where he got a </w:t>
       </w:r>
+      <w:proofErr w:type="spellStart"/>
       <w:r>
         <w:t>cyberdivers</w:t>
       </w:r>
+      <w:proofErr w:type="spellEnd"/>
       <w:r>
         <w:t xml:space="preserve"> link. As user hovers over the link, he sees a streak of </w:t>
       </w:r>
@@ -3998,7 +4840,15 @@
         <w:t xml:space="preserve"> I play a lot better than this</w:t>
       </w:r>
       <w:r>
-        <w:t>, it’s just a bad luck is what it is</w:t>
+        <w:t xml:space="preserve">, it’s just </w:t>
+      </w:r>
+      <w:proofErr w:type="gramStart"/>
+      <w:r>
+        <w:t>a bad</w:t>
+      </w:r>
+      <w:proofErr w:type="gramEnd"/>
+      <w:r>
+        <w:t xml:space="preserve"> luck is what it is</w:t>
       </w:r>
       <w:r>
         <w:t>, trust.</w:t>
@@ -4008,9 +4858,11 @@
       <w:r>
         <w:t xml:space="preserve">Anyway, I’m well respected in </w:t>
       </w:r>
+      <w:proofErr w:type="spellStart"/>
       <w:r>
         <w:t>cyberdivers</w:t>
       </w:r>
+      <w:proofErr w:type="spellEnd"/>
       <w:r>
         <w:t xml:space="preserve"> community, people know my name.</w:t>
       </w:r>
@@ -4020,12 +4872,28 @@
     </w:p>
     <w:p>
       <w:r>
-        <w:t>(User is prompted to search for the sc2 subforum)</w:t>
-      </w:r>
-    </w:p>
-    <w:p>
-      <w:r>
-        <w:t xml:space="preserve">I kinda forgot to </w:t>
+        <w:t>(</w:t>
+      </w:r>
+      <w:proofErr w:type="gramStart"/>
+      <w:r>
+        <w:t>User is</w:t>
+      </w:r>
+      <w:proofErr w:type="gramEnd"/>
+      <w:r>
+        <w:t xml:space="preserve"> prompted to search for the sc2 subforum)</w:t>
+      </w:r>
+    </w:p>
+    <w:p>
+      <w:r>
+        <w:t xml:space="preserve">I </w:t>
+      </w:r>
+      <w:proofErr w:type="spellStart"/>
+      <w:r>
+        <w:t>kinda</w:t>
+      </w:r>
+      <w:proofErr w:type="spellEnd"/>
+      <w:r>
+        <w:t xml:space="preserve"> forgot to </w:t>
       </w:r>
       <w:r>
         <w:t>explain</w:t>
@@ -4061,8 +4929,13 @@
         <w:t xml:space="preserve"> </w:t>
       </w:r>
       <w:r>
-        <w:t>from different threats, so companies hire cyberdivers</w:t>
-      </w:r>
+        <w:t xml:space="preserve">from different threats, so companies hire </w:t>
+      </w:r>
+      <w:proofErr w:type="spellStart"/>
+      <w:r>
+        <w:t>cyberdivers</w:t>
+      </w:r>
+      <w:proofErr w:type="spellEnd"/>
       <w:r>
         <w:t>,</w:t>
       </w:r>
@@ -4082,7 +4955,15 @@
         <w:t>. In the game</w:t>
       </w:r>
       <w:r>
-        <w:t xml:space="preserve"> it’s represented as them actually fighting one of three factions: AI bots, Bugs or Hackers</w:t>
+        <w:t xml:space="preserve"> it’s represented as them </w:t>
+      </w:r>
+      <w:proofErr w:type="gramStart"/>
+      <w:r>
+        <w:t>actually fighting</w:t>
+      </w:r>
+      <w:proofErr w:type="gramEnd"/>
+      <w:r>
+        <w:t xml:space="preserve"> one of three factions: AI bots, Bugs or Hackers</w:t>
       </w:r>
       <w:r>
         <w:t xml:space="preserve"> in a match, or</w:t>
@@ -4100,7 +4981,15 @@
         <w:t>,</w:t>
       </w:r>
       <w:r>
-        <w:t xml:space="preserve"> we have nicknames for all three, clankers, bugs and squids. We call hackers squids, cuz in</w:t>
+        <w:t xml:space="preserve"> we have nicknames for all three, clankers, bugs and squids. We call hackers squids, </w:t>
+      </w:r>
+      <w:proofErr w:type="spellStart"/>
+      <w:r>
+        <w:t>cuz</w:t>
+      </w:r>
+      <w:proofErr w:type="spellEnd"/>
+      <w:r>
+        <w:t xml:space="preserve"> in</w:t>
       </w:r>
       <w:r>
         <w:t xml:space="preserve"> the</w:t>
@@ -4112,11 +5001,16 @@
         <w:t>quids, and their tentacles can penetrate everything. And when I say everything, I mean everything.</w:t>
       </w:r>
       <w:r>
-        <w:t xml:space="preserve"> Like walls. I mean</w:t>
+        <w:t xml:space="preserve"> Like walls. I </w:t>
+      </w:r>
+      <w:proofErr w:type="gramStart"/>
+      <w:r>
+        <w:t>mean</w:t>
       </w:r>
       <w:r>
         <w:t>t</w:t>
       </w:r>
+      <w:proofErr w:type="gramEnd"/>
       <w:r>
         <w:t xml:space="preserve"> walls.</w:t>
       </w:r>
@@ -4147,7 +5041,15 @@
         <w:t>fight</w:t>
       </w:r>
       <w:r>
-        <w:t xml:space="preserve">. But oh well, what can u do with shit teammates, right? Hold on, lemme </w:t>
+        <w:t xml:space="preserve">. But oh well, what can u do with shit teammates, right? Hold on, </w:t>
+      </w:r>
+      <w:proofErr w:type="spellStart"/>
+      <w:r>
+        <w:t>lemme</w:t>
+      </w:r>
+      <w:proofErr w:type="spellEnd"/>
+      <w:r>
+        <w:t xml:space="preserve"> </w:t>
       </w:r>
       <w:r>
         <w:t>hit them up</w:t>
@@ -4204,13 +5106,26 @@
         <w:t>clankers</w:t>
       </w:r>
       <w:r>
-        <w:t xml:space="preserve"> spawn rate is insane, how tf r u supposed to fight them on d10</w:t>
-      </w:r>
-    </w:p>
-    <w:p>
-      <w:r>
-        <w:t>User 2: skill issue bruh</w:t>
-      </w:r>
+        <w:t xml:space="preserve"> spawn rate is insane, how </w:t>
+      </w:r>
+      <w:proofErr w:type="spellStart"/>
+      <w:r>
+        <w:t>tf</w:t>
+      </w:r>
+      <w:proofErr w:type="spellEnd"/>
+      <w:r>
+        <w:t xml:space="preserve"> r u supposed to fight them on d10</w:t>
+      </w:r>
+    </w:p>
+    <w:p>
+      <w:r>
+        <w:t xml:space="preserve">User 2: skill issue </w:t>
+      </w:r>
+      <w:proofErr w:type="spellStart"/>
+      <w:r>
+        <w:t>bruh</w:t>
+      </w:r>
+      <w:proofErr w:type="spellEnd"/>
     </w:p>
     <w:p>
       <w:r>
@@ -4223,7 +5138,15 @@
         <w:t xml:space="preserve">User 3: </w:t>
       </w:r>
       <w:r>
-        <w:t>just bring ak 4.7.0 with reactive boost, it’s not that hard</w:t>
+        <w:t xml:space="preserve">just bring </w:t>
+      </w:r>
+      <w:proofErr w:type="spellStart"/>
+      <w:r>
+        <w:t>ak</w:t>
+      </w:r>
+      <w:proofErr w:type="spellEnd"/>
+      <w:r>
+        <w:t xml:space="preserve"> 4.7.0 with reactive boost, it’s not that hard</w:t>
       </w:r>
     </w:p>
     <w:p>
@@ -4233,7 +5156,23 @@
     </w:p>
     <w:p>
       <w:r>
-        <w:t>User 1: I need level 75 to unlock ak 4.7.0, im like 42</w:t>
+        <w:t xml:space="preserve">User 1: I need level 75 to unlock </w:t>
+      </w:r>
+      <w:proofErr w:type="spellStart"/>
+      <w:r>
+        <w:t>ak</w:t>
+      </w:r>
+      <w:proofErr w:type="spellEnd"/>
+      <w:r>
+        <w:t xml:space="preserve"> 4.7.0, </w:t>
+      </w:r>
+      <w:proofErr w:type="spellStart"/>
+      <w:r>
+        <w:t>im</w:t>
+      </w:r>
+      <w:proofErr w:type="spellEnd"/>
+      <w:r>
+        <w:t xml:space="preserve"> like 42</w:t>
       </w:r>
     </w:p>
     <w:p>
@@ -4265,20 +5204,51 @@
     </w:p>
     <w:p>
       <w:r>
-        <w:t>User 4: go train on d1 bruh, left mouse button to shoot btw</w:t>
-      </w:r>
-    </w:p>
-    <w:p>
-      <w:r>
-        <w:t xml:space="preserve">User 1: go touch some grass bruh, ur father won’t come back home if u put another 100 hours in </w:t>
-      </w:r>
+        <w:t xml:space="preserve">User 4: go train on d1 </w:t>
+      </w:r>
+      <w:proofErr w:type="spellStart"/>
+      <w:r>
+        <w:t>bruh</w:t>
+      </w:r>
+      <w:proofErr w:type="spellEnd"/>
+      <w:r>
+        <w:t>, left mouse button to shoot btw</w:t>
+      </w:r>
+    </w:p>
+    <w:p>
+      <w:r>
+        <w:t xml:space="preserve">User 1: go touch some grass </w:t>
+      </w:r>
+      <w:proofErr w:type="spellStart"/>
+      <w:r>
+        <w:t>bruh</w:t>
+      </w:r>
+      <w:proofErr w:type="spellEnd"/>
+      <w:r>
+        <w:t xml:space="preserve">, </w:t>
+      </w:r>
+      <w:proofErr w:type="spellStart"/>
+      <w:r>
+        <w:t>ur</w:t>
+      </w:r>
+      <w:proofErr w:type="spellEnd"/>
+      <w:r>
+        <w:t xml:space="preserve"> father won’t come back home if u put another 100 hours in </w:t>
+      </w:r>
+      <w:proofErr w:type="spellStart"/>
       <w:r>
         <w:t>cyberdivers</w:t>
       </w:r>
-    </w:p>
-    <w:p>
-      <w:r>
-        <w:t xml:space="preserve">Main_hero: </w:t>
+      <w:proofErr w:type="spellEnd"/>
+    </w:p>
+    <w:p>
+      <w:proofErr w:type="spellStart"/>
+      <w:r>
+        <w:t>Main_hero</w:t>
+      </w:r>
+      <w:proofErr w:type="spellEnd"/>
+      <w:r>
+        <w:t xml:space="preserve">: </w:t>
       </w:r>
       <w:r>
         <w:t>what’s up</w:t>
@@ -4297,7 +5267,15 @@
         <w:t>contract</w:t>
       </w:r>
       <w:r>
-        <w:t xml:space="preserve"> cuz of u</w:t>
+        <w:t xml:space="preserve"> </w:t>
+      </w:r>
+      <w:proofErr w:type="spellStart"/>
+      <w:r>
+        <w:t>cuz</w:t>
+      </w:r>
+      <w:proofErr w:type="spellEnd"/>
+      <w:r>
+        <w:t xml:space="preserve"> of u</w:t>
       </w:r>
     </w:p>
     <w:p>
@@ -4312,8 +5290,13 @@
     </w:p>
     <w:p>
       <w:r>
-        <w:t>User 4: go fuck urself</w:t>
-      </w:r>
+        <w:t xml:space="preserve">User 4: go fuck </w:t>
+      </w:r>
+      <w:proofErr w:type="spellStart"/>
+      <w:r>
+        <w:t>urself</w:t>
+      </w:r>
+      <w:proofErr w:type="spellEnd"/>
       <w:r>
         <w:t xml:space="preserve">, </w:t>
       </w:r>
@@ -4332,8 +5315,13 @@
         <w:t xml:space="preserve">mf is acting like nothing happened, </w:t>
       </w:r>
       <w:r>
-        <w:t>go fuck urself</w:t>
-      </w:r>
+        <w:t xml:space="preserve">go fuck </w:t>
+      </w:r>
+      <w:proofErr w:type="spellStart"/>
+      <w:r>
+        <w:t>urself</w:t>
+      </w:r>
+      <w:proofErr w:type="spellEnd"/>
     </w:p>
     <w:p>
       <w:r>
@@ -4368,12 +5356,25 @@
         <w:t xml:space="preserve">User 8: this noob ass was bragging about his skill so much and couldn’t even </w:t>
       </w:r>
       <w:r>
-        <w:t>clear a squid repository, bruuuh</w:t>
-      </w:r>
-    </w:p>
-    <w:p>
-      <w:r>
-        <w:t>User 9: secondhand embarrassment from watching u play was insane, I’d actually kms if I were you</w:t>
+        <w:t xml:space="preserve">clear a squid repository, </w:t>
+      </w:r>
+      <w:proofErr w:type="spellStart"/>
+      <w:r>
+        <w:t>bruuuh</w:t>
+      </w:r>
+      <w:proofErr w:type="spellEnd"/>
+    </w:p>
+    <w:p>
+      <w:r>
+        <w:t xml:space="preserve">User 9: secondhand embarrassment from watching u play was insane, I’d </w:t>
+      </w:r>
+      <w:proofErr w:type="gramStart"/>
+      <w:r>
+        <w:t>actually kms</w:t>
+      </w:r>
+      <w:proofErr w:type="gramEnd"/>
+      <w:r>
+        <w:t xml:space="preserve"> if I were you</w:t>
       </w:r>
     </w:p>
     <w:p>
@@ -4392,11 +5393,16 @@
         <w:t xml:space="preserve"> me and calling me bad at the game or something</w:t>
       </w:r>
       <w:r>
-        <w:t xml:space="preserve">, but it’s actually </w:t>
+        <w:t xml:space="preserve">, but it’s </w:t>
+      </w:r>
+      <w:proofErr w:type="gramStart"/>
+      <w:r>
+        <w:t xml:space="preserve">actually </w:t>
       </w:r>
       <w:r>
         <w:t>fine</w:t>
       </w:r>
+      <w:proofErr w:type="gramEnd"/>
       <w:r>
         <w:t>, you just don’t get it</w:t>
       </w:r>
@@ -4419,7 +5425,15 @@
     <w:p>
       <w:r>
         <w:lastRenderedPageBreak/>
-        <w:t>User 9: ain’t no one f</w:t>
+        <w:t xml:space="preserve">User 9: </w:t>
+      </w:r>
+      <w:proofErr w:type="spellStart"/>
+      <w:r>
+        <w:t>ain’t</w:t>
+      </w:r>
+      <w:proofErr w:type="spellEnd"/>
+      <w:r>
+        <w:t xml:space="preserve"> no one f</w:t>
       </w:r>
       <w:r>
         <w:t xml:space="preserve">ucking </w:t>
@@ -4468,13 +5482,29 @@
     </w:p>
     <w:p>
       <w:r>
-        <w:t xml:space="preserve">User 10: yo, y’all seen the news about delayed </w:t>
+        <w:t xml:space="preserve">User 10: </w:t>
+      </w:r>
+      <w:proofErr w:type="spellStart"/>
+      <w:r>
+        <w:t>yo</w:t>
+      </w:r>
+      <w:proofErr w:type="spellEnd"/>
+      <w:r>
+        <w:t xml:space="preserve">, y’all seen the news about delayed </w:t>
       </w:r>
       <w:r>
         <w:t>zero</w:t>
       </w:r>
       <w:r>
-        <w:t xml:space="preserve"> dlc?</w:t>
+        <w:t xml:space="preserve"> </w:t>
+      </w:r>
+      <w:proofErr w:type="spellStart"/>
+      <w:r>
+        <w:t>dlc</w:t>
+      </w:r>
+      <w:proofErr w:type="spellEnd"/>
+      <w:r>
+        <w:t>?</w:t>
       </w:r>
     </w:p>
     <w:p>
@@ -4496,8 +5526,13 @@
     </w:p>
     <w:p>
       <w:r>
-        <w:t>User 3: Zero the game? More like zero dlc</w:t>
-      </w:r>
+        <w:t xml:space="preserve">User 3: Zero the game? More like zero </w:t>
+      </w:r>
+      <w:proofErr w:type="spellStart"/>
+      <w:r>
+        <w:t>dlc</w:t>
+      </w:r>
+      <w:proofErr w:type="spellEnd"/>
     </w:p>
     <w:p>
       <w:r>
@@ -4517,15 +5552,33 @@
         <w:t>spearhead</w:t>
       </w:r>
       <w:r>
-        <w:t xml:space="preserve"> heard us and making smth new for </w:t>
-      </w:r>
+        <w:t xml:space="preserve"> heard us and making </w:t>
+      </w:r>
+      <w:proofErr w:type="spellStart"/>
+      <w:r>
+        <w:t>smth</w:t>
+      </w:r>
+      <w:proofErr w:type="spellEnd"/>
+      <w:r>
+        <w:t xml:space="preserve"> new for </w:t>
+      </w:r>
+      <w:proofErr w:type="spellStart"/>
       <w:r>
         <w:t>cyberdivers</w:t>
       </w:r>
-    </w:p>
-    <w:p>
-      <w:r>
-        <w:t>User 7: this absolutely does not mean that bruh, they just can’t do shit</w:t>
+      <w:proofErr w:type="spellEnd"/>
+    </w:p>
+    <w:p>
+      <w:r>
+        <w:t xml:space="preserve">User 7: this absolutely does not mean that </w:t>
+      </w:r>
+      <w:proofErr w:type="spellStart"/>
+      <w:r>
+        <w:t>bruh</w:t>
+      </w:r>
+      <w:proofErr w:type="spellEnd"/>
+      <w:r>
+        <w:t>, they just can’t do shit</w:t>
       </w:r>
     </w:p>
     <w:p>
@@ -4542,8 +5595,13 @@
         <w:t xml:space="preserve">fans </w:t>
       </w:r>
       <w:r>
-        <w:t>are in shambles rn</w:t>
-      </w:r>
+        <w:t xml:space="preserve">are in shambles </w:t>
+      </w:r>
+      <w:proofErr w:type="spellStart"/>
+      <w:r>
+        <w:t>rn</w:t>
+      </w:r>
+      <w:proofErr w:type="spellEnd"/>
     </w:p>
     <w:p>
       <w:r>
@@ -4555,16 +5613,26 @@
       <w:r>
         <w:t xml:space="preserve"> </w:t>
       </w:r>
-      <w:r>
-        <w:t>ak 4.7.0 buff</w:t>
+      <w:proofErr w:type="spellStart"/>
+      <w:r>
+        <w:t>ak</w:t>
+      </w:r>
+      <w:proofErr w:type="spellEnd"/>
+      <w:r>
+        <w:t xml:space="preserve"> 4.7.0 buff</w:t>
       </w:r>
     </w:p>
     <w:p>
       <w:r>
         <w:t xml:space="preserve">User 11: </w:t>
       </w:r>
-      <w:r>
-        <w:t>ak 4.7.0 is already op</w:t>
+      <w:proofErr w:type="spellStart"/>
+      <w:r>
+        <w:t>ak</w:t>
+      </w:r>
+      <w:proofErr w:type="spellEnd"/>
+      <w:r>
+        <w:t xml:space="preserve"> 4.7.0 is already op</w:t>
       </w:r>
       <w:r>
         <w:t xml:space="preserve">, u </w:t>
@@ -4590,7 +5658,23 @@
         <w:t xml:space="preserve">User 9: </w:t>
       </w:r>
       <w:r>
-        <w:t>vibe strike set’s ur teammates on fire, it’s the worst stratagem in the game</w:t>
+        <w:t xml:space="preserve">vibe strike </w:t>
+      </w:r>
+      <w:proofErr w:type="gramStart"/>
+      <w:r>
+        <w:t>set’s</w:t>
+      </w:r>
+      <w:proofErr w:type="gramEnd"/>
+      <w:r>
+        <w:t xml:space="preserve"> </w:t>
+      </w:r>
+      <w:proofErr w:type="spellStart"/>
+      <w:r>
+        <w:t>ur</w:t>
+      </w:r>
+      <w:proofErr w:type="spellEnd"/>
+      <w:r>
+        <w:t xml:space="preserve"> teammates on fire, it’s the worst stratagem in the game</w:t>
       </w:r>
       <w:r>
         <w:t xml:space="preserve">, </w:t>
@@ -4622,8 +5706,13 @@
         <w:t>. Instead of making content and patches</w:t>
       </w:r>
       <w:r>
-        <w:t xml:space="preserve"> for Cyberdivers</w:t>
-      </w:r>
+        <w:t xml:space="preserve"> for </w:t>
+      </w:r>
+      <w:proofErr w:type="spellStart"/>
+      <w:r>
+        <w:t>Cyberdivers</w:t>
+      </w:r>
+      <w:proofErr w:type="spellEnd"/>
       <w:r>
         <w:t>, they decided to make some random ass</w:t>
       </w:r>
@@ -4640,20 +5729,27 @@
         <w:t xml:space="preserve"> and the game wasn’t even that good.</w:t>
       </w:r>
       <w:r>
-        <w:t xml:space="preserve"> And now they are working on the dlc</w:t>
-      </w:r>
+        <w:t xml:space="preserve"> And now they are working on the </w:t>
+      </w:r>
+      <w:proofErr w:type="spellStart"/>
+      <w:r>
+        <w:t>dlc</w:t>
+      </w:r>
+      <w:proofErr w:type="spellEnd"/>
       <w:r>
         <w:t xml:space="preserve"> for it</w:t>
       </w:r>
       <w:r>
         <w:t xml:space="preserve">, while </w:t>
       </w:r>
+      <w:proofErr w:type="spellStart"/>
       <w:r>
         <w:t>C</w:t>
       </w:r>
       <w:r>
         <w:t>yberdivers</w:t>
       </w:r>
+      <w:proofErr w:type="spellEnd"/>
       <w:r>
         <w:t xml:space="preserve"> </w:t>
       </w:r>
@@ -4683,7 +5779,15 @@
         <w:t xml:space="preserve"> </w:t>
       </w:r>
       <w:r>
-        <w:t>if u can’t use ak 4.7.0 properly</w:t>
+        <w:t xml:space="preserve">if u can’t use </w:t>
+      </w:r>
+      <w:proofErr w:type="spellStart"/>
+      <w:r>
+        <w:t>ak</w:t>
+      </w:r>
+      <w:proofErr w:type="spellEnd"/>
+      <w:r>
+        <w:t xml:space="preserve"> 4.7.0 properly</w:t>
       </w:r>
       <w:r>
         <w:rPr>
@@ -4697,7 +5801,15 @@
     </w:p>
     <w:p>
       <w:r>
-        <w:t xml:space="preserve">You know what, I wanna check how do they do in their sub. I bet you they are </w:t>
+        <w:t xml:space="preserve">You know what, I </w:t>
+      </w:r>
+      <w:proofErr w:type="spellStart"/>
+      <w:r>
+        <w:t>wanna</w:t>
+      </w:r>
+      <w:proofErr w:type="spellEnd"/>
+      <w:r>
+        <w:t xml:space="preserve"> check how do they do in their sub. I bet you they are </w:t>
       </w:r>
       <w:r>
         <w:t>complaining</w:t>
@@ -4729,15 +5841,39 @@
     </w:p>
     <w:p>
       <w:r>
-        <w:t xml:space="preserve">(User is prompted to search for </w:t>
-      </w:r>
-      <w:r>
-        <w:t>wl3 sub and find the post with the news)</w:t>
-      </w:r>
-    </w:p>
-    <w:p>
-      <w:r>
-        <w:t>(User is going to comments)</w:t>
+        <w:t>(</w:t>
+      </w:r>
+      <w:proofErr w:type="gramStart"/>
+      <w:r>
+        <w:t>User is</w:t>
+      </w:r>
+      <w:proofErr w:type="gramEnd"/>
+      <w:r>
+        <w:t xml:space="preserve"> prompted to search for </w:t>
+      </w:r>
+      <w:r>
+        <w:t xml:space="preserve">wl3 </w:t>
+      </w:r>
+      <w:proofErr w:type="gramStart"/>
+      <w:r>
+        <w:t>sub</w:t>
+      </w:r>
+      <w:proofErr w:type="gramEnd"/>
+      <w:r>
+        <w:t xml:space="preserve"> and find the post with the news)</w:t>
+      </w:r>
+    </w:p>
+    <w:p>
+      <w:r>
+        <w:t xml:space="preserve">(User is going to </w:t>
+      </w:r>
+      <w:proofErr w:type="gramStart"/>
+      <w:r>
+        <w:t>comments</w:t>
+      </w:r>
+      <w:proofErr w:type="gramEnd"/>
+      <w:r>
+        <w:t>)</w:t>
       </w:r>
     </w:p>
     <w:p>
@@ -4746,7 +5882,15 @@
         <w:t>Bruh what? “</w:t>
       </w:r>
       <w:r>
-        <w:t>Let devs take as much time as they need</w:t>
+        <w:t xml:space="preserve">Let </w:t>
+      </w:r>
+      <w:proofErr w:type="spellStart"/>
+      <w:r>
+        <w:t>devs</w:t>
+      </w:r>
+      <w:proofErr w:type="spellEnd"/>
+      <w:r>
+        <w:t xml:space="preserve"> take as much time as they need</w:t>
       </w:r>
       <w:r>
         <w:t>”, bro wtf, they are so…so…so</w:t>
@@ -4768,12 +5912,28 @@
     </w:p>
     <w:p>
       <w:r>
-        <w:t xml:space="preserve">Look at these posts bruh. </w:t>
-      </w:r>
-    </w:p>
-    <w:p>
-      <w:r>
-        <w:t xml:space="preserve">So spineless, like “our dlc got delayed? </w:t>
+        <w:t xml:space="preserve">Look at these posts </w:t>
+      </w:r>
+      <w:proofErr w:type="spellStart"/>
+      <w:r>
+        <w:t>bruh</w:t>
+      </w:r>
+      <w:proofErr w:type="spellEnd"/>
+      <w:r>
+        <w:t xml:space="preserve">. </w:t>
+      </w:r>
+    </w:p>
+    <w:p>
+      <w:r>
+        <w:t xml:space="preserve">So spineless, like “our </w:t>
+      </w:r>
+      <w:proofErr w:type="spellStart"/>
+      <w:r>
+        <w:t>dlc</w:t>
+      </w:r>
+      <w:proofErr w:type="spellEnd"/>
+      <w:r>
+        <w:t xml:space="preserve"> got delayed? </w:t>
       </w:r>
       <w:r>
         <w:t xml:space="preserve">It’s ok, </w:t>
@@ -4782,7 +5942,23 @@
         <w:t>better late than never</w:t>
       </w:r>
       <w:r>
-        <w:t>” tf is this. You absolutely should demand new content from the devs, they are working for you</w:t>
+        <w:t xml:space="preserve">” </w:t>
+      </w:r>
+      <w:proofErr w:type="spellStart"/>
+      <w:r>
+        <w:t>tf</w:t>
+      </w:r>
+      <w:proofErr w:type="spellEnd"/>
+      <w:r>
+        <w:t xml:space="preserve"> is this. You absolutely should demand new content from the </w:t>
+      </w:r>
+      <w:proofErr w:type="spellStart"/>
+      <w:r>
+        <w:t>devs</w:t>
+      </w:r>
+      <w:proofErr w:type="spellEnd"/>
+      <w:r>
+        <w:t>, they are working for you</w:t>
       </w:r>
       <w:r>
         <w:t>,</w:t>
@@ -4820,7 +5996,15 @@
     </w:p>
     <w:p>
       <w:r>
-        <w:t>(User is prompted to go to the post with noob question)</w:t>
+        <w:t xml:space="preserve">(User is prompted to go to the post with noob </w:t>
+      </w:r>
+      <w:proofErr w:type="gramStart"/>
+      <w:r>
+        <w:t>question</w:t>
+      </w:r>
+      <w:proofErr w:type="gramEnd"/>
+      <w:r>
+        <w:t>)</w:t>
       </w:r>
     </w:p>
     <w:p>
@@ -4833,10 +6017,26 @@
         <w:t xml:space="preserve">And these </w:t>
       </w:r>
       <w:r>
-        <w:t xml:space="preserve">stupid ass questions like this one “uhhhhh how do u get in that room” like don’t u see the </w:t>
-      </w:r>
-      <w:r>
-        <w:t xml:space="preserve">vent in there? Have you tried looking or do you just run to this subforum for help at any minor inconvenience? This is why noobs should be mocked for their stupidity, they’ll learn how to think </w:t>
+        <w:t>stupid ass questions like this one “</w:t>
+      </w:r>
+      <w:proofErr w:type="spellStart"/>
+      <w:r>
+        <w:t>uhhhhh</w:t>
+      </w:r>
+      <w:proofErr w:type="spellEnd"/>
+      <w:r>
+        <w:t xml:space="preserve"> how do u get in that room” like don’t u see the </w:t>
+      </w:r>
+      <w:r>
+        <w:t xml:space="preserve">vent in there? Have you tried looking or do you just run to this subforum for help at any minor inconvenience? This is why noobs should be mocked for their </w:t>
+      </w:r>
+      <w:proofErr w:type="gramStart"/>
+      <w:r>
+        <w:t>stupidity,</w:t>
+      </w:r>
+      <w:proofErr w:type="gramEnd"/>
+      <w:r>
+        <w:t xml:space="preserve"> they’ll learn how to think </w:t>
       </w:r>
       <w:r>
         <w:t>by themselves</w:t>
@@ -4873,7 +6073,15 @@
     </w:p>
     <w:p>
       <w:r>
-        <w:t xml:space="preserve">Oh boy, look how nice everyone here is bruh. Look how everyone being respectful to each other, like isn’t it fucking pathetic? There is either right opinion </w:t>
+        <w:t xml:space="preserve">Oh boy, look how nice everyone here is </w:t>
+      </w:r>
+      <w:proofErr w:type="spellStart"/>
+      <w:r>
+        <w:t>bruh</w:t>
+      </w:r>
+      <w:proofErr w:type="spellEnd"/>
+      <w:r>
+        <w:t xml:space="preserve">. Look how everyone being respectful to each other, like isn’t it fucking pathetic? There is either right opinion </w:t>
       </w:r>
       <w:r>
         <w:t xml:space="preserve">or wrong opinion, nothing in between. If y’all being so polite and </w:t>
@@ -4888,7 +6096,23 @@
         <w:t>arguing</w:t>
       </w:r>
       <w:r>
-        <w:t xml:space="preserve">, how tf are you gonna </w:t>
+        <w:t xml:space="preserve">, how </w:t>
+      </w:r>
+      <w:proofErr w:type="spellStart"/>
+      <w:r>
+        <w:t>tf</w:t>
+      </w:r>
+      <w:proofErr w:type="spellEnd"/>
+      <w:r>
+        <w:t xml:space="preserve"> are you </w:t>
+      </w:r>
+      <w:proofErr w:type="spellStart"/>
+      <w:r>
+        <w:t>gonna</w:t>
+      </w:r>
+      <w:proofErr w:type="spellEnd"/>
+      <w:r>
+        <w:t xml:space="preserve"> </w:t>
       </w:r>
       <w:r>
         <w:t>figure out what’s wrong and what’s right</w:t>
@@ -4923,24 +6147,33 @@
       <w:r>
         <w:t xml:space="preserve"> being so nice </w:t>
       </w:r>
+      <w:proofErr w:type="gramStart"/>
       <w:r>
         <w:t>like</w:t>
       </w:r>
+      <w:proofErr w:type="gramEnd"/>
       <w:r>
         <w:t xml:space="preserve"> we</w:t>
       </w:r>
       <w:r>
-        <w:t xml:space="preserve"> are gonna</w:t>
-      </w:r>
+        <w:t xml:space="preserve"> are </w:t>
+      </w:r>
+      <w:proofErr w:type="spellStart"/>
+      <w:r>
+        <w:t>gonna</w:t>
+      </w:r>
+      <w:proofErr w:type="spellEnd"/>
       <w:r>
         <w:t xml:space="preserve"> believe it</w:t>
       </w:r>
       <w:r>
         <w:t xml:space="preserve">. Maybe </w:t>
       </w:r>
+      <w:proofErr w:type="spellStart"/>
       <w:r>
         <w:t>cyberdivers</w:t>
       </w:r>
+      <w:proofErr w:type="spellEnd"/>
       <w:r>
         <w:t xml:space="preserve"> are rude, maybe we are toxic</w:t>
       </w:r>
@@ -4957,8 +6190,13 @@
         <w:t xml:space="preserve"> asshole, moron, retard, fuckwit, dumbass, braindead, stupid, dickhead</w:t>
       </w:r>
       <w:r>
-        <w:t>, room temperature iq</w:t>
-      </w:r>
+        <w:t xml:space="preserve">, room temperature </w:t>
+      </w:r>
+      <w:proofErr w:type="spellStart"/>
+      <w:r>
+        <w:t>iq</w:t>
+      </w:r>
+      <w:proofErr w:type="spellEnd"/>
       <w:r>
         <w:t xml:space="preserve"> imbecile,</w:t>
       </w:r>
@@ -4966,7 +6204,15 @@
         <w:t xml:space="preserve"> </w:t>
       </w:r>
       <w:r>
-        <w:t xml:space="preserve">motherfucker, fatherfucker, </w:t>
+        <w:t xml:space="preserve">motherfucker, </w:t>
+      </w:r>
+      <w:proofErr w:type="spellStart"/>
+      <w:r>
+        <w:t>fatherfucker</w:t>
+      </w:r>
+      <w:proofErr w:type="spellEnd"/>
+      <w:r>
+        <w:t xml:space="preserve">, </w:t>
       </w:r>
       <w:r>
         <w:t xml:space="preserve">product of the </w:t>
@@ -4988,13 +6234,23 @@
     </w:p>
     <w:p>
       <w:r>
-        <w:t>fuckface, shitfuck</w:t>
-      </w:r>
+        <w:t xml:space="preserve">fuckface, </w:t>
+      </w:r>
+      <w:proofErr w:type="spellStart"/>
+      <w:r>
+        <w:t>shitfuck</w:t>
+      </w:r>
+      <w:proofErr w:type="spellEnd"/>
       <w:r>
         <w:t xml:space="preserve">, </w:t>
       </w:r>
-      <w:r>
-        <w:t>fuckfuck but</w:t>
+      <w:proofErr w:type="spellStart"/>
+      <w:r>
+        <w:t>fuckfuck</w:t>
+      </w:r>
+      <w:proofErr w:type="spellEnd"/>
+      <w:r>
+        <w:t xml:space="preserve"> but</w:t>
       </w:r>
       <w:r>
         <w:t xml:space="preserve"> at least we are honest</w:t>
@@ -5033,7 +6289,15 @@
     </w:p>
     <w:p>
       <w:r>
-        <w:t>(Ui elements start to fall down)</w:t>
+        <w:t xml:space="preserve">(Ui elements start to </w:t>
+      </w:r>
+      <w:proofErr w:type="gramStart"/>
+      <w:r>
+        <w:t>fall down</w:t>
+      </w:r>
+      <w:proofErr w:type="gramEnd"/>
+      <w:r>
+        <w:t>)</w:t>
       </w:r>
     </w:p>
     <w:p>
@@ -5062,7 +6326,15 @@
         <w:t xml:space="preserve"> </w:t>
       </w:r>
       <w:r>
-        <w:t xml:space="preserve">Fuck them. But how can I bring them down? …uhhhh… Maybe I could hack them somehow? </w:t>
+        <w:t>Fuck them. But how can I bring them down? …</w:t>
+      </w:r>
+      <w:proofErr w:type="spellStart"/>
+      <w:r>
+        <w:t>uhhhh</w:t>
+      </w:r>
+      <w:proofErr w:type="spellEnd"/>
+      <w:r>
+        <w:t xml:space="preserve">… Maybe I could hack them somehow? </w:t>
       </w:r>
       <w:r>
         <w:t xml:space="preserve">I </w:t>
@@ -5074,13 +6346,34 @@
         <w:t xml:space="preserve"> back </w:t>
       </w:r>
       <w:r>
-        <w:t>in school I took some programming classes</w:t>
-      </w:r>
+        <w:t xml:space="preserve">in school I took some programming </w:t>
+      </w:r>
+      <w:proofErr w:type="gramStart"/>
+      <w:r>
+        <w:t>classes</w:t>
+      </w:r>
+      <w:proofErr w:type="gramEnd"/>
       <w:r>
         <w:t xml:space="preserve"> </w:t>
       </w:r>
       <w:r>
-        <w:t>and I learned smth about webdev and some cybersecurity stuff</w:t>
+        <w:t xml:space="preserve">and I learned </w:t>
+      </w:r>
+      <w:proofErr w:type="spellStart"/>
+      <w:r>
+        <w:t>smth</w:t>
+      </w:r>
+      <w:proofErr w:type="spellEnd"/>
+      <w:r>
+        <w:t xml:space="preserve"> about </w:t>
+      </w:r>
+      <w:proofErr w:type="spellStart"/>
+      <w:r>
+        <w:t>webdev</w:t>
+      </w:r>
+      <w:proofErr w:type="spellEnd"/>
+      <w:r>
+        <w:t xml:space="preserve"> and some cybersecurity stuff</w:t>
       </w:r>
       <w:r>
         <w:t>, like phishing</w:t>
@@ -5092,10 +6385,34 @@
         <w:t xml:space="preserve"> Shit, it was ages ago. </w:t>
       </w:r>
       <w:r>
-        <w:t xml:space="preserve">I end up dropping out, cuz my classmates were </w:t>
-      </w:r>
-      <w:r>
-        <w:t>dickheads. Like always with their patronizing bullshit “ohhh main_hero, we can help you out if you are struggling”, while making fun of me behind my back</w:t>
+        <w:t xml:space="preserve">I end up dropping out, </w:t>
+      </w:r>
+      <w:proofErr w:type="spellStart"/>
+      <w:r>
+        <w:t>cuz</w:t>
+      </w:r>
+      <w:proofErr w:type="spellEnd"/>
+      <w:r>
+        <w:t xml:space="preserve"> my classmates were </w:t>
+      </w:r>
+      <w:r>
+        <w:t>dickheads. Like always with their patronizing bullshit “</w:t>
+      </w:r>
+      <w:proofErr w:type="spellStart"/>
+      <w:r>
+        <w:t>ohhh</w:t>
+      </w:r>
+      <w:proofErr w:type="spellEnd"/>
+      <w:r>
+        <w:t xml:space="preserve"> </w:t>
+      </w:r>
+      <w:proofErr w:type="spellStart"/>
+      <w:r>
+        <w:t>main_hero</w:t>
+      </w:r>
+      <w:proofErr w:type="spellEnd"/>
+      <w:r>
+        <w:t>, we can help you out if you are struggling”, while making fun of me behind my back</w:t>
       </w:r>
       <w:r>
         <w:t xml:space="preserve">. </w:t>
@@ -5107,7 +6424,15 @@
         <w:t>.</w:t>
       </w:r>
       <w:r>
-        <w:t xml:space="preserve"> Kind of reminded me of zero sub too.</w:t>
+        <w:t xml:space="preserve"> Kind of reminded me of zero </w:t>
+      </w:r>
+      <w:proofErr w:type="gramStart"/>
+      <w:r>
+        <w:t>sub</w:t>
+      </w:r>
+      <w:proofErr w:type="gramEnd"/>
+      <w:r>
+        <w:t xml:space="preserve"> too.</w:t>
       </w:r>
       <w:r>
         <w:t xml:space="preserve"> Well, whatever, who gives a shit</w:t>
@@ -5192,9 +6517,11 @@
       <w:r>
         <w:t xml:space="preserve">in </w:t>
       </w:r>
+      <w:proofErr w:type="spellStart"/>
       <w:r>
         <w:t>cyberdivers</w:t>
       </w:r>
+      <w:proofErr w:type="spellEnd"/>
       <w:r>
         <w:t xml:space="preserve"> chat</w:t>
       </w:r>
@@ -5229,8 +6556,21 @@
       </w:r>
     </w:p>
     <w:p>
-      <w:r>
-        <w:t xml:space="preserve">Main_hero: I’m gonna hack </w:t>
+      <w:proofErr w:type="spellStart"/>
+      <w:r>
+        <w:t>Main_hero</w:t>
+      </w:r>
+      <w:proofErr w:type="spellEnd"/>
+      <w:r>
+        <w:t xml:space="preserve">: I’m </w:t>
+      </w:r>
+      <w:proofErr w:type="spellStart"/>
+      <w:r>
+        <w:t>gonna</w:t>
+      </w:r>
+      <w:proofErr w:type="spellEnd"/>
+      <w:r>
+        <w:t xml:space="preserve"> hack </w:t>
       </w:r>
       <w:r>
         <w:t>zero</w:t>
@@ -5268,8 +6608,13 @@
         <w:t>6</w:t>
       </w:r>
       <w:r>
-        <w:t>: ahahahah</w:t>
-      </w:r>
+        <w:t xml:space="preserve">: </w:t>
+      </w:r>
+      <w:proofErr w:type="spellStart"/>
+      <w:r>
+        <w:t>ahahahah</w:t>
+      </w:r>
+      <w:proofErr w:type="spellEnd"/>
     </w:p>
     <w:p>
       <w:r>
@@ -5295,7 +6640,15 @@
         <w:t>8</w:t>
       </w:r>
       <w:r>
-        <w:t>: u can’t even use a keyboard son fym hack</w:t>
+        <w:t xml:space="preserve">: u can’t even use a keyboard son </w:t>
+      </w:r>
+      <w:proofErr w:type="spellStart"/>
+      <w:r>
+        <w:t>fym</w:t>
+      </w:r>
+      <w:proofErr w:type="spellEnd"/>
+      <w:r>
+        <w:t xml:space="preserve"> hack</w:t>
       </w:r>
     </w:p>
     <w:p>
@@ -5325,9 +6678,6 @@
         <w:t xml:space="preserve">User </w:t>
       </w:r>
       <w:r>
-        <w:rPr>
-          <w:lang w:val="ru-RU"/>
-        </w:rPr>
         <w:t>11</w:t>
       </w:r>
       <w:r>
@@ -5335,38 +6685,82 @@
       </w:r>
     </w:p>
     <w:p>
-      <w:r>
-        <w:t>Main_hero: nah y’all will see, I actually can do it</w:t>
-      </w:r>
-    </w:p>
-    <w:p>
-      <w:r>
-        <w:t>User 4: bro</w:t>
-      </w:r>
-      <w:r>
-        <w:t>chacho stfu</w:t>
-      </w:r>
-    </w:p>
-    <w:p>
-      <w:r>
-        <w:t>User 6: im crying wtf are u talking about lmaooo</w:t>
-      </w:r>
+      <w:proofErr w:type="spellStart"/>
+      <w:r>
+        <w:t>Main_hero</w:t>
+      </w:r>
+      <w:proofErr w:type="spellEnd"/>
+      <w:r>
+        <w:t xml:space="preserve">: nah y’all will see, I </w:t>
+      </w:r>
+      <w:proofErr w:type="gramStart"/>
+      <w:r>
+        <w:t>actually can</w:t>
+      </w:r>
+      <w:proofErr w:type="gramEnd"/>
+      <w:r>
+        <w:t xml:space="preserve"> do it</w:t>
+      </w:r>
+    </w:p>
+    <w:p>
+      <w:r>
+        <w:t xml:space="preserve">User 4: </w:t>
+      </w:r>
+      <w:proofErr w:type="spellStart"/>
+      <w:r>
+        <w:t>bro</w:t>
+      </w:r>
+      <w:r>
+        <w:t>chacho</w:t>
+      </w:r>
+      <w:proofErr w:type="spellEnd"/>
+      <w:r>
+        <w:t xml:space="preserve"> stfu</w:t>
+      </w:r>
+    </w:p>
+    <w:p>
+      <w:r>
+        <w:t xml:space="preserve">User 6: </w:t>
+      </w:r>
+      <w:proofErr w:type="spellStart"/>
+      <w:r>
+        <w:t>im</w:t>
+      </w:r>
+      <w:proofErr w:type="spellEnd"/>
+      <w:r>
+        <w:t xml:space="preserve"> crying wtf are u talking about </w:t>
+      </w:r>
+      <w:proofErr w:type="spellStart"/>
+      <w:r>
+        <w:t>lmaooo</w:t>
+      </w:r>
+      <w:proofErr w:type="spellEnd"/>
     </w:p>
     <w:p>
       <w:r>
         <w:lastRenderedPageBreak/>
         <w:t xml:space="preserve">User 5: u r like in the top 10 worst </w:t>
       </w:r>
+      <w:proofErr w:type="spellStart"/>
       <w:r>
         <w:t>cyberdivers</w:t>
       </w:r>
+      <w:proofErr w:type="spellEnd"/>
       <w:r>
         <w:t xml:space="preserve"> oat and u r saying u can hack anything? Bruh wtf</w:t>
       </w:r>
     </w:p>
     <w:p>
       <w:r>
-        <w:t>User 13: instant cyberdivers classic</w:t>
+        <w:t xml:space="preserve">User 13: instant </w:t>
+      </w:r>
+      <w:proofErr w:type="spellStart"/>
+      <w:r>
+        <w:t>cyberdivers</w:t>
+      </w:r>
+      <w:proofErr w:type="spellEnd"/>
+      <w:r>
+        <w:t xml:space="preserve"> classic</w:t>
       </w:r>
     </w:p>
     <w:p>
@@ -5379,12 +6773,36 @@
     </w:p>
     <w:p>
       <w:r>
-        <w:t>User 10: bro is a poser lmao, proly don’t even know what is sqli is lol</w:t>
-      </w:r>
-    </w:p>
-    <w:p>
-      <w:r>
-        <w:t xml:space="preserve">No no, I know what it is, it’s a language…for hacking databases…or something. </w:t>
+        <w:t xml:space="preserve">User 10: bro is a poser lmao, </w:t>
+      </w:r>
+      <w:proofErr w:type="spellStart"/>
+      <w:r>
+        <w:t>proly</w:t>
+      </w:r>
+      <w:proofErr w:type="spellEnd"/>
+      <w:r>
+        <w:t xml:space="preserve"> don’t even know what is </w:t>
+      </w:r>
+      <w:proofErr w:type="spellStart"/>
+      <w:r>
+        <w:t>sqli</w:t>
+      </w:r>
+      <w:proofErr w:type="spellEnd"/>
+      <w:r>
+        <w:t xml:space="preserve"> is lol</w:t>
+      </w:r>
+    </w:p>
+    <w:p>
+      <w:r>
+        <w:t xml:space="preserve">No </w:t>
+      </w:r>
+      <w:proofErr w:type="spellStart"/>
+      <w:r>
+        <w:t>no</w:t>
+      </w:r>
+      <w:proofErr w:type="spellEnd"/>
+      <w:r>
+        <w:t xml:space="preserve">, I know what it is, it’s a language…for hacking databases…or something. </w:t>
       </w:r>
       <w:r>
         <w:t>It doesn’t</w:t>
@@ -5410,7 +6828,15 @@
     </w:p>
     <w:p>
       <w:r>
-        <w:t xml:space="preserve">Alright, I need a plan. How am I gonna do that? Brief search on phishing shows that </w:t>
+        <w:t xml:space="preserve">Alright, I need a plan. How am I </w:t>
+      </w:r>
+      <w:proofErr w:type="spellStart"/>
+      <w:r>
+        <w:t>gonna</w:t>
+      </w:r>
+      <w:proofErr w:type="spellEnd"/>
+      <w:r>
+        <w:t xml:space="preserve"> do that? Brief search on phishing shows that </w:t>
       </w:r>
       <w:r>
         <w:t>hackers send fake login screens and people fall for them. Why don’t I do the same</w:t>
@@ -5419,17 +6845,35 @@
         <w:t xml:space="preserve">? </w:t>
       </w:r>
       <w:r>
-        <w:t>Admin will click on the link and…well yeah, he’ll probably suspect something. Well, ummm…maybee</w:t>
-      </w:r>
+        <w:t xml:space="preserve">Admin will click on the link and…well yeah, he’ll probably suspect something. Well, </w:t>
+      </w:r>
+      <w:proofErr w:type="spellStart"/>
+      <w:r>
+        <w:t>ummm</w:t>
+      </w:r>
+      <w:proofErr w:type="spellEnd"/>
+      <w:r>
+        <w:t>…</w:t>
+      </w:r>
+      <w:proofErr w:type="spellStart"/>
+      <w:r>
+        <w:t>maybee</w:t>
+      </w:r>
+      <w:proofErr w:type="spellEnd"/>
       <w:r>
         <w:t xml:space="preserve"> </w:t>
       </w:r>
       <w:r>
-        <w:t>…uhhh</w:t>
-      </w:r>
-      <w:r>
         <w:t>…</w:t>
       </w:r>
+      <w:proofErr w:type="spellStart"/>
+      <w:r>
+        <w:t>uhhh</w:t>
+      </w:r>
+      <w:proofErr w:type="spellEnd"/>
+      <w:r>
+        <w:t>…</w:t>
+      </w:r>
       <w:r>
         <w:t xml:space="preserve"> </w:t>
       </w:r>
@@ -5453,11 +6897,21 @@
       <w:r>
         <w:t xml:space="preserve">Yeah, that is fucking retarded, this is </w:t>
       </w:r>
+      <w:proofErr w:type="gramStart"/>
       <w:r>
         <w:t>definitely not</w:t>
       </w:r>
-      <w:r>
-        <w:t xml:space="preserve"> gonna work, </w:t>
+      <w:proofErr w:type="gramEnd"/>
+      <w:r>
+        <w:t xml:space="preserve"> </w:t>
+      </w:r>
+      <w:proofErr w:type="spellStart"/>
+      <w:r>
+        <w:t>gonna</w:t>
+      </w:r>
+      <w:proofErr w:type="spellEnd"/>
+      <w:r>
+        <w:t xml:space="preserve"> work, </w:t>
       </w:r>
       <w:r>
         <w:t>you can’t phish even your grandma with this</w:t>
@@ -5499,11 +6953,16 @@
     </w:p>
     <w:p>
       <w:r>
-        <w:t>(Fake post appear</w:t>
+        <w:t xml:space="preserve">(Fake </w:t>
+      </w:r>
+      <w:proofErr w:type="gramStart"/>
+      <w:r>
+        <w:t>post appear</w:t>
       </w:r>
       <w:r>
         <w:t>s</w:t>
       </w:r>
+      <w:proofErr w:type="gramEnd"/>
       <w:r>
         <w:t>)</w:t>
       </w:r>
@@ -5520,7 +6979,15 @@
     </w:p>
     <w:p>
       <w:r>
-        <w:t xml:space="preserve">and suddenly it takes him to fake login screen with message like ur </w:t>
+        <w:t xml:space="preserve">and suddenly it takes him to fake login screen with message like </w:t>
+      </w:r>
+      <w:proofErr w:type="spellStart"/>
+      <w:r>
+        <w:t>ur</w:t>
+      </w:r>
+      <w:proofErr w:type="spellEnd"/>
+      <w:r>
+        <w:t xml:space="preserve"> </w:t>
       </w:r>
       <w:r>
         <w:t>session</w:t>
@@ -5531,7 +6998,15 @@
     </w:p>
     <w:p>
       <w:r>
-        <w:t xml:space="preserve">(Login screen appears, with the message “ur </w:t>
+        <w:t>(Login screen appears, with the message “</w:t>
+      </w:r>
+      <w:proofErr w:type="spellStart"/>
+      <w:r>
+        <w:t>ur</w:t>
+      </w:r>
+      <w:proofErr w:type="spellEnd"/>
+      <w:r>
+        <w:t xml:space="preserve"> </w:t>
       </w:r>
       <w:r>
         <w:t>session</w:t>
@@ -5559,7 +7034,15 @@
     </w:p>
     <w:p>
       <w:r>
-        <w:t>(User is prompted to login and forwarded to page where the post is deleted)</w:t>
+        <w:t xml:space="preserve">(User is prompted to login and </w:t>
+      </w:r>
+      <w:proofErr w:type="gramStart"/>
+      <w:r>
+        <w:t>forwarded</w:t>
+      </w:r>
+      <w:proofErr w:type="gramEnd"/>
+      <w:r>
+        <w:t xml:space="preserve"> to page where the post is deleted)</w:t>
       </w:r>
     </w:p>
     <w:p>
@@ -5592,7 +7075,15 @@
     </w:p>
     <w:p>
       <w:r>
-        <w:t>Alright, first I gotta open vim. Fuck IDEs</w:t>
+        <w:t xml:space="preserve">Alright, first I </w:t>
+      </w:r>
+      <w:proofErr w:type="spellStart"/>
+      <w:r>
+        <w:t>gotta</w:t>
+      </w:r>
+      <w:proofErr w:type="spellEnd"/>
+      <w:r>
+        <w:t xml:space="preserve"> open vim. Fuck IDEs</w:t>
       </w:r>
       <w:r>
         <w:t>,</w:t>
@@ -5608,7 +7099,15 @@
     </w:p>
     <w:p>
       <w:r>
-        <w:t xml:space="preserve">So uhhhhh, how do I create a page? I </w:t>
+        <w:t xml:space="preserve">So </w:t>
+      </w:r>
+      <w:proofErr w:type="spellStart"/>
+      <w:r>
+        <w:t>uhhhhh</w:t>
+      </w:r>
+      <w:proofErr w:type="spellEnd"/>
+      <w:r>
+        <w:t xml:space="preserve">, how do I create a page? I </w:t>
       </w:r>
       <w:r>
         <w:t>think I still remember something.</w:t>
@@ -5616,10 +7115,34 @@
     </w:p>
     <w:p>
       <w:r>
-        <w:t>(User is prompted to type the code</w:t>
-      </w:r>
-      <w:r>
-        <w:t xml:space="preserve"> up to the some point. Code is from Post.tsx, but with mistakes</w:t>
+        <w:t>(</w:t>
+      </w:r>
+      <w:proofErr w:type="gramStart"/>
+      <w:r>
+        <w:t>User is</w:t>
+      </w:r>
+      <w:proofErr w:type="gramEnd"/>
+      <w:r>
+        <w:t xml:space="preserve"> prompted to type the code</w:t>
+      </w:r>
+      <w:r>
+        <w:t xml:space="preserve"> up to </w:t>
+      </w:r>
+      <w:proofErr w:type="gramStart"/>
+      <w:r>
+        <w:t>the some</w:t>
+      </w:r>
+      <w:proofErr w:type="gramEnd"/>
+      <w:r>
+        <w:t xml:space="preserve"> point. Code is from </w:t>
+      </w:r>
+      <w:proofErr w:type="spellStart"/>
+      <w:r>
+        <w:t>Post.tsx</w:t>
+      </w:r>
+      <w:proofErr w:type="spellEnd"/>
+      <w:r>
+        <w:t>, but with mistakes</w:t>
       </w:r>
       <w:r>
         <w:t>)</w:t>
@@ -5627,7 +7150,15 @@
     </w:p>
     <w:p>
       <w:r>
-        <w:t xml:space="preserve">Ok, I actually forgot everything. I don’t think this even works. </w:t>
+        <w:t xml:space="preserve">Ok, I </w:t>
+      </w:r>
+      <w:proofErr w:type="gramStart"/>
+      <w:r>
+        <w:t>actually forgot</w:t>
+      </w:r>
+      <w:proofErr w:type="gramEnd"/>
+      <w:r>
+        <w:t xml:space="preserve"> everything. I don’t think this even works. </w:t>
       </w:r>
     </w:p>
     <w:p>
@@ -5650,9 +7181,11 @@
       </w:r>
     </w:p>
     <w:p>
+      <w:proofErr w:type="spellStart"/>
       <w:r>
         <w:t>Aight</w:t>
       </w:r>
+      <w:proofErr w:type="spellEnd"/>
       <w:r>
         <w:t>…this goes here…</w:t>
       </w:r>
@@ -5662,23 +7195,60 @@
     </w:p>
     <w:p>
       <w:r>
-        <w:t>And first page done!</w:t>
-      </w:r>
-    </w:p>
-    <w:p>
-      <w:r>
-        <w:t>(Main_hero tries to exit vim)</w:t>
-      </w:r>
-    </w:p>
-    <w:p>
-      <w:r>
-        <w:t>Ok, how do I?...fuck..uhhh…I forgot again</w:t>
+        <w:t xml:space="preserve">And first page </w:t>
+      </w:r>
+      <w:proofErr w:type="gramStart"/>
+      <w:r>
+        <w:t>done</w:t>
+      </w:r>
+      <w:proofErr w:type="gramEnd"/>
+      <w:r>
+        <w:t>!</w:t>
+      </w:r>
+    </w:p>
+    <w:p>
+      <w:r>
+        <w:t>(</w:t>
+      </w:r>
+      <w:proofErr w:type="spellStart"/>
+      <w:r>
+        <w:t>Main_hero</w:t>
+      </w:r>
+      <w:proofErr w:type="spellEnd"/>
+      <w:r>
+        <w:t xml:space="preserve"> tries to exit vim)</w:t>
+      </w:r>
+    </w:p>
+    <w:p>
+      <w:r>
+        <w:t xml:space="preserve">Ok, how do </w:t>
+      </w:r>
+      <w:proofErr w:type="gramStart"/>
+      <w:r>
+        <w:t>I?...fuck..</w:t>
+      </w:r>
+      <w:proofErr w:type="spellStart"/>
+      <w:proofErr w:type="gramEnd"/>
+      <w:r>
+        <w:t>uhhh</w:t>
+      </w:r>
+      <w:proofErr w:type="spellEnd"/>
+      <w:r>
+        <w:t>…I forgot again</w:t>
       </w:r>
       <w:r>
         <w:t>…fucking dumbass</w:t>
       </w:r>
       <w:r>
-        <w:t>…uhhhh…here it is</w:t>
+        <w:t>…</w:t>
+      </w:r>
+      <w:proofErr w:type="spellStart"/>
+      <w:r>
+        <w:t>uhhhh</w:t>
+      </w:r>
+      <w:proofErr w:type="spellEnd"/>
+      <w:r>
+        <w:t>…here it is</w:t>
       </w:r>
       <w:r>
         <w:t>.</w:t>
@@ -5727,8 +7297,21 @@
       </w:r>
     </w:p>
     <w:p>
-      <w:r>
-        <w:t>Aaaand im done! Now I just need to trick sillygoose228</w:t>
+      <w:proofErr w:type="spellStart"/>
+      <w:r>
+        <w:t>Aaaand</w:t>
+      </w:r>
+      <w:proofErr w:type="spellEnd"/>
+      <w:r>
+        <w:t xml:space="preserve"> </w:t>
+      </w:r>
+      <w:proofErr w:type="spellStart"/>
+      <w:r>
+        <w:t>im</w:t>
+      </w:r>
+      <w:proofErr w:type="spellEnd"/>
+      <w:r>
+        <w:t xml:space="preserve"> done! Now I just need to trick sillygoose228</w:t>
       </w:r>
       <w:r>
         <w:t>.</w:t>
@@ -5736,7 +7319,23 @@
     </w:p>
     <w:p>
       <w:r>
-        <w:t>(Screen goes to main_hero’s profile page. User is prompted to search for sillygoose228 nickname)</w:t>
+        <w:t xml:space="preserve">(Screen goes to </w:t>
+      </w:r>
+      <w:proofErr w:type="spellStart"/>
+      <w:r>
+        <w:t>main_hero’s</w:t>
+      </w:r>
+      <w:proofErr w:type="spellEnd"/>
+      <w:r>
+        <w:t xml:space="preserve"> profile page. </w:t>
+      </w:r>
+      <w:proofErr w:type="gramStart"/>
+      <w:r>
+        <w:t>User is</w:t>
+      </w:r>
+      <w:proofErr w:type="gramEnd"/>
+      <w:r>
+        <w:t xml:space="preserve"> prompted to search for sillygoose228 nickname)</w:t>
       </w:r>
     </w:p>
     <w:p>
@@ -5747,7 +7346,23 @@
         <w:t>h</w:t>
       </w:r>
       <w:r>
-        <w:t xml:space="preserve">is name is stupid. Not like mine tho. Main_hero. </w:t>
+        <w:t xml:space="preserve">is name is stupid. Not like mine </w:t>
+      </w:r>
+      <w:proofErr w:type="spellStart"/>
+      <w:r>
+        <w:t>tho</w:t>
+      </w:r>
+      <w:proofErr w:type="spellEnd"/>
+      <w:r>
+        <w:t xml:space="preserve">. </w:t>
+      </w:r>
+      <w:proofErr w:type="spellStart"/>
+      <w:r>
+        <w:t>Main_hero</w:t>
+      </w:r>
+      <w:proofErr w:type="spellEnd"/>
+      <w:r>
+        <w:t xml:space="preserve">. </w:t>
       </w:r>
       <w:r>
         <w:t>You might not see this yet, but my nickname has at least</w:t>
@@ -5810,17 +7425,49 @@
         <w:t>i</w:t>
       </w:r>
       <w:r>
-        <w:t>t ‘ll go like that, uhhh “</w:t>
+        <w:t xml:space="preserve">t ‘ll go like that, </w:t>
+      </w:r>
+      <w:proofErr w:type="spellStart"/>
+      <w:r>
+        <w:t>uhhh</w:t>
+      </w:r>
+      <w:proofErr w:type="spellEnd"/>
+      <w:r>
+        <w:t xml:space="preserve"> “</w:t>
       </w:r>
       <w:r>
         <w:t>D</w:t>
       </w:r>
       <w:r>
-        <w:t xml:space="preserve">ear sillygoose228, it came to my attention that- no who the fuck reports posts like that? “Dear sillygoose228, there is a post I want you to look at- nah it </w:t>
+        <w:t xml:space="preserve">ear sillygoose228, it came to my attention that- </w:t>
+      </w:r>
+      <w:proofErr w:type="spellStart"/>
+      <w:r>
+        <w:t>no</w:t>
+      </w:r>
+      <w:proofErr w:type="spellEnd"/>
+      <w:r>
+        <w:t xml:space="preserve"> who the fuck reports posts like that? “Dear sillygoose228, there is a post I want you to look at- nah it </w:t>
       </w:r>
       <w:r>
         <w:lastRenderedPageBreak/>
-        <w:t>sounds so stupid, he’ll definitely catch me. No, I need to go simple, like “Dear sillygoose228, look at this post”- Nooo why “dear”? We haven’t even met. No, I need to be plain and direct</w:t>
+        <w:t xml:space="preserve">sounds so stupid, he’ll </w:t>
+      </w:r>
+      <w:proofErr w:type="gramStart"/>
+      <w:r>
+        <w:t>definitely catch</w:t>
+      </w:r>
+      <w:proofErr w:type="gramEnd"/>
+      <w:r>
+        <w:t xml:space="preserve"> me. No, I need to go simple, like “Dear sillygoose228, look at this post”- </w:t>
+      </w:r>
+      <w:proofErr w:type="spellStart"/>
+      <w:r>
+        <w:t>Nooo</w:t>
+      </w:r>
+      <w:proofErr w:type="spellEnd"/>
+      <w:r>
+        <w:t xml:space="preserve"> why “dear”? We haven’t even met. No, I need to be plain and direct</w:t>
       </w:r>
       <w:r>
         <w:t xml:space="preserve"> like</w:t>
@@ -5832,7 +7479,15 @@
         <w:t xml:space="preserve">No, no, even simpler, just send him the link to the post. Yeah, that will do, </w:t>
       </w:r>
       <w:r>
-        <w:t>he definitely won’t suspect anything</w:t>
+        <w:t xml:space="preserve">he </w:t>
+      </w:r>
+      <w:proofErr w:type="gramStart"/>
+      <w:r>
+        <w:t>definitely won’t</w:t>
+      </w:r>
+      <w:proofErr w:type="gramEnd"/>
+      <w:r>
+        <w:t xml:space="preserve"> suspect anything</w:t>
       </w:r>
       <w:r>
         <w:t>!</w:t>
@@ -5844,8 +7499,13 @@
       </w:r>
     </w:p>
     <w:p>
-      <w:r>
-        <w:t xml:space="preserve">Main_hero: </w:t>
+      <w:proofErr w:type="spellStart"/>
+      <w:r>
+        <w:t>Main_hero</w:t>
+      </w:r>
+      <w:proofErr w:type="spellEnd"/>
+      <w:r>
+        <w:t xml:space="preserve">: </w:t>
       </w:r>
       <w:r>
         <w:rPr>
@@ -5909,18 +7569,41 @@
       </w:r>
     </w:p>
     <w:p>
-      <w:r>
-        <w:t>Main_hero: it’s the post from ur sub</w:t>
-      </w:r>
-    </w:p>
-    <w:p>
-      <w:r>
-        <w:t>Main_hero: I’m reporting it</w:t>
-      </w:r>
-    </w:p>
-    <w:p>
-      <w:r>
-        <w:t xml:space="preserve">Main_hero: like a </w:t>
+      <w:proofErr w:type="spellStart"/>
+      <w:r>
+        <w:t>Main_hero</w:t>
+      </w:r>
+      <w:proofErr w:type="spellEnd"/>
+      <w:r>
+        <w:t xml:space="preserve">: it’s the post from </w:t>
+      </w:r>
+      <w:proofErr w:type="spellStart"/>
+      <w:r>
+        <w:t>ur</w:t>
+      </w:r>
+      <w:proofErr w:type="spellEnd"/>
+      <w:r>
+        <w:t xml:space="preserve"> sub</w:t>
+      </w:r>
+    </w:p>
+    <w:p>
+      <w:proofErr w:type="spellStart"/>
+      <w:r>
+        <w:t>Main_hero</w:t>
+      </w:r>
+      <w:proofErr w:type="spellEnd"/>
+      <w:r>
+        <w:t>: I’m reporting it</w:t>
+      </w:r>
+    </w:p>
+    <w:p>
+      <w:proofErr w:type="spellStart"/>
+      <w:r>
+        <w:t>Main_hero</w:t>
+      </w:r>
+      <w:proofErr w:type="spellEnd"/>
+      <w:r>
+        <w:t xml:space="preserve">: like a </w:t>
       </w:r>
       <w:r>
         <w:t>good</w:t>
@@ -5928,9 +7611,11 @@
       <w:r>
         <w:t xml:space="preserve"> </w:t>
       </w:r>
+      <w:proofErr w:type="spellStart"/>
       <w:r>
         <w:t>forumer</w:t>
       </w:r>
+      <w:proofErr w:type="spellEnd"/>
     </w:p>
     <w:p>
       <w:r>
@@ -5942,7 +7627,15 @@
     </w:p>
     <w:p>
       <w:r>
-        <w:t xml:space="preserve">Sillygoose228: uhhh ok, </w:t>
+        <w:t xml:space="preserve">Sillygoose228: </w:t>
+      </w:r>
+      <w:proofErr w:type="spellStart"/>
+      <w:r>
+        <w:t>uhhh</w:t>
+      </w:r>
+      <w:proofErr w:type="spellEnd"/>
+      <w:r>
+        <w:t xml:space="preserve"> ok, </w:t>
       </w:r>
       <w:r>
         <w:t>let me</w:t>
@@ -5969,22 +7662,56 @@
     </w:p>
     <w:p>
       <w:r>
-        <w:t xml:space="preserve">I think it takes longer than it should, no? </w:t>
-      </w:r>
-    </w:p>
-    <w:p>
-      <w:r>
-        <w:t>(Every sentence is in it’s own typing box)</w:t>
-      </w:r>
-    </w:p>
-    <w:p>
-      <w:r>
-        <w:t>Fuck, I'm so cooked, It's fucking over.</w:t>
-      </w:r>
-    </w:p>
-    <w:p>
-      <w:r>
-        <w:t>Shit, he is probably reporting me already</w:t>
+        <w:t xml:space="preserve">I think it takes longer than it should, </w:t>
+      </w:r>
+      <w:proofErr w:type="gramStart"/>
+      <w:r>
+        <w:t>no</w:t>
+      </w:r>
+      <w:proofErr w:type="gramEnd"/>
+      <w:r>
+        <w:t xml:space="preserve">? </w:t>
+      </w:r>
+    </w:p>
+    <w:p>
+      <w:r>
+        <w:t xml:space="preserve">(Every sentence is in </w:t>
+      </w:r>
+      <w:proofErr w:type="spellStart"/>
+      <w:proofErr w:type="gramStart"/>
+      <w:r>
+        <w:t>it’s</w:t>
+      </w:r>
+      <w:proofErr w:type="spellEnd"/>
+      <w:proofErr w:type="gramEnd"/>
+      <w:r>
+        <w:t xml:space="preserve"> own typing box)</w:t>
+      </w:r>
+    </w:p>
+    <w:p>
+      <w:r>
+        <w:t xml:space="preserve">Fuck, I'm so cooked, </w:t>
+      </w:r>
+      <w:proofErr w:type="gramStart"/>
+      <w:r>
+        <w:t>It's</w:t>
+      </w:r>
+      <w:proofErr w:type="gramEnd"/>
+      <w:r>
+        <w:t xml:space="preserve"> fucking over.</w:t>
+      </w:r>
+    </w:p>
+    <w:p>
+      <w:r>
+        <w:t xml:space="preserve">Shit, he is probably </w:t>
+      </w:r>
+      <w:proofErr w:type="gramStart"/>
+      <w:r>
+        <w:t>reporting</w:t>
+      </w:r>
+      <w:proofErr w:type="gramEnd"/>
+      <w:r>
+        <w:t xml:space="preserve"> me already</w:t>
       </w:r>
       <w:r>
         <w:t>.</w:t>
@@ -6017,7 +7744,23 @@
     </w:p>
     <w:p>
       <w:r>
-        <w:t>I'm fucked, I'm definitely fucked.</w:t>
+        <w:t xml:space="preserve">I'm </w:t>
+      </w:r>
+      <w:proofErr w:type="gramStart"/>
+      <w:r>
+        <w:t>fucked,</w:t>
+      </w:r>
+      <w:proofErr w:type="gramEnd"/>
+      <w:r>
+        <w:t xml:space="preserve"> I'm </w:t>
+      </w:r>
+      <w:proofErr w:type="gramStart"/>
+      <w:r>
+        <w:t>definitely fucked</w:t>
+      </w:r>
+      <w:proofErr w:type="gramEnd"/>
+      <w:r>
+        <w:t>.</w:t>
       </w:r>
     </w:p>
     <w:p>
@@ -6058,7 +7801,15 @@
     </w:p>
     <w:p>
       <w:r>
-        <w:t>Here his password!</w:t>
+        <w:t xml:space="preserve">Here </w:t>
+      </w:r>
+      <w:proofErr w:type="gramStart"/>
+      <w:r>
+        <w:t>his</w:t>
+      </w:r>
+      <w:proofErr w:type="gramEnd"/>
+      <w:r>
+        <w:t xml:space="preserve"> password!</w:t>
       </w:r>
       <w:r>
         <w:t xml:space="preserve"> His password is iwant</w:t>
@@ -6072,12 +7823,14 @@
       <w:r>
         <w:t>topegme</w:t>
       </w:r>
+      <w:proofErr w:type="gramStart"/>
       <w:r>
         <w:t>822?</w:t>
       </w:r>
       <w:r>
         <w:t>…</w:t>
       </w:r>
+      <w:proofErr w:type="gramEnd"/>
       <w:r>
         <w:t>I guess bro</w:t>
       </w:r>
@@ -6132,7 +7885,17 @@
     </w:p>
     <w:p>
       <w:r>
-        <w:t>Even tho I got his creds already, he might realize what’s going on and change his password. I need to convince him it’s ok.</w:t>
+        <w:t xml:space="preserve">Even </w:t>
+      </w:r>
+      <w:proofErr w:type="spellStart"/>
+      <w:proofErr w:type="gramStart"/>
+      <w:r>
+        <w:t>tho</w:t>
+      </w:r>
+      <w:proofErr w:type="spellEnd"/>
+      <w:proofErr w:type="gramEnd"/>
+      <w:r>
+        <w:t xml:space="preserve"> I got his creds already, he might realize what’s going on and change his password. I need to convince him it’s ok.</w:t>
       </w:r>
     </w:p>
     <w:p>
@@ -6141,13 +7904,31 @@
       </w:r>
     </w:p>
     <w:p>
-      <w:r>
-        <w:t xml:space="preserve">Main_hero: uhhh idk, this user shows as deleted to me already. </w:t>
-      </w:r>
-    </w:p>
-    <w:p>
-      <w:r>
-        <w:t>Main_hero: m</w:t>
+      <w:proofErr w:type="spellStart"/>
+      <w:r>
+        <w:t>Main_hero</w:t>
+      </w:r>
+      <w:proofErr w:type="spellEnd"/>
+      <w:r>
+        <w:t xml:space="preserve">: </w:t>
+      </w:r>
+      <w:proofErr w:type="spellStart"/>
+      <w:r>
+        <w:t>uhhh</w:t>
+      </w:r>
+      <w:proofErr w:type="spellEnd"/>
+      <w:r>
+        <w:t xml:space="preserve"> idk, this user shows as deleted to me already. </w:t>
+      </w:r>
+    </w:p>
+    <w:p>
+      <w:proofErr w:type="spellStart"/>
+      <w:r>
+        <w:t>Main_hero</w:t>
+      </w:r>
+      <w:proofErr w:type="spellEnd"/>
+      <w:r>
+        <w:t>: m</w:t>
       </w:r>
       <w:r>
         <w:t>aybe The Forum admins already</w:t>
@@ -6163,8 +7944,29 @@
       </w:r>
     </w:p>
     <w:p>
-      <w:r>
-        <w:t>Main_hero: yk the forum is really buggy sometimes.</w:t>
+      <w:proofErr w:type="spellStart"/>
+      <w:r>
+        <w:t>Main_hero</w:t>
+      </w:r>
+      <w:proofErr w:type="spellEnd"/>
+      <w:r>
+        <w:t xml:space="preserve">: </w:t>
+      </w:r>
+      <w:proofErr w:type="spellStart"/>
+      <w:r>
+        <w:t>yk</w:t>
+      </w:r>
+      <w:proofErr w:type="spellEnd"/>
+      <w:r>
+        <w:t xml:space="preserve"> the forum is </w:t>
+      </w:r>
+      <w:proofErr w:type="gramStart"/>
+      <w:r>
+        <w:t>really buggy</w:t>
+      </w:r>
+      <w:proofErr w:type="gramEnd"/>
+      <w:r>
+        <w:t xml:space="preserve"> sometimes.</w:t>
       </w:r>
     </w:p>
     <w:p>
@@ -6234,7 +8036,17 @@
     <w:p>
       <w:r>
         <w:lastRenderedPageBreak/>
-        <w:t>(Every sentence is in it’s own typing box)</w:t>
+        <w:t xml:space="preserve">(Every sentence is in </w:t>
+      </w:r>
+      <w:proofErr w:type="spellStart"/>
+      <w:proofErr w:type="gramStart"/>
+      <w:r>
+        <w:t>it’s</w:t>
+      </w:r>
+      <w:proofErr w:type="spellEnd"/>
+      <w:proofErr w:type="gramEnd"/>
+      <w:r>
+        <w:t xml:space="preserve"> own typing box)</w:t>
       </w:r>
     </w:p>
     <w:p>
@@ -6249,18 +8061,36 @@
     </w:p>
     <w:p>
       <w:r>
-        <w:t xml:space="preserve">What if he is gonna ask me about how I </w:t>
-      </w:r>
-      <w:r>
-        <w:t>found</w:t>
-      </w:r>
-      <w:r>
-        <w:t xml:space="preserve"> this post?</w:t>
-      </w:r>
-    </w:p>
-    <w:p>
-      <w:r>
-        <w:t>Or why am I reporting it even tho im not even a follower?</w:t>
+        <w:t xml:space="preserve">What if he is </w:t>
+      </w:r>
+      <w:proofErr w:type="spellStart"/>
+      <w:r>
+        <w:t>gonna</w:t>
+      </w:r>
+      <w:proofErr w:type="spellEnd"/>
+      <w:r>
+        <w:t xml:space="preserve"> ask me about how I found this post?</w:t>
+      </w:r>
+    </w:p>
+    <w:p>
+      <w:r>
+        <w:t xml:space="preserve">Or why am I reporting it even </w:t>
+      </w:r>
+      <w:proofErr w:type="spellStart"/>
+      <w:r>
+        <w:t>tho</w:t>
+      </w:r>
+      <w:proofErr w:type="spellEnd"/>
+      <w:r>
+        <w:t xml:space="preserve"> </w:t>
+      </w:r>
+      <w:proofErr w:type="spellStart"/>
+      <w:r>
+        <w:t>im</w:t>
+      </w:r>
+      <w:proofErr w:type="spellEnd"/>
+      <w:r>
+        <w:t xml:space="preserve"> not even a follower?</w:t>
       </w:r>
     </w:p>
     <w:p>
@@ -6274,9 +8104,27 @@
       </w:r>
     </w:p>
     <w:p>
-      <w:r>
-        <w:t>Maaan why the fuck did i start it all fuuuck</w:t>
-      </w:r>
+      <w:proofErr w:type="spellStart"/>
+      <w:r>
+        <w:t>Maaan</w:t>
+      </w:r>
+      <w:proofErr w:type="spellEnd"/>
+      <w:r>
+        <w:t xml:space="preserve"> why the fuck did </w:t>
+      </w:r>
+      <w:proofErr w:type="spellStart"/>
+      <w:r>
+        <w:t>i</w:t>
+      </w:r>
+      <w:proofErr w:type="spellEnd"/>
+      <w:r>
+        <w:t xml:space="preserve"> start it all </w:t>
+      </w:r>
+      <w:proofErr w:type="spellStart"/>
+      <w:r>
+        <w:t>fuuuck</w:t>
+      </w:r>
+      <w:proofErr w:type="spellEnd"/>
       <w:r>
         <w:t>.</w:t>
       </w:r>
@@ -6288,7 +8136,15 @@
     </w:p>
     <w:p>
       <w:r>
-        <w:t>He is gonna fucking ban me.</w:t>
+        <w:t xml:space="preserve">He is </w:t>
+      </w:r>
+      <w:proofErr w:type="spellStart"/>
+      <w:r>
+        <w:t>gonna</w:t>
+      </w:r>
+      <w:proofErr w:type="spellEnd"/>
+      <w:r>
+        <w:t xml:space="preserve"> fucking ban me.</w:t>
       </w:r>
     </w:p>
     <w:p>
@@ -6323,8 +8179,13 @@
       <w:r>
         <w:t>…</w:t>
       </w:r>
-      <w:r>
-        <w:t xml:space="preserve">jesus bro </w:t>
+      <w:proofErr w:type="spellStart"/>
+      <w:r>
+        <w:t>jesus</w:t>
+      </w:r>
+      <w:proofErr w:type="spellEnd"/>
+      <w:r>
+        <w:t xml:space="preserve"> bro </w:t>
       </w:r>
       <w:r>
         <w:t>I was losing my shit here</w:t>
@@ -6343,8 +8204,13 @@
       </w:r>
     </w:p>
     <w:p>
-      <w:r>
-        <w:t xml:space="preserve">Main_hero: </w:t>
+      <w:proofErr w:type="spellStart"/>
+      <w:r>
+        <w:t>Main_hero</w:t>
+      </w:r>
+      <w:proofErr w:type="spellEnd"/>
+      <w:r>
+        <w:t xml:space="preserve">: </w:t>
       </w:r>
       <w:r>
         <w:t>for sure</w:t>
@@ -6372,21 +8238,57 @@
     </w:p>
     <w:p>
       <w:r>
-        <w:t xml:space="preserve">And I’m done lol. That’s it, I fucking did it! Now I gotta go back and tell </w:t>
-      </w:r>
+        <w:t xml:space="preserve">And I’m done lol. That’s it, I fucking did it! Now I </w:t>
+      </w:r>
+      <w:proofErr w:type="spellStart"/>
+      <w:r>
+        <w:t>gotta</w:t>
+      </w:r>
+      <w:proofErr w:type="spellEnd"/>
+      <w:r>
+        <w:t xml:space="preserve"> go back and tell </w:t>
+      </w:r>
+      <w:proofErr w:type="spellStart"/>
       <w:r>
         <w:t>cyberdivers</w:t>
       </w:r>
+      <w:proofErr w:type="spellEnd"/>
       <w:r>
         <w:t xml:space="preserve"> I got the keys.</w:t>
       </w:r>
     </w:p>
     <w:p>
       <w:r>
-        <w:t xml:space="preserve">(User is prompted to log out and log in as main_hero and go to the </w:t>
-      </w:r>
-      <w:r>
-        <w:t xml:space="preserve">cyberdivers </w:t>
+        <w:t>(</w:t>
+      </w:r>
+      <w:proofErr w:type="gramStart"/>
+      <w:r>
+        <w:t>User is</w:t>
+      </w:r>
+      <w:proofErr w:type="gramEnd"/>
+      <w:r>
+        <w:t xml:space="preserve"> prompted to log out and log in as </w:t>
+      </w:r>
+      <w:proofErr w:type="spellStart"/>
+      <w:r>
+        <w:t>main_hero</w:t>
+      </w:r>
+      <w:proofErr w:type="spellEnd"/>
+      <w:r>
+        <w:t xml:space="preserve"> and go to </w:t>
+      </w:r>
+      <w:proofErr w:type="gramStart"/>
+      <w:r>
+        <w:t xml:space="preserve">the </w:t>
+      </w:r>
+      <w:proofErr w:type="spellStart"/>
+      <w:r>
+        <w:t>cyberdivers</w:t>
+      </w:r>
+      <w:proofErr w:type="spellEnd"/>
+      <w:proofErr w:type="gramEnd"/>
+      <w:r>
+        <w:t xml:space="preserve"> </w:t>
       </w:r>
       <w:r>
         <w:t>chat)</w:t>
@@ -6394,7 +8296,15 @@
     </w:p>
     <w:p>
       <w:r>
-        <w:t>User 4: bro ts is just too funny</w:t>
+        <w:t xml:space="preserve">User 4: bro </w:t>
+      </w:r>
+      <w:proofErr w:type="spellStart"/>
+      <w:r>
+        <w:t>ts</w:t>
+      </w:r>
+      <w:proofErr w:type="spellEnd"/>
+      <w:r>
+        <w:t xml:space="preserve"> is just too funny</w:t>
       </w:r>
     </w:p>
     <w:p>
@@ -6409,12 +8319,25 @@
     </w:p>
     <w:p>
       <w:r>
-        <w:t xml:space="preserve">User 7: he is actually retarded idk </w:t>
-      </w:r>
-    </w:p>
-    <w:p>
-      <w:r>
-        <w:t xml:space="preserve">Main_hero: I hacked the </w:t>
+        <w:t xml:space="preserve">User 7: he is </w:t>
+      </w:r>
+      <w:proofErr w:type="gramStart"/>
+      <w:r>
+        <w:t>actually retarded</w:t>
+      </w:r>
+      <w:proofErr w:type="gramEnd"/>
+      <w:r>
+        <w:t xml:space="preserve"> idk </w:t>
+      </w:r>
+    </w:p>
+    <w:p>
+      <w:proofErr w:type="spellStart"/>
+      <w:r>
+        <w:t>Main_hero</w:t>
+      </w:r>
+      <w:proofErr w:type="spellEnd"/>
+      <w:r>
+        <w:t xml:space="preserve">: I hacked the </w:t>
       </w:r>
       <w:r>
         <w:t>zero</w:t>
@@ -6424,9 +8347,14 @@
       </w:r>
     </w:p>
     <w:p>
+      <w:proofErr w:type="spellStart"/>
       <w:r>
         <w:lastRenderedPageBreak/>
-        <w:t>Main_hero: check the admins</w:t>
+        <w:t>Main_hero</w:t>
+      </w:r>
+      <w:proofErr w:type="spellEnd"/>
+      <w:r>
+        <w:t>: check the admins</w:t>
       </w:r>
     </w:p>
     <w:p>
@@ -6454,7 +8382,15 @@
     </w:p>
     <w:p>
       <w:r>
-        <w:t>User 3: no way</w:t>
+        <w:t xml:space="preserve">User 3: </w:t>
+      </w:r>
+      <w:proofErr w:type="gramStart"/>
+      <w:r>
+        <w:t>no</w:t>
+      </w:r>
+      <w:proofErr w:type="gramEnd"/>
+      <w:r>
+        <w:t xml:space="preserve"> way</w:t>
       </w:r>
     </w:p>
     <w:p>
@@ -6465,7 +8401,23 @@
         <w:t>’re</w:t>
       </w:r>
       <w:r>
-        <w:t xml:space="preserve"> crazy son of a bitch, you actually did it</w:t>
+        <w:t xml:space="preserve"> crazy son of a </w:t>
+      </w:r>
+      <w:proofErr w:type="gramStart"/>
+      <w:r>
+        <w:t>bitch,</w:t>
+      </w:r>
+      <w:proofErr w:type="gramEnd"/>
+      <w:r>
+        <w:t xml:space="preserve"> you </w:t>
+      </w:r>
+      <w:proofErr w:type="gramStart"/>
+      <w:r>
+        <w:t>actually did</w:t>
+      </w:r>
+      <w:proofErr w:type="gramEnd"/>
+      <w:r>
+        <w:t xml:space="preserve"> it</w:t>
       </w:r>
     </w:p>
     <w:p>
@@ -6485,14 +8437,24 @@
     </w:p>
     <w:p>
       <w:r>
-        <w:t xml:space="preserve">User 8: of all people it’s </w:t>
+        <w:t xml:space="preserve">User 8: of all people </w:t>
+      </w:r>
+      <w:proofErr w:type="gramStart"/>
+      <w:r>
+        <w:t xml:space="preserve">it’s </w:t>
       </w:r>
       <w:r>
         <w:t>@</w:t>
       </w:r>
-      <w:r>
-        <w:t>main_hero who did that lmaooo</w:t>
-      </w:r>
+      <w:proofErr w:type="gramEnd"/>
+      <w:r>
+        <w:t xml:space="preserve">main_hero who did that </w:t>
+      </w:r>
+      <w:proofErr w:type="spellStart"/>
+      <w:r>
+        <w:t>lmaooo</w:t>
+      </w:r>
+      <w:proofErr w:type="spellEnd"/>
     </w:p>
     <w:p>
       <w:r>
@@ -6500,22 +8462,40 @@
       </w:r>
     </w:p>
     <w:p>
-      <w:r>
-        <w:t>Main_hero: fuck yeah, it was me</w:t>
+      <w:proofErr w:type="spellStart"/>
+      <w:r>
+        <w:t>Main_hero</w:t>
+      </w:r>
+      <w:proofErr w:type="spellEnd"/>
+      <w:r>
+        <w:t>: fuck yeah, it was me</w:t>
       </w:r>
       <w:r>
         <w:t>, just simple phishing and social engineering</w:t>
       </w:r>
     </w:p>
     <w:p>
-      <w:r>
-        <w:t xml:space="preserve">Main_hero: </w:t>
+      <w:proofErr w:type="spellStart"/>
+      <w:r>
+        <w:t>Main_hero</w:t>
+      </w:r>
+      <w:proofErr w:type="spellEnd"/>
+      <w:r>
+        <w:t xml:space="preserve">: </w:t>
       </w:r>
       <w:r>
         <w:t>we can do whatever we want with it now</w:t>
       </w:r>
       <w:r>
-        <w:t xml:space="preserve">, cuz I </w:t>
+        <w:t xml:space="preserve">, </w:t>
+      </w:r>
+      <w:proofErr w:type="spellStart"/>
+      <w:r>
+        <w:t>cuz</w:t>
+      </w:r>
+      <w:proofErr w:type="spellEnd"/>
+      <w:r>
+        <w:t xml:space="preserve"> I </w:t>
       </w:r>
       <w:r>
         <w:t>own the sub</w:t>
@@ -6523,7 +8503,15 @@
     </w:p>
     <w:p>
       <w:r>
-        <w:t>User 4: imma start posting there lol</w:t>
+        <w:t xml:space="preserve">User 4: </w:t>
+      </w:r>
+      <w:proofErr w:type="spellStart"/>
+      <w:r>
+        <w:t>imma</w:t>
+      </w:r>
+      <w:proofErr w:type="spellEnd"/>
+      <w:r>
+        <w:t xml:space="preserve"> start posting there lol</w:t>
       </w:r>
     </w:p>
     <w:p>
@@ -6547,17 +8535,38 @@
     </w:p>
     <w:p>
       <w:r>
-        <w:t>User 6: omw</w:t>
-      </w:r>
-    </w:p>
-    <w:p>
-      <w:r>
-        <w:t>User 7: alr why not</w:t>
-      </w:r>
-    </w:p>
-    <w:p>
-      <w:r>
-        <w:t>User 9: hell yeah lmao</w:t>
+        <w:t xml:space="preserve">User 6: </w:t>
+      </w:r>
+      <w:proofErr w:type="spellStart"/>
+      <w:r>
+        <w:t>omw</w:t>
+      </w:r>
+      <w:proofErr w:type="spellEnd"/>
+    </w:p>
+    <w:p>
+      <w:r>
+        <w:t xml:space="preserve">User 7: </w:t>
+      </w:r>
+      <w:proofErr w:type="spellStart"/>
+      <w:r>
+        <w:t>alr</w:t>
+      </w:r>
+      <w:proofErr w:type="spellEnd"/>
+      <w:r>
+        <w:t xml:space="preserve"> why not</w:t>
+      </w:r>
+    </w:p>
+    <w:p>
+      <w:r>
+        <w:t xml:space="preserve">User 9: </w:t>
+      </w:r>
+      <w:proofErr w:type="gramStart"/>
+      <w:r>
+        <w:t>hell</w:t>
+      </w:r>
+      <w:proofErr w:type="gramEnd"/>
+      <w:r>
+        <w:t xml:space="preserve"> yeah lmao</w:t>
       </w:r>
     </w:p>
     <w:p>
@@ -6567,13 +8576,29 @@
     </w:p>
     <w:p>
       <w:r>
-        <w:t xml:space="preserve">(User is prompted to search for </w:t>
+        <w:t>(</w:t>
+      </w:r>
+      <w:proofErr w:type="gramStart"/>
+      <w:r>
+        <w:t>User is</w:t>
+      </w:r>
+      <w:proofErr w:type="gramEnd"/>
+      <w:r>
+        <w:t xml:space="preserve"> prompted to search for </w:t>
       </w:r>
       <w:r>
         <w:t>zero</w:t>
       </w:r>
       <w:r>
-        <w:t xml:space="preserve"> sub and go there)</w:t>
+        <w:t xml:space="preserve"> </w:t>
+      </w:r>
+      <w:proofErr w:type="gramStart"/>
+      <w:r>
+        <w:t>sub</w:t>
+      </w:r>
+      <w:proofErr w:type="gramEnd"/>
+      <w:r>
+        <w:t xml:space="preserve"> and go there)</w:t>
       </w:r>
     </w:p>
     <w:p>
@@ -6606,8 +8631,13 @@
       <w:r>
         <w:t xml:space="preserve">(User is prompted to go back to </w:t>
       </w:r>
-      <w:r>
-        <w:t xml:space="preserve">cyberdivers </w:t>
+      <w:proofErr w:type="spellStart"/>
+      <w:r>
+        <w:t>cyberdivers</w:t>
+      </w:r>
+      <w:proofErr w:type="spellEnd"/>
+      <w:r>
+        <w:t xml:space="preserve"> </w:t>
       </w:r>
       <w:r>
         <w:t>chat)</w:t>
@@ -6615,50 +8645,131 @@
     </w:p>
     <w:p>
       <w:r>
-        <w:t xml:space="preserve">User 5: nah ts is instant </w:t>
-      </w:r>
+        <w:t xml:space="preserve">User 5: nah </w:t>
+      </w:r>
+      <w:proofErr w:type="spellStart"/>
+      <w:r>
+        <w:t>ts</w:t>
+      </w:r>
+      <w:proofErr w:type="spellEnd"/>
+      <w:r>
+        <w:t xml:space="preserve"> is instant </w:t>
+      </w:r>
+      <w:proofErr w:type="spellStart"/>
       <w:r>
         <w:t>cyberdivers</w:t>
       </w:r>
+      <w:proofErr w:type="spellEnd"/>
       <w:r>
         <w:t xml:space="preserve"> classic</w:t>
       </w:r>
     </w:p>
     <w:p>
-      <w:r>
-        <w:t xml:space="preserve">Main_hero: Ikr? </w:t>
-      </w:r>
-    </w:p>
-    <w:p>
+      <w:proofErr w:type="spellStart"/>
+      <w:r>
+        <w:t>Main_hero</w:t>
+      </w:r>
+      <w:proofErr w:type="spellEnd"/>
+      <w:r>
+        <w:t xml:space="preserve">: Ikr? </w:t>
+      </w:r>
+    </w:p>
+    <w:p>
+      <w:proofErr w:type="spellStart"/>
       <w:r>
         <w:lastRenderedPageBreak/>
-        <w:t>Main_hero: Im fucking legendary for t</w:t>
+        <w:t>Main_hero</w:t>
+      </w:r>
+      <w:proofErr w:type="spellEnd"/>
+      <w:r>
+        <w:t xml:space="preserve">: </w:t>
+      </w:r>
+      <w:proofErr w:type="spellStart"/>
+      <w:r>
+        <w:t>Im</w:t>
+      </w:r>
+      <w:proofErr w:type="spellEnd"/>
+      <w:r>
+        <w:t xml:space="preserve"> fucking legendary for </w:t>
+      </w:r>
+      <w:proofErr w:type="spellStart"/>
+      <w:r>
+        <w:t>t</w:t>
       </w:r>
       <w:r>
         <w:t>s</w:t>
       </w:r>
-      <w:r>
-        <w:t>, idc what y’all say</w:t>
-      </w:r>
-    </w:p>
-    <w:p>
-      <w:r>
-        <w:t>User 2: lowk yeah</w:t>
-      </w:r>
-    </w:p>
-    <w:p>
-      <w:r>
-        <w:t>User 3: inducted in cyberdivers hall of fame</w:t>
-      </w:r>
-    </w:p>
-    <w:p>
-      <w:r>
-        <w:t>User 4: can we make him a mod please mods?</w:t>
-      </w:r>
-    </w:p>
-    <w:p>
-      <w:r>
-        <w:t>User 13: bruh, all he did is just vibe coded some slop and somehow tricked sillygoose228 into clicking on his bullshit</w:t>
+      <w:proofErr w:type="spellEnd"/>
+      <w:r>
+        <w:t xml:space="preserve">, </w:t>
+      </w:r>
+      <w:proofErr w:type="spellStart"/>
+      <w:r>
+        <w:t>idc</w:t>
+      </w:r>
+      <w:proofErr w:type="spellEnd"/>
+      <w:r>
+        <w:t xml:space="preserve"> what y’all say</w:t>
+      </w:r>
+    </w:p>
+    <w:p>
+      <w:r>
+        <w:t xml:space="preserve">User 2: </w:t>
+      </w:r>
+      <w:proofErr w:type="spellStart"/>
+      <w:r>
+        <w:t>lowk</w:t>
+      </w:r>
+      <w:proofErr w:type="spellEnd"/>
+      <w:r>
+        <w:t xml:space="preserve"> yeah</w:t>
+      </w:r>
+    </w:p>
+    <w:p>
+      <w:r>
+        <w:t xml:space="preserve">User 3: inducted in </w:t>
+      </w:r>
+      <w:proofErr w:type="spellStart"/>
+      <w:r>
+        <w:t>cyberdivers</w:t>
+      </w:r>
+      <w:proofErr w:type="spellEnd"/>
+      <w:r>
+        <w:t xml:space="preserve"> hall of fame</w:t>
+      </w:r>
+    </w:p>
+    <w:p>
+      <w:r>
+        <w:t xml:space="preserve">User 4: can we make him a mod please </w:t>
+      </w:r>
+      <w:proofErr w:type="gramStart"/>
+      <w:r>
+        <w:t>mods</w:t>
+      </w:r>
+      <w:proofErr w:type="gramEnd"/>
+      <w:r>
+        <w:t>?</w:t>
+      </w:r>
+    </w:p>
+    <w:p>
+      <w:r>
+        <w:t xml:space="preserve">User 13: </w:t>
+      </w:r>
+      <w:proofErr w:type="spellStart"/>
+      <w:r>
+        <w:t>bruh</w:t>
+      </w:r>
+      <w:proofErr w:type="spellEnd"/>
+      <w:r>
+        <w:t xml:space="preserve">, all he did is just vibe </w:t>
+      </w:r>
+      <w:proofErr w:type="gramStart"/>
+      <w:r>
+        <w:t>coded</w:t>
+      </w:r>
+      <w:proofErr w:type="gramEnd"/>
+      <w:r>
+        <w:t xml:space="preserve"> some slop and somehow tricked sillygoose228 into clicking on his bullshit</w:t>
       </w:r>
     </w:p>
     <w:p>
@@ -6681,8 +8792,21 @@
       <w:r>
         <w:t xml:space="preserve">User 13: </w:t>
       </w:r>
-      <w:r>
-        <w:t>ain’t no one gonna give him a mod for this</w:t>
+      <w:proofErr w:type="spellStart"/>
+      <w:r>
+        <w:t>ain’t</w:t>
+      </w:r>
+      <w:proofErr w:type="spellEnd"/>
+      <w:r>
+        <w:t xml:space="preserve"> no one </w:t>
+      </w:r>
+      <w:proofErr w:type="spellStart"/>
+      <w:r>
+        <w:t>gonna</w:t>
+      </w:r>
+      <w:proofErr w:type="spellEnd"/>
+      <w:r>
+        <w:t xml:space="preserve"> give him a mod for this</w:t>
       </w:r>
       <w:r>
         <w:t>, get a grip, and a life optionally</w:t>
@@ -6700,7 +8824,15 @@
     </w:p>
     <w:p>
       <w:r>
-        <w:t>User 12: so what? I need to suck his dick for it?</w:t>
+        <w:t xml:space="preserve">User 12: </w:t>
+      </w:r>
+      <w:proofErr w:type="gramStart"/>
+      <w:r>
+        <w:t>so</w:t>
+      </w:r>
+      <w:proofErr w:type="gramEnd"/>
+      <w:r>
+        <w:t xml:space="preserve"> what? I need to suck his dick for it?</w:t>
       </w:r>
     </w:p>
     <w:p>
@@ -6720,7 +8852,15 @@
     </w:p>
     <w:p>
       <w:r>
-        <w:t>User 8: yeah, it was fun, but it’s lowk cringe now</w:t>
+        <w:t xml:space="preserve">User 8: yeah, it was fun, but it’s </w:t>
+      </w:r>
+      <w:proofErr w:type="spellStart"/>
+      <w:r>
+        <w:t>lowk</w:t>
+      </w:r>
+      <w:proofErr w:type="spellEnd"/>
+      <w:r>
+        <w:t xml:space="preserve"> cringe now</w:t>
       </w:r>
     </w:p>
     <w:p>
@@ -6729,8 +8869,13 @@
       </w:r>
     </w:p>
     <w:p>
-      <w:r>
-        <w:t>Main_hero: go fuck yourselves.</w:t>
+      <w:proofErr w:type="spellStart"/>
+      <w:r>
+        <w:t>Main_hero</w:t>
+      </w:r>
+      <w:proofErr w:type="spellEnd"/>
+      <w:r>
+        <w:t>: go fuck yourselves.</w:t>
       </w:r>
       <w:r>
         <w:t xml:space="preserve"> Y’all were mocking me and now</w:t>
@@ -6752,16 +8897,26 @@
       </w:r>
     </w:p>
     <w:p>
-      <w:r>
-        <w:t>Main_hero: absolutely fucking nothing</w:t>
+      <w:proofErr w:type="spellStart"/>
+      <w:r>
+        <w:t>Main_hero</w:t>
+      </w:r>
+      <w:proofErr w:type="spellEnd"/>
+      <w:r>
+        <w:t>: absolutely fucking nothing</w:t>
       </w:r>
       <w:r>
         <w:t>, except bitching and moaning</w:t>
       </w:r>
     </w:p>
     <w:p>
-      <w:r>
-        <w:t xml:space="preserve">Main_hero: </w:t>
+      <w:proofErr w:type="spellStart"/>
+      <w:r>
+        <w:t>Main_hero</w:t>
+      </w:r>
+      <w:proofErr w:type="spellEnd"/>
+      <w:r>
+        <w:t xml:space="preserve">: </w:t>
       </w:r>
       <w:r>
         <w:t>y’all</w:t>
@@ -6782,7 +8937,15 @@
         <w:t xml:space="preserve">of </w:t>
       </w:r>
       <w:r>
-        <w:t>me because I actually managed to pull this off</w:t>
+        <w:t xml:space="preserve">me because I </w:t>
+      </w:r>
+      <w:proofErr w:type="gramStart"/>
+      <w:r>
+        <w:t>actually managed</w:t>
+      </w:r>
+      <w:proofErr w:type="gramEnd"/>
+      <w:r>
+        <w:t xml:space="preserve"> to pull this off</w:t>
       </w:r>
     </w:p>
     <w:p>
@@ -6790,7 +8953,15 @@
         <w:t xml:space="preserve">User 11: oh wow, u hacked a subforum, so we can </w:t>
       </w:r>
       <w:r>
-        <w:t>spam some bs on it</w:t>
+        <w:t xml:space="preserve">spam some </w:t>
+      </w:r>
+      <w:proofErr w:type="gramStart"/>
+      <w:r>
+        <w:t>bs</w:t>
+      </w:r>
+      <w:proofErr w:type="gramEnd"/>
+      <w:r>
+        <w:t xml:space="preserve"> on it</w:t>
       </w:r>
     </w:p>
     <w:p>
@@ -6804,8 +8975,13 @@
       </w:r>
     </w:p>
     <w:p>
-      <w:r>
-        <w:t>Main_hero: well yeah</w:t>
+      <w:proofErr w:type="spellStart"/>
+      <w:r>
+        <w:t>Main_hero</w:t>
+      </w:r>
+      <w:proofErr w:type="spellEnd"/>
+      <w:r>
+        <w:t>: well yeah</w:t>
       </w:r>
     </w:p>
     <w:p>
@@ -6813,8 +8989,13 @@
         <w:lastRenderedPageBreak/>
         <w:t xml:space="preserve">User 10: </w:t>
       </w:r>
-      <w:r>
-        <w:t>bruh u</w:t>
+      <w:proofErr w:type="spellStart"/>
+      <w:r>
+        <w:t>bruh</w:t>
+      </w:r>
+      <w:proofErr w:type="spellEnd"/>
+      <w:r>
+        <w:t xml:space="preserve"> u</w:t>
       </w:r>
       <w:r>
         <w:t xml:space="preserve"> </w:t>
@@ -6835,7 +9016,15 @@
         <w:t xml:space="preserve"> cringe</w:t>
       </w:r>
       <w:r>
-        <w:t xml:space="preserve"> loser who couldn’t play cyberdivers to save his life, and then suddenly u hacked </w:t>
+        <w:t xml:space="preserve"> loser who couldn’t play </w:t>
+      </w:r>
+      <w:proofErr w:type="spellStart"/>
+      <w:r>
+        <w:t>cyberdivers</w:t>
+      </w:r>
+      <w:proofErr w:type="spellEnd"/>
+      <w:r>
+        <w:t xml:space="preserve"> to save his life, and then suddenly u hacked </w:t>
       </w:r>
       <w:r>
         <w:t>some</w:t>
@@ -6877,7 +9066,15 @@
     </w:p>
     <w:p>
       <w:r>
-        <w:t>User 1: gadayum bro</w:t>
+        <w:t xml:space="preserve">User 1: </w:t>
+      </w:r>
+      <w:proofErr w:type="spellStart"/>
+      <w:r>
+        <w:t>gadayum</w:t>
+      </w:r>
+      <w:proofErr w:type="spellEnd"/>
+      <w:r>
+        <w:t xml:space="preserve"> bro</w:t>
       </w:r>
     </w:p>
     <w:p>
@@ -6898,12 +9095,25 @@
     </w:p>
     <w:p>
       <w:r>
-        <w:t>Man, fuck him and all these cunts.</w:t>
-      </w:r>
-    </w:p>
-    <w:p>
-      <w:r>
-        <w:t>Main_hero: fuck u</w:t>
+        <w:t xml:space="preserve">Man, fuck him and all these </w:t>
+      </w:r>
+      <w:proofErr w:type="spellStart"/>
+      <w:r>
+        <w:t>cunts</w:t>
+      </w:r>
+      <w:proofErr w:type="spellEnd"/>
+      <w:r>
+        <w:t>.</w:t>
+      </w:r>
+    </w:p>
+    <w:p>
+      <w:proofErr w:type="spellStart"/>
+      <w:r>
+        <w:t>Main_hero</w:t>
+      </w:r>
+      <w:proofErr w:type="spellEnd"/>
+      <w:r>
+        <w:t>: fuck u</w:t>
       </w:r>
     </w:p>
     <w:p>
@@ -6975,8 +9185,13 @@
       </w:r>
     </w:p>
     <w:p>
-      <w:r>
-        <w:t>Main_hero: fuck u</w:t>
+      <w:proofErr w:type="spellStart"/>
+      <w:r>
+        <w:t>Main_hero</w:t>
+      </w:r>
+      <w:proofErr w:type="spellEnd"/>
+      <w:r>
+        <w:t>: fuck u</w:t>
       </w:r>
     </w:p>
     <w:p>
@@ -7025,13 +9240,21 @@
         <w:t>(Screen slowly goes red and blurry</w:t>
       </w:r>
       <w:r>
-        <w:t xml:space="preserve"> as messages fuck u keep popping up from all the members</w:t>
+        <w:t xml:space="preserve"> as messages fuck u keep popping up from all the </w:t>
+      </w:r>
+      <w:proofErr w:type="gramStart"/>
+      <w:r>
+        <w:t>members</w:t>
       </w:r>
       <w:r>
         <w:t xml:space="preserve"> </w:t>
       </w:r>
       <w:r>
-        <w:t>, and then suddenly white)</w:t>
+        <w:t>,</w:t>
+      </w:r>
+      <w:proofErr w:type="gramEnd"/>
+      <w:r>
+        <w:t xml:space="preserve"> and then suddenly white)</w:t>
       </w:r>
     </w:p>
     <w:p>
@@ -7057,9 +9280,11 @@
       <w:r>
         <w:t xml:space="preserve"> </w:t>
       </w:r>
+      <w:proofErr w:type="spellStart"/>
       <w:r>
         <w:t>cyberdivers</w:t>
       </w:r>
+      <w:proofErr w:type="spellEnd"/>
       <w:r>
         <w:t xml:space="preserve">, I’ve hacked sillygoose228 and </w:t>
       </w:r>
@@ -7156,7 +9381,21 @@
     </w:p>
     <w:p>
       <w:r>
-        <w:t>I’ve spent hours and hours trying to convince everyone around me and myself, that I am more skillful than them, smarter than them and overall better than them, just to get that power</w:t>
+        <w:t xml:space="preserve">I’ve spent </w:t>
+      </w:r>
+      <w:proofErr w:type="gramStart"/>
+      <w:r>
+        <w:t>hours and hours</w:t>
+      </w:r>
+      <w:proofErr w:type="gramEnd"/>
+      <w:r>
+        <w:t xml:space="preserve"> trying to convince everyone around me and </w:t>
+      </w:r>
+      <w:r>
+        <w:t>myself</w:t>
+      </w:r>
+      <w:r>
+        <w:t xml:space="preserve"> that I am more skillful than them, smarter than them and overall better than them, just to get that power</w:t>
       </w:r>
       <w:r>
         <w:t xml:space="preserve">. Power that makes me say what I </w:t>
@@ -7174,7 +9413,15 @@
         <w:t>.</w:t>
       </w:r>
       <w:r>
-        <w:t xml:space="preserve"> But how much safety am I willing to trade for it? </w:t>
+        <w:t xml:space="preserve"> But </w:t>
+      </w:r>
+      <w:proofErr w:type="gramStart"/>
+      <w:r>
+        <w:t>how much safety</w:t>
+      </w:r>
+      <w:proofErr w:type="gramEnd"/>
+      <w:r>
+        <w:t xml:space="preserve"> am I willing to trade for it? </w:t>
       </w:r>
       <w:r>
         <w:t xml:space="preserve">I hacked a fucking subforum just to </w:t>
@@ -7189,7 +9436,10 @@
         <w:t xml:space="preserve"> they will </w:t>
       </w:r>
       <w:r>
-        <w:t>poke back</w:t>
+        <w:t>poke</w:t>
+      </w:r>
+      <w:r>
+        <w:t xml:space="preserve"> back</w:t>
       </w:r>
       <w:r>
         <w:t xml:space="preserve">, </w:t>
@@ -7198,7 +9448,22 @@
         <w:t xml:space="preserve">and before you know it, everyone is </w:t>
       </w:r>
       <w:r>
-        <w:t>covered in needle marks, trying to hide themselves to avoid the next poke</w:t>
+        <w:t>covered in</w:t>
+      </w:r>
+      <w:r>
+        <w:t xml:space="preserve"> these</w:t>
+      </w:r>
+      <w:r>
+        <w:t xml:space="preserve"> </w:t>
+      </w:r>
+      <w:r>
+        <w:t>stab wounds</w:t>
+      </w:r>
+      <w:r>
+        <w:t xml:space="preserve">, trying to hide themselves to avoid the next </w:t>
+      </w:r>
+      <w:r>
+        <w:t>poke</w:t>
       </w:r>
       <w:r>
         <w:t>.</w:t>
@@ -7230,7 +9495,15 @@
         <w:t>,</w:t>
       </w:r>
       <w:r>
-        <w:t xml:space="preserve"> I just thought they were faking it. I’ve grown so used to these power games that I’m always waiting for the other shoe to drop and if it doesn’t, I drop it myself. So I decided to destroy them</w:t>
+        <w:t xml:space="preserve"> I just thought they were faking it. I’ve grown so used to these power games that I’m always waiting for the other shoe to drop and if it doesn’t, I drop it myself. </w:t>
+      </w:r>
+      <w:proofErr w:type="gramStart"/>
+      <w:r>
+        <w:t>So</w:t>
+      </w:r>
+      <w:proofErr w:type="gramEnd"/>
+      <w:r>
+        <w:t xml:space="preserve"> I decided to destroy them</w:t>
       </w:r>
       <w:r>
         <w:t xml:space="preserve">, based on the presumption that they are just weak. But let’s be real, I was </w:t>
@@ -7266,7 +9539,16 @@
     </w:p>
     <w:p>
       <w:r>
-        <w:t xml:space="preserve">User 1: yo </w:t>
+        <w:t xml:space="preserve">User 1: </w:t>
+      </w:r>
+      <w:proofErr w:type="spellStart"/>
+      <w:proofErr w:type="gramStart"/>
+      <w:r>
+        <w:t>yo</w:t>
+      </w:r>
+      <w:proofErr w:type="spellEnd"/>
+      <w:r>
+        <w:t xml:space="preserve"> </w:t>
       </w:r>
       <w:r>
         <w:rPr>
@@ -7274,18 +9556,42 @@
         </w:rPr>
         <w:t>@</w:t>
       </w:r>
-      <w:r>
-        <w:t xml:space="preserve">main_hero, u do know that u can get urself banned for </w:t>
+      <w:proofErr w:type="spellStart"/>
+      <w:proofErr w:type="gramEnd"/>
+      <w:r>
+        <w:t>main_</w:t>
+      </w:r>
+      <w:proofErr w:type="gramStart"/>
+      <w:r>
+        <w:t>hero</w:t>
+      </w:r>
+      <w:proofErr w:type="spellEnd"/>
+      <w:proofErr w:type="gramEnd"/>
+      <w:r>
+        <w:t xml:space="preserve">, u do know that u can get </w:t>
+      </w:r>
+      <w:proofErr w:type="spellStart"/>
+      <w:r>
+        <w:t>urself</w:t>
+      </w:r>
+      <w:proofErr w:type="spellEnd"/>
+      <w:r>
+        <w:t xml:space="preserve"> banned for </w:t>
       </w:r>
       <w:r>
         <w:t>stealing</w:t>
       </w:r>
       <w:r>
-        <w:t xml:space="preserve"> other user</w:t>
+        <w:t xml:space="preserve"> other </w:t>
+      </w:r>
+      <w:proofErr w:type="gramStart"/>
+      <w:r>
+        <w:t>user</w:t>
       </w:r>
       <w:r>
         <w:t>s</w:t>
       </w:r>
+      <w:proofErr w:type="gramEnd"/>
       <w:r>
         <w:t xml:space="preserve"> </w:t>
       </w:r>
@@ -7300,8 +9606,21 @@
       </w:r>
     </w:p>
     <w:p>
-      <w:r>
-        <w:t>Main_hero: yeah of course I kno</w:t>
+      <w:proofErr w:type="spellStart"/>
+      <w:r>
+        <w:t>Main_hero</w:t>
+      </w:r>
+      <w:proofErr w:type="spellEnd"/>
+      <w:r>
+        <w:t xml:space="preserve">: </w:t>
+      </w:r>
+      <w:proofErr w:type="gramStart"/>
+      <w:r>
+        <w:t>yeah</w:t>
+      </w:r>
+      <w:proofErr w:type="gramEnd"/>
+      <w:r>
+        <w:t xml:space="preserve"> of course I kno</w:t>
       </w:r>
       <w:r>
         <w:t>w</w:t>
@@ -7309,7 +9628,15 @@
     </w:p>
     <w:p>
       <w:r>
-        <w:t>(Screen shows that main_hero’s account has been banned)</w:t>
+        <w:t xml:space="preserve">(Screen shows that </w:t>
+      </w:r>
+      <w:proofErr w:type="spellStart"/>
+      <w:r>
+        <w:t>main_hero’s</w:t>
+      </w:r>
+      <w:proofErr w:type="spellEnd"/>
+      <w:r>
+        <w:t xml:space="preserve"> account has been banned)</w:t>
       </w:r>
     </w:p>
     <w:p>
@@ -11886,6 +14213,7 @@
   <w:style w:type="character" w:default="1" w:styleId="DefaultParagraphFont">
     <w:name w:val="Default Paragraph Font"/>
     <w:uiPriority w:val="1"/>
+    <w:semiHidden/>
     <w:unhideWhenUsed/>
   </w:style>
   <w:style w:type="table" w:default="1" w:styleId="TableNormal">

</xml_diff>